<commit_message>
docs(structure): establish documentation directory structure
</commit_message>
<xml_diff>
--- a/opensource_plan/개발 노트/1주차 개발노트.docx
+++ b/opensource_plan/개발 노트/1주차 개발노트.docx
@@ -516,6 +516,312 @@
         </w:rPr>
         <w:lastRenderedPageBreak/>
         <w:t>2.</w:t>
+      </w:r>
+    </w:p>
+    <w:p>
+      <w:r>
+        <w:t xml:space="preserve">Slice D1 완료했습니다. </w:t>
+      </w:r>
+      <w:proofErr w:type="spellStart"/>
+      <w:r>
+        <w:t>커밋은</w:t>
+      </w:r>
+      <w:proofErr w:type="spellEnd"/>
+      <w:r>
+        <w:t xml:space="preserve"> 하지 않았습니다.</w:t>
+      </w:r>
+    </w:p>
+    <w:p>
+      <w:r>
+        <w:rPr>
+          <w:rFonts w:hint="eastAsia"/>
+        </w:rPr>
+        <w:t>주요</w:t>
+      </w:r>
+      <w:r>
+        <w:t xml:space="preserve"> 변경:</w:t>
+      </w:r>
+    </w:p>
+    <w:p>
+      <w:r>
+        <w:rPr>
+          <w:rFonts w:hint="eastAsia"/>
+        </w:rPr>
+        <w:t>루트</w:t>
+      </w:r>
+      <w:r>
+        <w:t xml:space="preserve"> [README.md](C:\\git\\</w:t>
+      </w:r>
+      <w:proofErr w:type="spellStart"/>
+      <w:r>
+        <w:t>cheongnyeon-alimi</w:t>
+      </w:r>
+      <w:proofErr w:type="spellEnd"/>
+      <w:r>
+        <w:t>\\README.md)</w:t>
+      </w:r>
+      <w:proofErr w:type="spellStart"/>
+      <w:r>
+        <w:t>에</w:t>
+      </w:r>
+      <w:proofErr w:type="spellEnd"/>
+      <w:r>
+        <w:t xml:space="preserve"> 프로젝트 설명과 문서 </w:t>
+      </w:r>
+      <w:proofErr w:type="spellStart"/>
+      <w:r>
+        <w:t>진입점</w:t>
+      </w:r>
+      <w:proofErr w:type="spellEnd"/>
+      <w:r>
+        <w:t xml:space="preserve"> 추가</w:t>
+      </w:r>
+    </w:p>
+    <w:p>
+      <w:r>
+        <w:t>[docs/index.md](C:\\git\\</w:t>
+      </w:r>
+      <w:proofErr w:type="spellStart"/>
+      <w:r>
+        <w:t>cheongnyeon-alimi</w:t>
+      </w:r>
+      <w:proofErr w:type="spellEnd"/>
+      <w:r>
+        <w:t>\\docs\\index.md)</w:t>
+      </w:r>
+      <w:proofErr w:type="spellStart"/>
+      <w:r>
+        <w:t>에</w:t>
+      </w:r>
+      <w:proofErr w:type="spellEnd"/>
+      <w:r>
+        <w:t xml:space="preserve"> 9개 문서 영역과 책임 추가</w:t>
+      </w:r>
+    </w:p>
+    <w:p>
+      <w:r>
+        <w:t xml:space="preserve">architecture, </w:t>
+      </w:r>
+      <w:proofErr w:type="spellStart"/>
+      <w:r>
+        <w:t>api</w:t>
+      </w:r>
+      <w:proofErr w:type="spellEnd"/>
+      <w:r>
+        <w:t>, data, governance, development, troubleshooting, operations, contest에 역할별 README.md 추가</w:t>
+      </w:r>
+    </w:p>
+    <w:p>
+      <w:r>
+        <w:t>CHANGELOG.md와 development_notes.md 갱신</w:t>
+      </w:r>
+    </w:p>
+    <w:p>
+      <w:proofErr w:type="spellStart"/>
+      <w:r>
+        <w:t>develop_plan</w:t>
+      </w:r>
+      <w:proofErr w:type="spellEnd"/>
+      <w:r>
+        <w:t>은 기존 D0 문서를 그대로 활용</w:t>
+      </w:r>
+    </w:p>
+    <w:p>
+      <w:r>
+        <w:rPr>
+          <w:rFonts w:hint="eastAsia"/>
+        </w:rPr>
+        <w:t>검증</w:t>
+      </w:r>
+      <w:r>
+        <w:t xml:space="preserve"> 결과:</w:t>
+      </w:r>
+    </w:p>
+    <w:p>
+      <w:r>
+        <w:rPr>
+          <w:rFonts w:hint="eastAsia"/>
+        </w:rPr>
+        <w:t>모든</w:t>
+      </w:r>
+      <w:r>
+        <w:t xml:space="preserve"> Markdown 상대 링크 정상</w:t>
+      </w:r>
+    </w:p>
+    <w:p>
+      <w:r>
+        <w:rPr>
+          <w:rFonts w:hint="eastAsia"/>
+        </w:rPr>
+        <w:t>필수</w:t>
+      </w:r>
+      <w:r>
+        <w:t xml:space="preserve"> 문서 영역 모두 존재</w:t>
+      </w:r>
+    </w:p>
+    <w:p>
+      <w:r>
+        <w:rPr>
+          <w:rFonts w:hint="eastAsia"/>
+        </w:rPr>
+        <w:t>빈</w:t>
+      </w:r>
+      <w:r>
+        <w:t xml:space="preserve"> 문서·빈 docs 디렉터리 없음</w:t>
+      </w:r>
+    </w:p>
+    <w:p>
+      <w:r>
+        <w:rPr>
+          <w:rFonts w:hint="eastAsia"/>
+        </w:rPr>
+        <w:t>프로젝트명</w:t>
+      </w:r>
+      <w:r>
+        <w:t xml:space="preserve"> </w:t>
+      </w:r>
+      <w:proofErr w:type="spellStart"/>
+      <w:r>
+        <w:t>cheongnyeon-alimi</w:t>
+      </w:r>
+      <w:proofErr w:type="spellEnd"/>
+      <w:r>
+        <w:t xml:space="preserve"> 통일</w:t>
+      </w:r>
+    </w:p>
+    <w:p>
+      <w:proofErr w:type="spellStart"/>
+      <w:r>
+        <w:t>opensource_</w:t>
+      </w:r>
+      <w:proofErr w:type="gramStart"/>
+      <w:r>
+        <w:t>plan</w:t>
+      </w:r>
+      <w:proofErr w:type="spellEnd"/>
+      <w:r>
+        <w:t>/ 변경</w:t>
+      </w:r>
+      <w:proofErr w:type="gramEnd"/>
+      <w:r>
+        <w:t xml:space="preserve"> 없음</w:t>
+      </w:r>
+    </w:p>
+    <w:p>
+      <w:r>
+        <w:t>Git 공백 오류 없음</w:t>
+      </w:r>
+    </w:p>
+    <w:p>
+      <w:r>
+        <w:rPr>
+          <w:rFonts w:hint="eastAsia"/>
+        </w:rPr>
+        <w:t>임시</w:t>
+      </w:r>
+      <w:r>
+        <w:t xml:space="preserve"> 테스트 파일 없음</w:t>
+      </w:r>
+    </w:p>
+    <w:p>
+      <w:r>
+        <w:rPr>
+          <w:rFonts w:hint="eastAsia"/>
+        </w:rPr>
+        <w:t>간단한</w:t>
+      </w:r>
+      <w:r>
+        <w:t xml:space="preserve"> 코드 리뷰: 차단할 문제는 없습니다. 각 영역의 포함·제외 범위가 구분되어 문서 책임이 겹치지 않으며</w:t>
+      </w:r>
+      <w:proofErr w:type="gramStart"/>
+      <w:r>
+        <w:t>, .</w:t>
+      </w:r>
+      <w:proofErr w:type="spellStart"/>
+      <w:r>
+        <w:t>gitkeep</w:t>
+      </w:r>
+      <w:proofErr w:type="spellEnd"/>
+      <w:proofErr w:type="gramEnd"/>
+      <w:r>
+        <w:t xml:space="preserve"> 대신 의미 있는 안내 문서를 사용했습니다. 구현되지 않은 세부 문서나 실행 예시도 미리 만들지 않았습니다.</w:t>
+      </w:r>
+    </w:p>
+    <w:p>
+      <w:r>
+        <w:rPr>
+          <w:rFonts w:hint="eastAsia"/>
+        </w:rPr>
+        <w:t>권장</w:t>
+      </w:r>
+      <w:r>
+        <w:t xml:space="preserve"> </w:t>
+      </w:r>
+      <w:proofErr w:type="spellStart"/>
+      <w:r>
+        <w:t>커밋</w:t>
+      </w:r>
+      <w:proofErr w:type="spellEnd"/>
+      <w:r>
+        <w:t xml:space="preserve"> 메시지:</w:t>
+      </w:r>
+    </w:p>
+    <w:p>
+      <w:r>
+        <w:t>docs(structure): establish documentation directory structure</w:t>
+      </w:r>
+    </w:p>
+    <w:p>
+      <w:r>
+        <w:rPr>
+          <w:rFonts w:hint="eastAsia"/>
+        </w:rPr>
+        <w:t>다음</w:t>
+      </w:r>
+      <w:r>
+        <w:t xml:space="preserve"> Slice D2는 별도 논리 단위이므로 D1 커밋 후 현재 </w:t>
+      </w:r>
+      <w:proofErr w:type="spellStart"/>
+      <w:r>
+        <w:t>브랜치를</w:t>
+      </w:r>
+      <w:proofErr w:type="spellEnd"/>
+      <w:r>
+        <w:t xml:space="preserve"> develop에 병합하고, 최신 develop에서 다음 </w:t>
+      </w:r>
+      <w:proofErr w:type="spellStart"/>
+      <w:r>
+        <w:t>브랜치를</w:t>
+      </w:r>
+      <w:proofErr w:type="spellEnd"/>
+      <w:r>
+        <w:t xml:space="preserve"> 만드는 것을 권장합니다.</w:t>
+      </w:r>
+    </w:p>
+    <w:p>
+      <w:r>
+        <w:t>docs/governance/collaboration-policy</w:t>
+      </w:r>
+    </w:p>
+    <w:p>
+      <w:pPr>
+        <w:widowControl/>
+        <w:wordWrap/>
+        <w:autoSpaceDE/>
+        <w:autoSpaceDN/>
+      </w:pPr>
+      <w:r>
+        <w:lastRenderedPageBreak/>
+        <w:br w:type="page"/>
+      </w:r>
+    </w:p>
+    <w:p>
+      <w:r>
+        <w:rPr>
+          <w:rFonts w:hint="eastAsia"/>
+        </w:rPr>
+        <w:lastRenderedPageBreak/>
+        <w:t>3.</w:t>
       </w:r>
     </w:p>
     <w:p>
@@ -533,6 +839,56 @@
     </w:sectPr>
   </w:body>
 </w:document>
+</file>
+
+<file path=word/endnotes.xml><?xml version="1.0" encoding="utf-8"?>
+<w:endnotes xmlns:wpc="http://schemas.microsoft.com/office/word/2010/wordprocessingCanvas" xmlns:cx="http://schemas.microsoft.com/office/drawing/2014/chartex" xmlns:cx1="http://schemas.microsoft.com/office/drawing/2015/9/8/chartex" xmlns:cx2="http://schemas.microsoft.com/office/drawing/2015/10/21/chartex" xmlns:cx3="http://schemas.microsoft.com/office/drawing/2016/5/9/chartex" xmlns:cx4="http://schemas.microsoft.com/office/drawing/2016/5/10/chartex" xmlns:cx5="http://schemas.microsoft.com/office/drawing/2016/5/11/chartex" xmlns:cx6="http://schemas.microsoft.com/office/drawing/2016/5/12/chartex" xmlns:cx7="http://schemas.microsoft.com/office/drawing/2016/5/13/chartex" xmlns:cx8="http://schemas.microsoft.com/office/drawing/2016/5/14/chartex" xmlns:mc="http://schemas.openxmlformats.org/markup-compatibility/2006" xmlns:aink="http://schemas.microsoft.com/office/drawing/2016/ink" xmlns:am3d="http://schemas.microsoft.com/office/drawing/2017/model3d" xmlns:o="urn:schemas-microsoft-com:office:office" xmlns:oel="http://schemas.microsoft.com/office/2019/extlst" xmlns:r="http://schemas.openxmlformats.org/officeDocument/2006/relationships" xmlns:m="http://schemas.openxmlformats.org/officeDocument/2006/math" xmlns:v="urn:schemas-microsoft-com:vml" xmlns:wp14="http://schemas.microsoft.com/office/word/2010/wordprocessingDrawing" xmlns:wp="http://schemas.openxmlformats.org/drawingml/2006/wordprocessingDrawing" xmlns:w10="urn:schemas-microsoft-com:office:word" xmlns:w="http://schemas.openxmlformats.org/wordprocessingml/2006/main" xmlns:w14="http://schemas.microsoft.com/office/word/2010/wordml" xmlns:w15="http://schemas.microsoft.com/office/word/2012/wordml" xmlns:w16cex="http://schemas.microsoft.com/office/word/2018/wordml/cex" xmlns:w16cid="http://schemas.microsoft.com/office/word/2016/wordml/cid" xmlns:w16="http://schemas.microsoft.com/office/word/2018/wordml" xmlns:w16sdtdh="http://schemas.microsoft.com/office/word/2020/wordml/sdtdatahash" xmlns:w16se="http://schemas.microsoft.com/office/word/2015/wordml/symex" xmlns:wpg="http://schemas.microsoft.com/office/word/2010/wordprocessingGroup" xmlns:wpi="http://schemas.microsoft.com/office/word/2010/wordprocessingInk" xmlns:wne="http://schemas.microsoft.com/office/word/2006/wordml" xmlns:wps="http://schemas.microsoft.com/office/word/2010/wordprocessingShape" mc:Ignorable="w14 w15 w16se w16cid w16 w16cex w16sdtdh wp14">
+  <w:endnote w:type="separator" w:id="-1">
+    <w:p>
+      <w:pPr>
+        <w:spacing w:after="0"/>
+      </w:pPr>
+      <w:r>
+        <w:separator/>
+      </w:r>
+    </w:p>
+  </w:endnote>
+  <w:endnote w:type="continuationSeparator" w:id="0">
+    <w:p>
+      <w:pPr>
+        <w:spacing w:after="0"/>
+      </w:pPr>
+      <w:r>
+        <w:continuationSeparator/>
+      </w:r>
+    </w:p>
+  </w:endnote>
+</w:endnotes>
+</file>
+
+<file path=word/footnotes.xml><?xml version="1.0" encoding="utf-8"?>
+<w:footnotes xmlns:wpc="http://schemas.microsoft.com/office/word/2010/wordprocessingCanvas" xmlns:cx="http://schemas.microsoft.com/office/drawing/2014/chartex" xmlns:cx1="http://schemas.microsoft.com/office/drawing/2015/9/8/chartex" xmlns:cx2="http://schemas.microsoft.com/office/drawing/2015/10/21/chartex" xmlns:cx3="http://schemas.microsoft.com/office/drawing/2016/5/9/chartex" xmlns:cx4="http://schemas.microsoft.com/office/drawing/2016/5/10/chartex" xmlns:cx5="http://schemas.microsoft.com/office/drawing/2016/5/11/chartex" xmlns:cx6="http://schemas.microsoft.com/office/drawing/2016/5/12/chartex" xmlns:cx7="http://schemas.microsoft.com/office/drawing/2016/5/13/chartex" xmlns:cx8="http://schemas.microsoft.com/office/drawing/2016/5/14/chartex" xmlns:mc="http://schemas.openxmlformats.org/markup-compatibility/2006" xmlns:aink="http://schemas.microsoft.com/office/drawing/2016/ink" xmlns:am3d="http://schemas.microsoft.com/office/drawing/2017/model3d" xmlns:o="urn:schemas-microsoft-com:office:office" xmlns:oel="http://schemas.microsoft.com/office/2019/extlst" xmlns:r="http://schemas.openxmlformats.org/officeDocument/2006/relationships" xmlns:m="http://schemas.openxmlformats.org/officeDocument/2006/math" xmlns:v="urn:schemas-microsoft-com:vml" xmlns:wp14="http://schemas.microsoft.com/office/word/2010/wordprocessingDrawing" xmlns:wp="http://schemas.openxmlformats.org/drawingml/2006/wordprocessingDrawing" xmlns:w10="urn:schemas-microsoft-com:office:word" xmlns:w="http://schemas.openxmlformats.org/wordprocessingml/2006/main" xmlns:w14="http://schemas.microsoft.com/office/word/2010/wordml" xmlns:w15="http://schemas.microsoft.com/office/word/2012/wordml" xmlns:w16cex="http://schemas.microsoft.com/office/word/2018/wordml/cex" xmlns:w16cid="http://schemas.microsoft.com/office/word/2016/wordml/cid" xmlns:w16="http://schemas.microsoft.com/office/word/2018/wordml" xmlns:w16sdtdh="http://schemas.microsoft.com/office/word/2020/wordml/sdtdatahash" xmlns:w16se="http://schemas.microsoft.com/office/word/2015/wordml/symex" xmlns:wpg="http://schemas.microsoft.com/office/word/2010/wordprocessingGroup" xmlns:wpi="http://schemas.microsoft.com/office/word/2010/wordprocessingInk" xmlns:wne="http://schemas.microsoft.com/office/word/2006/wordml" xmlns:wps="http://schemas.microsoft.com/office/word/2010/wordprocessingShape" mc:Ignorable="w14 w15 w16se w16cid w16 w16cex w16sdtdh wp14">
+  <w:footnote w:type="separator" w:id="-1">
+    <w:p>
+      <w:pPr>
+        <w:spacing w:after="0"/>
+      </w:pPr>
+      <w:r>
+        <w:separator/>
+      </w:r>
+    </w:p>
+  </w:footnote>
+  <w:footnote w:type="continuationSeparator" w:id="0">
+    <w:p>
+      <w:pPr>
+        <w:spacing w:after="0"/>
+      </w:pPr>
+      <w:r>
+        <w:continuationSeparator/>
+      </w:r>
+    </w:p>
+  </w:footnote>
+</w:footnotes>
 </file>
 
 <file path=word/numbering.xml><?xml version="1.0" encoding="utf-8"?>
@@ -2095,6 +2451,50 @@
       <w:spacing w:val="5"/>
     </w:rPr>
   </w:style>
+  <w:style w:type="paragraph" w:styleId="aa">
+    <w:name w:val="header"/>
+    <w:basedOn w:val="a"/>
+    <w:link w:val="Char3"/>
+    <w:uiPriority w:val="99"/>
+    <w:unhideWhenUsed/>
+    <w:rsid w:val="00312009"/>
+    <w:pPr>
+      <w:tabs>
+        <w:tab w:val="center" w:pos="4513"/>
+        <w:tab w:val="right" w:pos="9026"/>
+      </w:tabs>
+      <w:snapToGrid w:val="0"/>
+    </w:pPr>
+  </w:style>
+  <w:style w:type="character" w:customStyle="1" w:styleId="Char3">
+    <w:name w:val="머리글 Char"/>
+    <w:basedOn w:val="a0"/>
+    <w:link w:val="aa"/>
+    <w:uiPriority w:val="99"/>
+    <w:rsid w:val="00312009"/>
+  </w:style>
+  <w:style w:type="paragraph" w:styleId="ab">
+    <w:name w:val="footer"/>
+    <w:basedOn w:val="a"/>
+    <w:link w:val="Char4"/>
+    <w:uiPriority w:val="99"/>
+    <w:unhideWhenUsed/>
+    <w:rsid w:val="00312009"/>
+    <w:pPr>
+      <w:tabs>
+        <w:tab w:val="center" w:pos="4513"/>
+        <w:tab w:val="right" w:pos="9026"/>
+      </w:tabs>
+      <w:snapToGrid w:val="0"/>
+    </w:pPr>
+  </w:style>
+  <w:style w:type="character" w:customStyle="1" w:styleId="Char4">
+    <w:name w:val="바닥글 Char"/>
+    <w:basedOn w:val="a0"/>
+    <w:link w:val="ab"/>
+    <w:uiPriority w:val="99"/>
+    <w:rsid w:val="00312009"/>
+  </w:style>
 </w:styles>
 </file>
 

</xml_diff>

<commit_message>
docs(governance): establish collaboration policies
</commit_message>
<xml_diff>
--- a/opensource_plan/개발 노트/1주차 개발노트.docx
+++ b/opensource_plan/개발 노트/1주차 개발노트.docx
@@ -779,7 +779,15 @@
         <w:t>다음</w:t>
       </w:r>
       <w:r>
-        <w:t xml:space="preserve"> Slice D2는 별도 논리 단위이므로 D1 커밋 후 현재 </w:t>
+        <w:t xml:space="preserve"> Slice D2는 별도 논리 단위이므로 D1 </w:t>
+      </w:r>
+      <w:proofErr w:type="spellStart"/>
+      <w:r>
+        <w:t>커밋</w:t>
+      </w:r>
+      <w:proofErr w:type="spellEnd"/>
+      <w:r>
+        <w:t xml:space="preserve"> 후 현재 </w:t>
       </w:r>
       <w:proofErr w:type="spellStart"/>
       <w:r>
@@ -822,6 +830,442 @@
         </w:rPr>
         <w:lastRenderedPageBreak/>
         <w:t>3.</w:t>
+      </w:r>
+    </w:p>
+    <w:p>
+      <w:r>
+        <w:t xml:space="preserve">Slice D2 완료했습니다. </w:t>
+      </w:r>
+      <w:proofErr w:type="spellStart"/>
+      <w:r>
+        <w:t>커밋은</w:t>
+      </w:r>
+      <w:proofErr w:type="spellEnd"/>
+      <w:r>
+        <w:t xml:space="preserve"> 하지 않았습니다.</w:t>
+      </w:r>
+    </w:p>
+    <w:p>
+      <w:r>
+        <w:t>주요 산출물:</w:t>
+      </w:r>
+    </w:p>
+    <w:p>
+      <w:pPr>
+        <w:numPr>
+          <w:ilvl w:val="0"/>
+          <w:numId w:val="6"/>
+        </w:numPr>
+      </w:pPr>
+      <w:r>
+        <w:t>[</w:t>
+      </w:r>
+      <w:proofErr w:type="gramStart"/>
+      <w:r>
+        <w:t>branch_strategy.md](</w:t>
+      </w:r>
+      <w:proofErr w:type="gramEnd"/>
+      <w:r>
+        <w:t>C:\\git\\cheongnyeon-alimi\\docs\\governance\\branch_strategy.md)</w:t>
+      </w:r>
+    </w:p>
+    <w:p>
+      <w:pPr>
+        <w:numPr>
+          <w:ilvl w:val="0"/>
+          <w:numId w:val="6"/>
+        </w:numPr>
+      </w:pPr>
+      <w:r>
+        <w:t>[</w:t>
+      </w:r>
+      <w:proofErr w:type="gramStart"/>
+      <w:r>
+        <w:t>commit_convention.md](</w:t>
+      </w:r>
+      <w:proofErr w:type="gramEnd"/>
+      <w:r>
+        <w:t>C:\\git\\cheongnyeon-alimi\\docs\\governance\\commit_convention.md)</w:t>
+      </w:r>
+    </w:p>
+    <w:p>
+      <w:pPr>
+        <w:numPr>
+          <w:ilvl w:val="0"/>
+          <w:numId w:val="6"/>
+        </w:numPr>
+      </w:pPr>
+      <w:r>
+        <w:t>[</w:t>
+      </w:r>
+      <w:proofErr w:type="gramStart"/>
+      <w:r>
+        <w:t>code_review.md](</w:t>
+      </w:r>
+      <w:proofErr w:type="gramEnd"/>
+      <w:r>
+        <w:t>C:\\git\\cheongnyeon-alimi\\docs\\governance\\code_review.md)</w:t>
+      </w:r>
+    </w:p>
+    <w:p>
+      <w:pPr>
+        <w:numPr>
+          <w:ilvl w:val="0"/>
+          <w:numId w:val="6"/>
+        </w:numPr>
+      </w:pPr>
+      <w:r>
+        <w:t>[</w:t>
+      </w:r>
+      <w:proofErr w:type="gramStart"/>
+      <w:r>
+        <w:t>documentation_policy.md](</w:t>
+      </w:r>
+      <w:proofErr w:type="gramEnd"/>
+      <w:r>
+        <w:t>C:\\git\\cheongnyeon-alimi\\docs\\governance\\documentation_policy.md)</w:t>
+      </w:r>
+    </w:p>
+    <w:p>
+      <w:pPr>
+        <w:numPr>
+          <w:ilvl w:val="0"/>
+          <w:numId w:val="6"/>
+        </w:numPr>
+      </w:pPr>
+      <w:r>
+        <w:t>[</w:t>
+      </w:r>
+      <w:proofErr w:type="gramStart"/>
+      <w:r>
+        <w:t>role_assignment.md](</w:t>
+      </w:r>
+      <w:proofErr w:type="gramEnd"/>
+      <w:r>
+        <w:t>C:\\git\\cheongnyeon-alimi\\docs\\governance\\role_assignment.md)</w:t>
+      </w:r>
+    </w:p>
+    <w:p>
+      <w:r>
+        <w:t>함께 갱신한 문서:</w:t>
+      </w:r>
+    </w:p>
+    <w:p>
+      <w:pPr>
+        <w:numPr>
+          <w:ilvl w:val="0"/>
+          <w:numId w:val="7"/>
+        </w:numPr>
+      </w:pPr>
+      <w:r>
+        <w:t>docs/governance/README.md</w:t>
+      </w:r>
+    </w:p>
+    <w:p>
+      <w:pPr>
+        <w:numPr>
+          <w:ilvl w:val="0"/>
+          <w:numId w:val="7"/>
+        </w:numPr>
+      </w:pPr>
+      <w:r>
+        <w:t>docs/index.md</w:t>
+      </w:r>
+    </w:p>
+    <w:p>
+      <w:pPr>
+        <w:numPr>
+          <w:ilvl w:val="0"/>
+          <w:numId w:val="7"/>
+        </w:numPr>
+      </w:pPr>
+      <w:r>
+        <w:t>CHANGELOG.md</w:t>
+      </w:r>
+    </w:p>
+    <w:p>
+      <w:pPr>
+        <w:numPr>
+          <w:ilvl w:val="0"/>
+          <w:numId w:val="7"/>
+        </w:numPr>
+      </w:pPr>
+      <w:r>
+        <w:t>docs/development/development_notes.md</w:t>
+      </w:r>
+    </w:p>
+    <w:p>
+      <w:r>
+        <w:t>정규화 결과:</w:t>
+      </w:r>
+    </w:p>
+    <w:p>
+      <w:pPr>
+        <w:numPr>
+          <w:ilvl w:val="0"/>
+          <w:numId w:val="8"/>
+        </w:numPr>
+      </w:pPr>
+      <w:proofErr w:type="spellStart"/>
+      <w:r>
+        <w:t>브랜치</w:t>
+      </w:r>
+      <w:proofErr w:type="spellEnd"/>
+      <w:r>
+        <w:t xml:space="preserve"> 형식을 &lt;type&gt;/&lt;domain&gt;/&lt;task&gt;로 통일</w:t>
+      </w:r>
+    </w:p>
+    <w:p>
+      <w:pPr>
+        <w:numPr>
+          <w:ilvl w:val="0"/>
+          <w:numId w:val="8"/>
+        </w:numPr>
+      </w:pPr>
+      <w:r>
+        <w:t xml:space="preserve">PR 방향을 작업 </w:t>
+      </w:r>
+      <w:proofErr w:type="spellStart"/>
+      <w:r>
+        <w:t>브랜치</w:t>
+      </w:r>
+      <w:proofErr w:type="spellEnd"/>
+      <w:r>
+        <w:t xml:space="preserve"> → develop으로 확정</w:t>
+      </w:r>
+    </w:p>
+    <w:p>
+      <w:pPr>
+        <w:numPr>
+          <w:ilvl w:val="0"/>
+          <w:numId w:val="8"/>
+        </w:numPr>
+      </w:pPr>
+      <w:r>
+        <w:t>릴리스 흐름을 develop → main으로 확정</w:t>
+      </w:r>
+    </w:p>
+    <w:p>
+      <w:pPr>
+        <w:numPr>
+          <w:ilvl w:val="0"/>
+          <w:numId w:val="8"/>
+        </w:numPr>
+      </w:pPr>
+      <w:r>
+        <w:t xml:space="preserve">별도 release </w:t>
+      </w:r>
+      <w:proofErr w:type="spellStart"/>
+      <w:r>
+        <w:t>브랜치는</w:t>
+      </w:r>
+      <w:proofErr w:type="spellEnd"/>
+      <w:r>
+        <w:t xml:space="preserve"> 정책 정의 전까지 사용하지 않음</w:t>
+      </w:r>
+    </w:p>
+    <w:p>
+      <w:pPr>
+        <w:numPr>
+          <w:ilvl w:val="0"/>
+          <w:numId w:val="8"/>
+        </w:numPr>
+      </w:pPr>
+      <w:r>
+        <w:t>Conventional Commits 규칙 확정</w:t>
+      </w:r>
+    </w:p>
+    <w:p>
+      <w:pPr>
+        <w:numPr>
+          <w:ilvl w:val="0"/>
+          <w:numId w:val="8"/>
+        </w:numPr>
+      </w:pPr>
+      <w:r>
+        <w:t>최소 1명 승인, 테스트·문서 갱신·차단 의견 해결을 병합 조건으로 연결</w:t>
+      </w:r>
+    </w:p>
+    <w:p>
+      <w:pPr>
+        <w:numPr>
+          <w:ilvl w:val="0"/>
+          <w:numId w:val="8"/>
+        </w:numPr>
+      </w:pPr>
+      <w:r>
+        <w:t>역할 문서는 담당자 이름 대신 데이터·</w:t>
+      </w:r>
+      <w:proofErr w:type="spellStart"/>
+      <w:r>
+        <w:t>백엔드</w:t>
+      </w:r>
+      <w:proofErr w:type="spellEnd"/>
+      <w:r>
+        <w:t>·</w:t>
+      </w:r>
+      <w:proofErr w:type="spellStart"/>
+      <w:r>
+        <w:t>프론트엔드</w:t>
+      </w:r>
+      <w:proofErr w:type="spellEnd"/>
+      <w:r>
+        <w:t>·팀장/공통 책임으로 정의</w:t>
+      </w:r>
+    </w:p>
+    <w:p>
+      <w:r>
+        <w:t>검증 결과:</w:t>
+      </w:r>
+    </w:p>
+    <w:p>
+      <w:pPr>
+        <w:numPr>
+          <w:ilvl w:val="0"/>
+          <w:numId w:val="9"/>
+        </w:numPr>
+      </w:pPr>
+      <w:r>
+        <w:lastRenderedPageBreak/>
+        <w:t>Markdown 링크 정상</w:t>
+      </w:r>
+    </w:p>
+    <w:p>
+      <w:pPr>
+        <w:numPr>
+          <w:ilvl w:val="0"/>
+          <w:numId w:val="9"/>
+        </w:numPr>
+      </w:pPr>
+      <w:r>
+        <w:t>D2 필수 산출물 모두 존재</w:t>
+      </w:r>
+    </w:p>
+    <w:p>
+      <w:pPr>
+        <w:numPr>
+          <w:ilvl w:val="0"/>
+          <w:numId w:val="9"/>
+        </w:numPr>
+      </w:pPr>
+      <w:r>
+        <w:t>빈 파일·빈 docs 디렉터리 없음</w:t>
+      </w:r>
+    </w:p>
+    <w:p>
+      <w:pPr>
+        <w:numPr>
+          <w:ilvl w:val="0"/>
+          <w:numId w:val="9"/>
+        </w:numPr>
+      </w:pPr>
+      <w:r>
+        <w:t xml:space="preserve">짧은 하이픈형 </w:t>
+      </w:r>
+      <w:proofErr w:type="spellStart"/>
+      <w:r>
+        <w:t>브랜치</w:t>
+      </w:r>
+      <w:proofErr w:type="spellEnd"/>
+      <w:r>
+        <w:t xml:space="preserve"> 예시 제거 확인</w:t>
+      </w:r>
+    </w:p>
+    <w:p>
+      <w:pPr>
+        <w:numPr>
+          <w:ilvl w:val="0"/>
+          <w:numId w:val="9"/>
+        </w:numPr>
+      </w:pPr>
+      <w:proofErr w:type="spellStart"/>
+      <w:r>
+        <w:t>opensource_</w:t>
+      </w:r>
+      <w:proofErr w:type="gramStart"/>
+      <w:r>
+        <w:t>plan</w:t>
+      </w:r>
+      <w:proofErr w:type="spellEnd"/>
+      <w:r>
+        <w:t>/ 변경</w:t>
+      </w:r>
+      <w:proofErr w:type="gramEnd"/>
+      <w:r>
+        <w:t xml:space="preserve"> 없음</w:t>
+      </w:r>
+    </w:p>
+    <w:p>
+      <w:pPr>
+        <w:numPr>
+          <w:ilvl w:val="0"/>
+          <w:numId w:val="9"/>
+        </w:numPr>
+      </w:pPr>
+      <w:r>
+        <w:t>git diff --check 통과</w:t>
+      </w:r>
+    </w:p>
+    <w:p>
+      <w:pPr>
+        <w:numPr>
+          <w:ilvl w:val="0"/>
+          <w:numId w:val="9"/>
+        </w:numPr>
+      </w:pPr>
+      <w:r>
+        <w:t>임시 파일 없음</w:t>
+      </w:r>
+    </w:p>
+    <w:p>
+      <w:r>
+        <w:t xml:space="preserve">간단한 코드 리뷰: 차단할 문제는 없습니다. 다만 현재 정책은 문서로 확정됐을 뿐, GitHub </w:t>
+      </w:r>
+      <w:proofErr w:type="spellStart"/>
+      <w:r>
+        <w:t>브랜치</w:t>
+      </w:r>
+      <w:proofErr w:type="spellEnd"/>
+      <w:r>
+        <w:t xml:space="preserve"> 보호·CODEOWNERS·PR 템플릿으로 자동 강제되지는 않습니다. 이는 D2 범위 밖이므로 변경하지 않고 후속 작업으로 기록했습니다.</w:t>
+      </w:r>
+    </w:p>
+    <w:p>
+      <w:r>
+        <w:t xml:space="preserve">권장 </w:t>
+      </w:r>
+      <w:proofErr w:type="spellStart"/>
+      <w:r>
+        <w:t>커밋</w:t>
+      </w:r>
+      <w:proofErr w:type="spellEnd"/>
+      <w:r>
+        <w:t xml:space="preserve"> 메시지:</w:t>
+      </w:r>
+    </w:p>
+    <w:p>
+      <w:r>
+        <w:t>docs(governance): establish collaboration policies</w:t>
+      </w:r>
+    </w:p>
+    <w:p>
+      <w:pPr>
+        <w:widowControl/>
+        <w:wordWrap/>
+        <w:autoSpaceDE/>
+        <w:autoSpaceDN/>
+      </w:pPr>
+      <w:r>
+        <w:br w:type="page"/>
+      </w:r>
+    </w:p>
+    <w:p>
+      <w:r>
+        <w:rPr>
+          <w:rFonts w:hint="eastAsia"/>
+        </w:rPr>
+        <w:lastRenderedPageBreak/>
+        <w:t>4.</w:t>
       </w:r>
     </w:p>
     <w:p>
@@ -1043,6 +1487,155 @@
     </w:lvl>
   </w:abstractNum>
   <w:abstractNum w:abstractNumId="1" w15:restartNumberingAfterBreak="0">
+    <w:nsid w:val="27965D24"/>
+    <w:multiLevelType w:val="multilevel"/>
+    <w:tmpl w:val="049899E8"/>
+    <w:lvl w:ilvl="0">
+      <w:start w:val="1"/>
+      <w:numFmt w:val="bullet"/>
+      <w:lvlText w:val=""/>
+      <w:lvlJc w:val="left"/>
+      <w:pPr>
+        <w:tabs>
+          <w:tab w:val="num" w:pos="720"/>
+        </w:tabs>
+        <w:ind w:left="720" w:hanging="360"/>
+      </w:pPr>
+      <w:rPr>
+        <w:rFonts w:ascii="Symbol" w:hAnsi="Symbol" w:hint="default"/>
+        <w:sz w:val="20"/>
+      </w:rPr>
+    </w:lvl>
+    <w:lvl w:ilvl="1" w:tentative="1">
+      <w:start w:val="1"/>
+      <w:numFmt w:val="bullet"/>
+      <w:lvlText w:val="o"/>
+      <w:lvlJc w:val="left"/>
+      <w:pPr>
+        <w:tabs>
+          <w:tab w:val="num" w:pos="1440"/>
+        </w:tabs>
+        <w:ind w:left="1440" w:hanging="360"/>
+      </w:pPr>
+      <w:rPr>
+        <w:rFonts w:ascii="Courier New" w:hAnsi="Courier New" w:hint="default"/>
+        <w:sz w:val="20"/>
+      </w:rPr>
+    </w:lvl>
+    <w:lvl w:ilvl="2" w:tentative="1">
+      <w:start w:val="1"/>
+      <w:numFmt w:val="bullet"/>
+      <w:lvlText w:val=""/>
+      <w:lvlJc w:val="left"/>
+      <w:pPr>
+        <w:tabs>
+          <w:tab w:val="num" w:pos="2160"/>
+        </w:tabs>
+        <w:ind w:left="2160" w:hanging="360"/>
+      </w:pPr>
+      <w:rPr>
+        <w:rFonts w:ascii="Wingdings" w:hAnsi="Wingdings" w:hint="default"/>
+        <w:sz w:val="20"/>
+      </w:rPr>
+    </w:lvl>
+    <w:lvl w:ilvl="3" w:tentative="1">
+      <w:start w:val="1"/>
+      <w:numFmt w:val="bullet"/>
+      <w:lvlText w:val=""/>
+      <w:lvlJc w:val="left"/>
+      <w:pPr>
+        <w:tabs>
+          <w:tab w:val="num" w:pos="2880"/>
+        </w:tabs>
+        <w:ind w:left="2880" w:hanging="360"/>
+      </w:pPr>
+      <w:rPr>
+        <w:rFonts w:ascii="Wingdings" w:hAnsi="Wingdings" w:hint="default"/>
+        <w:sz w:val="20"/>
+      </w:rPr>
+    </w:lvl>
+    <w:lvl w:ilvl="4" w:tentative="1">
+      <w:start w:val="1"/>
+      <w:numFmt w:val="bullet"/>
+      <w:lvlText w:val=""/>
+      <w:lvlJc w:val="left"/>
+      <w:pPr>
+        <w:tabs>
+          <w:tab w:val="num" w:pos="3600"/>
+        </w:tabs>
+        <w:ind w:left="3600" w:hanging="360"/>
+      </w:pPr>
+      <w:rPr>
+        <w:rFonts w:ascii="Wingdings" w:hAnsi="Wingdings" w:hint="default"/>
+        <w:sz w:val="20"/>
+      </w:rPr>
+    </w:lvl>
+    <w:lvl w:ilvl="5" w:tentative="1">
+      <w:start w:val="1"/>
+      <w:numFmt w:val="bullet"/>
+      <w:lvlText w:val=""/>
+      <w:lvlJc w:val="left"/>
+      <w:pPr>
+        <w:tabs>
+          <w:tab w:val="num" w:pos="4320"/>
+        </w:tabs>
+        <w:ind w:left="4320" w:hanging="360"/>
+      </w:pPr>
+      <w:rPr>
+        <w:rFonts w:ascii="Wingdings" w:hAnsi="Wingdings" w:hint="default"/>
+        <w:sz w:val="20"/>
+      </w:rPr>
+    </w:lvl>
+    <w:lvl w:ilvl="6" w:tentative="1">
+      <w:start w:val="1"/>
+      <w:numFmt w:val="bullet"/>
+      <w:lvlText w:val=""/>
+      <w:lvlJc w:val="left"/>
+      <w:pPr>
+        <w:tabs>
+          <w:tab w:val="num" w:pos="5040"/>
+        </w:tabs>
+        <w:ind w:left="5040" w:hanging="360"/>
+      </w:pPr>
+      <w:rPr>
+        <w:rFonts w:ascii="Wingdings" w:hAnsi="Wingdings" w:hint="default"/>
+        <w:sz w:val="20"/>
+      </w:rPr>
+    </w:lvl>
+    <w:lvl w:ilvl="7" w:tentative="1">
+      <w:start w:val="1"/>
+      <w:numFmt w:val="bullet"/>
+      <w:lvlText w:val=""/>
+      <w:lvlJc w:val="left"/>
+      <w:pPr>
+        <w:tabs>
+          <w:tab w:val="num" w:pos="5760"/>
+        </w:tabs>
+        <w:ind w:left="5760" w:hanging="360"/>
+      </w:pPr>
+      <w:rPr>
+        <w:rFonts w:ascii="Wingdings" w:hAnsi="Wingdings" w:hint="default"/>
+        <w:sz w:val="20"/>
+      </w:rPr>
+    </w:lvl>
+    <w:lvl w:ilvl="8" w:tentative="1">
+      <w:start w:val="1"/>
+      <w:numFmt w:val="bullet"/>
+      <w:lvlText w:val=""/>
+      <w:lvlJc w:val="left"/>
+      <w:pPr>
+        <w:tabs>
+          <w:tab w:val="num" w:pos="6480"/>
+        </w:tabs>
+        <w:ind w:left="6480" w:hanging="360"/>
+      </w:pPr>
+      <w:rPr>
+        <w:rFonts w:ascii="Wingdings" w:hAnsi="Wingdings" w:hint="default"/>
+        <w:sz w:val="20"/>
+      </w:rPr>
+    </w:lvl>
+  </w:abstractNum>
+  <w:abstractNum w:abstractNumId="2" w15:restartNumberingAfterBreak="0">
     <w:nsid w:val="2D5C644F"/>
     <w:multiLevelType w:val="hybridMultilevel"/>
     <w:tmpl w:val="E4CCF9F4"/>
@@ -1131,7 +1724,156 @@
       </w:pPr>
     </w:lvl>
   </w:abstractNum>
-  <w:abstractNum w:abstractNumId="2" w15:restartNumberingAfterBreak="0">
+  <w:abstractNum w:abstractNumId="3" w15:restartNumberingAfterBreak="0">
+    <w:nsid w:val="2E54028D"/>
+    <w:multiLevelType w:val="multilevel"/>
+    <w:tmpl w:val="09369F8E"/>
+    <w:lvl w:ilvl="0">
+      <w:start w:val="1"/>
+      <w:numFmt w:val="bullet"/>
+      <w:lvlText w:val=""/>
+      <w:lvlJc w:val="left"/>
+      <w:pPr>
+        <w:tabs>
+          <w:tab w:val="num" w:pos="720"/>
+        </w:tabs>
+        <w:ind w:left="720" w:hanging="360"/>
+      </w:pPr>
+      <w:rPr>
+        <w:rFonts w:ascii="Symbol" w:hAnsi="Symbol" w:hint="default"/>
+        <w:sz w:val="20"/>
+      </w:rPr>
+    </w:lvl>
+    <w:lvl w:ilvl="1" w:tentative="1">
+      <w:start w:val="1"/>
+      <w:numFmt w:val="bullet"/>
+      <w:lvlText w:val="o"/>
+      <w:lvlJc w:val="left"/>
+      <w:pPr>
+        <w:tabs>
+          <w:tab w:val="num" w:pos="1440"/>
+        </w:tabs>
+        <w:ind w:left="1440" w:hanging="360"/>
+      </w:pPr>
+      <w:rPr>
+        <w:rFonts w:ascii="Courier New" w:hAnsi="Courier New" w:hint="default"/>
+        <w:sz w:val="20"/>
+      </w:rPr>
+    </w:lvl>
+    <w:lvl w:ilvl="2" w:tentative="1">
+      <w:start w:val="1"/>
+      <w:numFmt w:val="bullet"/>
+      <w:lvlText w:val=""/>
+      <w:lvlJc w:val="left"/>
+      <w:pPr>
+        <w:tabs>
+          <w:tab w:val="num" w:pos="2160"/>
+        </w:tabs>
+        <w:ind w:left="2160" w:hanging="360"/>
+      </w:pPr>
+      <w:rPr>
+        <w:rFonts w:ascii="Wingdings" w:hAnsi="Wingdings" w:hint="default"/>
+        <w:sz w:val="20"/>
+      </w:rPr>
+    </w:lvl>
+    <w:lvl w:ilvl="3" w:tentative="1">
+      <w:start w:val="1"/>
+      <w:numFmt w:val="bullet"/>
+      <w:lvlText w:val=""/>
+      <w:lvlJc w:val="left"/>
+      <w:pPr>
+        <w:tabs>
+          <w:tab w:val="num" w:pos="2880"/>
+        </w:tabs>
+        <w:ind w:left="2880" w:hanging="360"/>
+      </w:pPr>
+      <w:rPr>
+        <w:rFonts w:ascii="Wingdings" w:hAnsi="Wingdings" w:hint="default"/>
+        <w:sz w:val="20"/>
+      </w:rPr>
+    </w:lvl>
+    <w:lvl w:ilvl="4" w:tentative="1">
+      <w:start w:val="1"/>
+      <w:numFmt w:val="bullet"/>
+      <w:lvlText w:val=""/>
+      <w:lvlJc w:val="left"/>
+      <w:pPr>
+        <w:tabs>
+          <w:tab w:val="num" w:pos="3600"/>
+        </w:tabs>
+        <w:ind w:left="3600" w:hanging="360"/>
+      </w:pPr>
+      <w:rPr>
+        <w:rFonts w:ascii="Wingdings" w:hAnsi="Wingdings" w:hint="default"/>
+        <w:sz w:val="20"/>
+      </w:rPr>
+    </w:lvl>
+    <w:lvl w:ilvl="5" w:tentative="1">
+      <w:start w:val="1"/>
+      <w:numFmt w:val="bullet"/>
+      <w:lvlText w:val=""/>
+      <w:lvlJc w:val="left"/>
+      <w:pPr>
+        <w:tabs>
+          <w:tab w:val="num" w:pos="4320"/>
+        </w:tabs>
+        <w:ind w:left="4320" w:hanging="360"/>
+      </w:pPr>
+      <w:rPr>
+        <w:rFonts w:ascii="Wingdings" w:hAnsi="Wingdings" w:hint="default"/>
+        <w:sz w:val="20"/>
+      </w:rPr>
+    </w:lvl>
+    <w:lvl w:ilvl="6" w:tentative="1">
+      <w:start w:val="1"/>
+      <w:numFmt w:val="bullet"/>
+      <w:lvlText w:val=""/>
+      <w:lvlJc w:val="left"/>
+      <w:pPr>
+        <w:tabs>
+          <w:tab w:val="num" w:pos="5040"/>
+        </w:tabs>
+        <w:ind w:left="5040" w:hanging="360"/>
+      </w:pPr>
+      <w:rPr>
+        <w:rFonts w:ascii="Wingdings" w:hAnsi="Wingdings" w:hint="default"/>
+        <w:sz w:val="20"/>
+      </w:rPr>
+    </w:lvl>
+    <w:lvl w:ilvl="7" w:tentative="1">
+      <w:start w:val="1"/>
+      <w:numFmt w:val="bullet"/>
+      <w:lvlText w:val=""/>
+      <w:lvlJc w:val="left"/>
+      <w:pPr>
+        <w:tabs>
+          <w:tab w:val="num" w:pos="5760"/>
+        </w:tabs>
+        <w:ind w:left="5760" w:hanging="360"/>
+      </w:pPr>
+      <w:rPr>
+        <w:rFonts w:ascii="Wingdings" w:hAnsi="Wingdings" w:hint="default"/>
+        <w:sz w:val="20"/>
+      </w:rPr>
+    </w:lvl>
+    <w:lvl w:ilvl="8" w:tentative="1">
+      <w:start w:val="1"/>
+      <w:numFmt w:val="bullet"/>
+      <w:lvlText w:val=""/>
+      <w:lvlJc w:val="left"/>
+      <w:pPr>
+        <w:tabs>
+          <w:tab w:val="num" w:pos="6480"/>
+        </w:tabs>
+        <w:ind w:left="6480" w:hanging="360"/>
+      </w:pPr>
+      <w:rPr>
+        <w:rFonts w:ascii="Wingdings" w:hAnsi="Wingdings" w:hint="default"/>
+        <w:sz w:val="20"/>
+      </w:rPr>
+    </w:lvl>
+  </w:abstractNum>
+  <w:abstractNum w:abstractNumId="4" w15:restartNumberingAfterBreak="0">
     <w:nsid w:val="3E271797"/>
     <w:multiLevelType w:val="multilevel"/>
     <w:tmpl w:val="3E164BD8"/>
@@ -1280,7 +2022,7 @@
       </w:rPr>
     </w:lvl>
   </w:abstractNum>
-  <w:abstractNum w:abstractNumId="3" w15:restartNumberingAfterBreak="0">
+  <w:abstractNum w:abstractNumId="5" w15:restartNumberingAfterBreak="0">
     <w:nsid w:val="3E714592"/>
     <w:multiLevelType w:val="hybridMultilevel"/>
     <w:tmpl w:val="8716DA70"/>
@@ -1369,7 +2111,7 @@
       </w:pPr>
     </w:lvl>
   </w:abstractNum>
-  <w:abstractNum w:abstractNumId="4" w15:restartNumberingAfterBreak="0">
+  <w:abstractNum w:abstractNumId="6" w15:restartNumberingAfterBreak="0">
     <w:nsid w:val="48C167EF"/>
     <w:multiLevelType w:val="multilevel"/>
     <w:tmpl w:val="33B8865A"/>
@@ -1518,20 +2260,330 @@
       </w:rPr>
     </w:lvl>
   </w:abstractNum>
+  <w:abstractNum w:abstractNumId="7" w15:restartNumberingAfterBreak="0">
+    <w:nsid w:val="67240F69"/>
+    <w:multiLevelType w:val="multilevel"/>
+    <w:tmpl w:val="A3D83C64"/>
+    <w:lvl w:ilvl="0">
+      <w:start w:val="1"/>
+      <w:numFmt w:val="bullet"/>
+      <w:lvlText w:val=""/>
+      <w:lvlJc w:val="left"/>
+      <w:pPr>
+        <w:tabs>
+          <w:tab w:val="num" w:pos="720"/>
+        </w:tabs>
+        <w:ind w:left="720" w:hanging="360"/>
+      </w:pPr>
+      <w:rPr>
+        <w:rFonts w:ascii="Symbol" w:hAnsi="Symbol" w:hint="default"/>
+        <w:sz w:val="20"/>
+      </w:rPr>
+    </w:lvl>
+    <w:lvl w:ilvl="1" w:tentative="1">
+      <w:start w:val="1"/>
+      <w:numFmt w:val="bullet"/>
+      <w:lvlText w:val="o"/>
+      <w:lvlJc w:val="left"/>
+      <w:pPr>
+        <w:tabs>
+          <w:tab w:val="num" w:pos="1440"/>
+        </w:tabs>
+        <w:ind w:left="1440" w:hanging="360"/>
+      </w:pPr>
+      <w:rPr>
+        <w:rFonts w:ascii="Courier New" w:hAnsi="Courier New" w:hint="default"/>
+        <w:sz w:val="20"/>
+      </w:rPr>
+    </w:lvl>
+    <w:lvl w:ilvl="2" w:tentative="1">
+      <w:start w:val="1"/>
+      <w:numFmt w:val="bullet"/>
+      <w:lvlText w:val=""/>
+      <w:lvlJc w:val="left"/>
+      <w:pPr>
+        <w:tabs>
+          <w:tab w:val="num" w:pos="2160"/>
+        </w:tabs>
+        <w:ind w:left="2160" w:hanging="360"/>
+      </w:pPr>
+      <w:rPr>
+        <w:rFonts w:ascii="Wingdings" w:hAnsi="Wingdings" w:hint="default"/>
+        <w:sz w:val="20"/>
+      </w:rPr>
+    </w:lvl>
+    <w:lvl w:ilvl="3" w:tentative="1">
+      <w:start w:val="1"/>
+      <w:numFmt w:val="bullet"/>
+      <w:lvlText w:val=""/>
+      <w:lvlJc w:val="left"/>
+      <w:pPr>
+        <w:tabs>
+          <w:tab w:val="num" w:pos="2880"/>
+        </w:tabs>
+        <w:ind w:left="2880" w:hanging="360"/>
+      </w:pPr>
+      <w:rPr>
+        <w:rFonts w:ascii="Wingdings" w:hAnsi="Wingdings" w:hint="default"/>
+        <w:sz w:val="20"/>
+      </w:rPr>
+    </w:lvl>
+    <w:lvl w:ilvl="4" w:tentative="1">
+      <w:start w:val="1"/>
+      <w:numFmt w:val="bullet"/>
+      <w:lvlText w:val=""/>
+      <w:lvlJc w:val="left"/>
+      <w:pPr>
+        <w:tabs>
+          <w:tab w:val="num" w:pos="3600"/>
+        </w:tabs>
+        <w:ind w:left="3600" w:hanging="360"/>
+      </w:pPr>
+      <w:rPr>
+        <w:rFonts w:ascii="Wingdings" w:hAnsi="Wingdings" w:hint="default"/>
+        <w:sz w:val="20"/>
+      </w:rPr>
+    </w:lvl>
+    <w:lvl w:ilvl="5" w:tentative="1">
+      <w:start w:val="1"/>
+      <w:numFmt w:val="bullet"/>
+      <w:lvlText w:val=""/>
+      <w:lvlJc w:val="left"/>
+      <w:pPr>
+        <w:tabs>
+          <w:tab w:val="num" w:pos="4320"/>
+        </w:tabs>
+        <w:ind w:left="4320" w:hanging="360"/>
+      </w:pPr>
+      <w:rPr>
+        <w:rFonts w:ascii="Wingdings" w:hAnsi="Wingdings" w:hint="default"/>
+        <w:sz w:val="20"/>
+      </w:rPr>
+    </w:lvl>
+    <w:lvl w:ilvl="6" w:tentative="1">
+      <w:start w:val="1"/>
+      <w:numFmt w:val="bullet"/>
+      <w:lvlText w:val=""/>
+      <w:lvlJc w:val="left"/>
+      <w:pPr>
+        <w:tabs>
+          <w:tab w:val="num" w:pos="5040"/>
+        </w:tabs>
+        <w:ind w:left="5040" w:hanging="360"/>
+      </w:pPr>
+      <w:rPr>
+        <w:rFonts w:ascii="Wingdings" w:hAnsi="Wingdings" w:hint="default"/>
+        <w:sz w:val="20"/>
+      </w:rPr>
+    </w:lvl>
+    <w:lvl w:ilvl="7" w:tentative="1">
+      <w:start w:val="1"/>
+      <w:numFmt w:val="bullet"/>
+      <w:lvlText w:val=""/>
+      <w:lvlJc w:val="left"/>
+      <w:pPr>
+        <w:tabs>
+          <w:tab w:val="num" w:pos="5760"/>
+        </w:tabs>
+        <w:ind w:left="5760" w:hanging="360"/>
+      </w:pPr>
+      <w:rPr>
+        <w:rFonts w:ascii="Wingdings" w:hAnsi="Wingdings" w:hint="default"/>
+        <w:sz w:val="20"/>
+      </w:rPr>
+    </w:lvl>
+    <w:lvl w:ilvl="8" w:tentative="1">
+      <w:start w:val="1"/>
+      <w:numFmt w:val="bullet"/>
+      <w:lvlText w:val=""/>
+      <w:lvlJc w:val="left"/>
+      <w:pPr>
+        <w:tabs>
+          <w:tab w:val="num" w:pos="6480"/>
+        </w:tabs>
+        <w:ind w:left="6480" w:hanging="360"/>
+      </w:pPr>
+      <w:rPr>
+        <w:rFonts w:ascii="Wingdings" w:hAnsi="Wingdings" w:hint="default"/>
+        <w:sz w:val="20"/>
+      </w:rPr>
+    </w:lvl>
+  </w:abstractNum>
+  <w:abstractNum w:abstractNumId="8" w15:restartNumberingAfterBreak="0">
+    <w:nsid w:val="67806DC6"/>
+    <w:multiLevelType w:val="multilevel"/>
+    <w:tmpl w:val="02025B42"/>
+    <w:lvl w:ilvl="0">
+      <w:start w:val="1"/>
+      <w:numFmt w:val="bullet"/>
+      <w:lvlText w:val=""/>
+      <w:lvlJc w:val="left"/>
+      <w:pPr>
+        <w:tabs>
+          <w:tab w:val="num" w:pos="720"/>
+        </w:tabs>
+        <w:ind w:left="720" w:hanging="360"/>
+      </w:pPr>
+      <w:rPr>
+        <w:rFonts w:ascii="Symbol" w:hAnsi="Symbol" w:hint="default"/>
+        <w:sz w:val="20"/>
+      </w:rPr>
+    </w:lvl>
+    <w:lvl w:ilvl="1" w:tentative="1">
+      <w:start w:val="1"/>
+      <w:numFmt w:val="bullet"/>
+      <w:lvlText w:val="o"/>
+      <w:lvlJc w:val="left"/>
+      <w:pPr>
+        <w:tabs>
+          <w:tab w:val="num" w:pos="1440"/>
+        </w:tabs>
+        <w:ind w:left="1440" w:hanging="360"/>
+      </w:pPr>
+      <w:rPr>
+        <w:rFonts w:ascii="Courier New" w:hAnsi="Courier New" w:hint="default"/>
+        <w:sz w:val="20"/>
+      </w:rPr>
+    </w:lvl>
+    <w:lvl w:ilvl="2" w:tentative="1">
+      <w:start w:val="1"/>
+      <w:numFmt w:val="bullet"/>
+      <w:lvlText w:val=""/>
+      <w:lvlJc w:val="left"/>
+      <w:pPr>
+        <w:tabs>
+          <w:tab w:val="num" w:pos="2160"/>
+        </w:tabs>
+        <w:ind w:left="2160" w:hanging="360"/>
+      </w:pPr>
+      <w:rPr>
+        <w:rFonts w:ascii="Wingdings" w:hAnsi="Wingdings" w:hint="default"/>
+        <w:sz w:val="20"/>
+      </w:rPr>
+    </w:lvl>
+    <w:lvl w:ilvl="3" w:tentative="1">
+      <w:start w:val="1"/>
+      <w:numFmt w:val="bullet"/>
+      <w:lvlText w:val=""/>
+      <w:lvlJc w:val="left"/>
+      <w:pPr>
+        <w:tabs>
+          <w:tab w:val="num" w:pos="2880"/>
+        </w:tabs>
+        <w:ind w:left="2880" w:hanging="360"/>
+      </w:pPr>
+      <w:rPr>
+        <w:rFonts w:ascii="Wingdings" w:hAnsi="Wingdings" w:hint="default"/>
+        <w:sz w:val="20"/>
+      </w:rPr>
+    </w:lvl>
+    <w:lvl w:ilvl="4" w:tentative="1">
+      <w:start w:val="1"/>
+      <w:numFmt w:val="bullet"/>
+      <w:lvlText w:val=""/>
+      <w:lvlJc w:val="left"/>
+      <w:pPr>
+        <w:tabs>
+          <w:tab w:val="num" w:pos="3600"/>
+        </w:tabs>
+        <w:ind w:left="3600" w:hanging="360"/>
+      </w:pPr>
+      <w:rPr>
+        <w:rFonts w:ascii="Wingdings" w:hAnsi="Wingdings" w:hint="default"/>
+        <w:sz w:val="20"/>
+      </w:rPr>
+    </w:lvl>
+    <w:lvl w:ilvl="5" w:tentative="1">
+      <w:start w:val="1"/>
+      <w:numFmt w:val="bullet"/>
+      <w:lvlText w:val=""/>
+      <w:lvlJc w:val="left"/>
+      <w:pPr>
+        <w:tabs>
+          <w:tab w:val="num" w:pos="4320"/>
+        </w:tabs>
+        <w:ind w:left="4320" w:hanging="360"/>
+      </w:pPr>
+      <w:rPr>
+        <w:rFonts w:ascii="Wingdings" w:hAnsi="Wingdings" w:hint="default"/>
+        <w:sz w:val="20"/>
+      </w:rPr>
+    </w:lvl>
+    <w:lvl w:ilvl="6" w:tentative="1">
+      <w:start w:val="1"/>
+      <w:numFmt w:val="bullet"/>
+      <w:lvlText w:val=""/>
+      <w:lvlJc w:val="left"/>
+      <w:pPr>
+        <w:tabs>
+          <w:tab w:val="num" w:pos="5040"/>
+        </w:tabs>
+        <w:ind w:left="5040" w:hanging="360"/>
+      </w:pPr>
+      <w:rPr>
+        <w:rFonts w:ascii="Wingdings" w:hAnsi="Wingdings" w:hint="default"/>
+        <w:sz w:val="20"/>
+      </w:rPr>
+    </w:lvl>
+    <w:lvl w:ilvl="7" w:tentative="1">
+      <w:start w:val="1"/>
+      <w:numFmt w:val="bullet"/>
+      <w:lvlText w:val=""/>
+      <w:lvlJc w:val="left"/>
+      <w:pPr>
+        <w:tabs>
+          <w:tab w:val="num" w:pos="5760"/>
+        </w:tabs>
+        <w:ind w:left="5760" w:hanging="360"/>
+      </w:pPr>
+      <w:rPr>
+        <w:rFonts w:ascii="Wingdings" w:hAnsi="Wingdings" w:hint="default"/>
+        <w:sz w:val="20"/>
+      </w:rPr>
+    </w:lvl>
+    <w:lvl w:ilvl="8" w:tentative="1">
+      <w:start w:val="1"/>
+      <w:numFmt w:val="bullet"/>
+      <w:lvlText w:val=""/>
+      <w:lvlJc w:val="left"/>
+      <w:pPr>
+        <w:tabs>
+          <w:tab w:val="num" w:pos="6480"/>
+        </w:tabs>
+        <w:ind w:left="6480" w:hanging="360"/>
+      </w:pPr>
+      <w:rPr>
+        <w:rFonts w:ascii="Wingdings" w:hAnsi="Wingdings" w:hint="default"/>
+        <w:sz w:val="20"/>
+      </w:rPr>
+    </w:lvl>
+  </w:abstractNum>
   <w:num w:numId="1" w16cid:durableId="813789872">
-    <w:abstractNumId w:val="1"/>
+    <w:abstractNumId w:val="2"/>
   </w:num>
   <w:num w:numId="2" w16cid:durableId="218054268">
-    <w:abstractNumId w:val="3"/>
+    <w:abstractNumId w:val="5"/>
   </w:num>
   <w:num w:numId="3" w16cid:durableId="773482401">
     <w:abstractNumId w:val="0"/>
   </w:num>
   <w:num w:numId="4" w16cid:durableId="1227841907">
+    <w:abstractNumId w:val="6"/>
+  </w:num>
+  <w:num w:numId="5" w16cid:durableId="87775347">
     <w:abstractNumId w:val="4"/>
   </w:num>
-  <w:num w:numId="5" w16cid:durableId="87775347">
-    <w:abstractNumId w:val="2"/>
+  <w:num w:numId="6" w16cid:durableId="1280914734">
+    <w:abstractNumId w:val="3"/>
+  </w:num>
+  <w:num w:numId="7" w16cid:durableId="586039891">
+    <w:abstractNumId w:val="7"/>
+  </w:num>
+  <w:num w:numId="8" w16cid:durableId="1771202012">
+    <w:abstractNumId w:val="1"/>
+  </w:num>
+  <w:num w:numId="9" w16cid:durableId="900680235">
+    <w:abstractNumId w:val="8"/>
   </w:num>
 </w:numbering>
 </file>

</xml_diff>

<commit_message>
docs(data): define data documentation baseline
</commit_message>
<xml_diff>
--- a/opensource_plan/개발 노트/1주차 개발노트.docx
+++ b/opensource_plan/개발 노트/1주차 개발노트.docx
@@ -779,15 +779,7 @@
         <w:t>다음</w:t>
       </w:r>
       <w:r>
-        <w:t xml:space="preserve"> Slice D2는 별도 논리 단위이므로 D1 </w:t>
-      </w:r>
-      <w:proofErr w:type="spellStart"/>
-      <w:r>
-        <w:t>커밋</w:t>
-      </w:r>
-      <w:proofErr w:type="spellEnd"/>
-      <w:r>
-        <w:t xml:space="preserve"> 후 현재 </w:t>
+        <w:t xml:space="preserve"> Slice D2는 별도 논리 단위이므로 D1 커밋 후 현재 </w:t>
       </w:r>
       <w:proofErr w:type="spellStart"/>
       <w:r>
@@ -1266,6 +1258,718 @@
         </w:rPr>
         <w:lastRenderedPageBreak/>
         <w:t>4.</w:t>
+      </w:r>
+    </w:p>
+    <w:p>
+      <w:r>
+        <w:t>로컬 디렉토리 경로: C:\git\cheongnyeon-alimi</w:t>
+      </w:r>
+      <w:r>
+        <w:br/>
+      </w:r>
+      <w:proofErr w:type="spellStart"/>
+      <w:r>
+        <w:t>브랜치</w:t>
+      </w:r>
+      <w:proofErr w:type="spellEnd"/>
+      <w:r>
+        <w:t>: docs/governance/collaboration-policy</w:t>
+      </w:r>
+    </w:p>
+    <w:p>
+      <w:r>
+        <w:t>확인 사항</w:t>
+      </w:r>
+    </w:p>
+    <w:p>
+      <w:pPr>
+        <w:numPr>
+          <w:ilvl w:val="0"/>
+          <w:numId w:val="10"/>
+        </w:numPr>
+      </w:pPr>
+      <w:r>
+        <w:t>코드 수정 후 채팅으로 코드 리뷰를 간단하게 해줄 것.</w:t>
+      </w:r>
+    </w:p>
+    <w:p>
+      <w:pPr>
+        <w:numPr>
+          <w:ilvl w:val="0"/>
+          <w:numId w:val="10"/>
+        </w:numPr>
+      </w:pPr>
+      <w:r>
+        <w:t xml:space="preserve">작업 후 네가 </w:t>
+      </w:r>
+      <w:proofErr w:type="spellStart"/>
+      <w:r>
+        <w:t>커밋하지말고</w:t>
+      </w:r>
+      <w:proofErr w:type="spellEnd"/>
+      <w:r>
+        <w:t xml:space="preserve"> 나에게 commit message를 알려줄 것.</w:t>
+      </w:r>
+    </w:p>
+    <w:p>
+      <w:pPr>
+        <w:numPr>
+          <w:ilvl w:val="0"/>
+          <w:numId w:val="10"/>
+        </w:numPr>
+      </w:pPr>
+      <w:r>
+        <w:t>작업 후 docs index에 맞게 docs를 추가할 것.</w:t>
+      </w:r>
+    </w:p>
+    <w:p>
+      <w:pPr>
+        <w:numPr>
+          <w:ilvl w:val="0"/>
+          <w:numId w:val="10"/>
+        </w:numPr>
+      </w:pPr>
+      <w:r>
+        <w:t>작업 중 추가한 null 폴더나 test 파일은 삭제할 것. (test code는 삭제하지 않아도 됨. 테스트용으로 추가한 임시 파일만 삭제할 것.)</w:t>
+      </w:r>
+    </w:p>
+    <w:p>
+      <w:pPr>
+        <w:numPr>
+          <w:ilvl w:val="0"/>
+          <w:numId w:val="10"/>
+        </w:numPr>
+      </w:pPr>
+      <w:r>
+        <w:t xml:space="preserve">만약 다음 작업에서 </w:t>
+      </w:r>
+      <w:proofErr w:type="spellStart"/>
+      <w:r>
+        <w:t>브랜치를</w:t>
+      </w:r>
+      <w:proofErr w:type="spellEnd"/>
+      <w:r>
+        <w:t xml:space="preserve"> 새로 생성해서 진행하는 편이 나을 경우, </w:t>
+      </w:r>
+      <w:proofErr w:type="spellStart"/>
+      <w:r>
+        <w:t>브랜치명과</w:t>
+      </w:r>
+      <w:proofErr w:type="spellEnd"/>
+      <w:r>
+        <w:t xml:space="preserve"> 함께 언급해줄 것. </w:t>
+      </w:r>
+    </w:p>
+    <w:p>
+      <w:pPr>
+        <w:numPr>
+          <w:ilvl w:val="0"/>
+          <w:numId w:val="10"/>
+        </w:numPr>
+      </w:pPr>
+      <w:r>
+        <w:t xml:space="preserve">네가 시스템 구조나 다음에 할 내용이 불명확하다면, 다시 "C:\git\cheongnyeon-alimi\opensource_plan"에서 확인하고 명확히 해라. 네가 임의적으로 시스템 구조를 바꾸면 안된다. 일단 </w:t>
+      </w:r>
+      <w:proofErr w:type="spellStart"/>
+      <w:r>
+        <w:t>짜놓은</w:t>
+      </w:r>
+      <w:proofErr w:type="spellEnd"/>
+      <w:r>
+        <w:t xml:space="preserve"> 계획대로 </w:t>
+      </w:r>
+      <w:proofErr w:type="spellStart"/>
+      <w:r>
+        <w:t>흘러가야한다</w:t>
+      </w:r>
+      <w:proofErr w:type="spellEnd"/>
+      <w:r>
+        <w:t xml:space="preserve">. </w:t>
+      </w:r>
+    </w:p>
+    <w:p>
+      <w:pPr>
+        <w:numPr>
+          <w:ilvl w:val="0"/>
+          <w:numId w:val="10"/>
+        </w:numPr>
+      </w:pPr>
+      <w:r>
+        <w:t>"C:\git\cheongnyeon-alimi\opensource_plan" 여기는 네가 수정할 일이 없다. 참고만 하면 된다.</w:t>
+      </w:r>
+    </w:p>
+    <w:p>
+      <w:pPr>
+        <w:numPr>
+          <w:ilvl w:val="0"/>
+          <w:numId w:val="10"/>
+        </w:numPr>
+      </w:pPr>
+      <w:r>
+        <w:t xml:space="preserve">slice별로 작업을 하는데, 뭔가 이상한 점이나 이러면 안되는데 라는 생각이 들면 </w:t>
+      </w:r>
+      <w:proofErr w:type="spellStart"/>
+      <w:r>
+        <w:t>수정하지말고</w:t>
+      </w:r>
+      <w:proofErr w:type="spellEnd"/>
+      <w:r>
+        <w:t xml:space="preserve"> 채팅으로 언급해라. 구조상 맞지 않거나, 버그가 발생할 것 같은 상황을 말하는 것이다.</w:t>
+      </w:r>
+    </w:p>
+    <w:p>
+      <w:r>
+        <w:t>Slice D3 가보자.</w:t>
+      </w:r>
+    </w:p>
+    <w:p>
+      <w:r>
+        <w:t>Slice D3 — 시스템 아키텍처 기준선</w:t>
+      </w:r>
+      <w:r>
+        <w:br/>
+        <w:t>데이터 개발 전에 팀 전체가 합의해야 할 경계를 문서화합니다.</w:t>
+      </w:r>
+      <w:r>
+        <w:br/>
+        <w:t>산출물:</w:t>
+      </w:r>
+      <w:r>
+        <w:br/>
+        <w:t>• docs/architecture/overview.md</w:t>
+      </w:r>
+      <w:r>
+        <w:br/>
+        <w:t>• docs/architecture/system_flow.md</w:t>
+      </w:r>
+      <w:r>
+        <w:br/>
+        <w:t>• docs/architecture/container_structure.md</w:t>
+      </w:r>
+      <w:r>
+        <w:br/>
+        <w:t>• docs/architecture/decisions/README.md</w:t>
+      </w:r>
+      <w:r>
+        <w:br/>
+        <w:t>문서화할 핵심 흐름:</w:t>
+      </w:r>
+      <w:r>
+        <w:br/>
+        <w:t>External Sources</w:t>
+      </w:r>
+      <w:r>
+        <w:br/>
+        <w:t>→ Collector</w:t>
+      </w:r>
+      <w:r>
+        <w:br/>
+      </w:r>
+      <w:r>
+        <w:lastRenderedPageBreak/>
+        <w:t xml:space="preserve">→ </w:t>
+      </w:r>
+      <w:proofErr w:type="spellStart"/>
+      <w:r>
+        <w:t>RawPolicyDocument</w:t>
+      </w:r>
+      <w:proofErr w:type="spellEnd"/>
+      <w:r>
+        <w:br/>
+        <w:t>→ Source Extractor</w:t>
+      </w:r>
+      <w:r>
+        <w:br/>
+        <w:t xml:space="preserve">→ </w:t>
+      </w:r>
+      <w:proofErr w:type="spellStart"/>
+      <w:r>
+        <w:t>ExtractedPolicy</w:t>
+      </w:r>
+      <w:proofErr w:type="spellEnd"/>
+      <w:r>
+        <w:br/>
+        <w:t xml:space="preserve">→ </w:t>
+      </w:r>
+      <w:proofErr w:type="spellStart"/>
+      <w:r>
+        <w:t>NormalizedProgram</w:t>
+      </w:r>
+      <w:proofErr w:type="spellEnd"/>
+      <w:r>
+        <w:br/>
+        <w:t>→ Validator</w:t>
+      </w:r>
+      <w:r>
+        <w:br/>
+        <w:t>→ Fixture/Seed 또는 PostgreSQL</w:t>
+      </w:r>
+      <w:r>
+        <w:br/>
+        <w:t xml:space="preserve">→ </w:t>
+      </w:r>
+      <w:proofErr w:type="spellStart"/>
+      <w:r>
+        <w:t>FastAPI</w:t>
+      </w:r>
+      <w:proofErr w:type="spellEnd"/>
+      <w:r>
+        <w:br/>
+        <w:t>→ React</w:t>
+      </w:r>
+      <w:r>
+        <w:br/>
+        <w:t>함께 고정할 책임 경계:</w:t>
+      </w:r>
+      <w:r>
+        <w:br/>
+        <w:t xml:space="preserve">• Collector는 </w:t>
+      </w:r>
+      <w:proofErr w:type="spellStart"/>
+      <w:r>
+        <w:t>정규화하지</w:t>
+      </w:r>
+      <w:proofErr w:type="spellEnd"/>
+      <w:r>
+        <w:t xml:space="preserve"> 않음</w:t>
+      </w:r>
+      <w:r>
+        <w:br/>
+        <w:t>• Raw 원문은 손실 없이 보존</w:t>
+      </w:r>
+      <w:r>
+        <w:br/>
+        <w:t>• 소스별 의미 해석은 Extractor 담당</w:t>
+      </w:r>
+      <w:r>
+        <w:br/>
+        <w:t>• 공통 형식 변환은 Normalizer 담당</w:t>
+      </w:r>
+      <w:r>
+        <w:br/>
+        <w:t>• JSON Schema는 팀 간 데이터 계약</w:t>
+      </w:r>
+      <w:r>
+        <w:br/>
+        <w:t>• 운영 Raw 데이터는 Git에 커밋하지 않음</w:t>
+      </w:r>
+      <w:r>
+        <w:br/>
+        <w:t>완료 기준:</w:t>
+      </w:r>
+      <w:r>
+        <w:br/>
+        <w:t>• 데이터·</w:t>
+      </w:r>
+      <w:proofErr w:type="spellStart"/>
+      <w:r>
+        <w:t>백엔드</w:t>
+      </w:r>
+      <w:proofErr w:type="spellEnd"/>
+      <w:r>
+        <w:t>·</w:t>
+      </w:r>
+      <w:proofErr w:type="spellStart"/>
+      <w:r>
+        <w:t>프론트엔드가</w:t>
+      </w:r>
+      <w:proofErr w:type="spellEnd"/>
+      <w:r>
+        <w:t xml:space="preserve"> 같은 용어를 사용함</w:t>
+      </w:r>
+      <w:r>
+        <w:br/>
+        <w:t>• 각 계층의 입력, 출력, 책임이 구분됨</w:t>
+      </w:r>
+      <w:r>
+        <w:br/>
+        <w:t>• 향후 변경은 ADR 형태로 기록할 수 있음</w:t>
+      </w:r>
+    </w:p>
+    <w:p>
+      <w:r>
+        <w:t>Show more</w:t>
+      </w:r>
+    </w:p>
+    <w:p>
+      <w:r>
+        <w:t>5:08 PM</w:t>
+      </w:r>
+    </w:p>
+    <w:p>
+      <w:r>
+        <w:t>Worked for 2m 55s</w:t>
+      </w:r>
+    </w:p>
+    <w:p>
+      <w:r>
+        <w:t xml:space="preserve">Slice D3 완료했습니다. </w:t>
+      </w:r>
+      <w:proofErr w:type="spellStart"/>
+      <w:r>
+        <w:t>커밋은</w:t>
+      </w:r>
+      <w:proofErr w:type="spellEnd"/>
+      <w:r>
+        <w:t xml:space="preserve"> 하지 않았습니다.</w:t>
+      </w:r>
+    </w:p>
+    <w:p>
+      <w:r>
+        <w:t>주요 산출물:</w:t>
+      </w:r>
+    </w:p>
+    <w:p>
+      <w:pPr>
+        <w:numPr>
+          <w:ilvl w:val="0"/>
+          <w:numId w:val="11"/>
+        </w:numPr>
+      </w:pPr>
+      <w:r>
+        <w:t>[</w:t>
+      </w:r>
+      <w:proofErr w:type="gramStart"/>
+      <w:r>
+        <w:t>overview.md](</w:t>
+      </w:r>
+      <w:proofErr w:type="gramEnd"/>
+      <w:r>
+        <w:t>C:\\git\\cheongnyeon-alimi\\docs\\architecture\\overview.md)</w:t>
+      </w:r>
+    </w:p>
+    <w:p>
+      <w:pPr>
+        <w:numPr>
+          <w:ilvl w:val="0"/>
+          <w:numId w:val="11"/>
+        </w:numPr>
+      </w:pPr>
+      <w:r>
+        <w:t>[</w:t>
+      </w:r>
+      <w:proofErr w:type="gramStart"/>
+      <w:r>
+        <w:t>system_flow.md](</w:t>
+      </w:r>
+      <w:proofErr w:type="gramEnd"/>
+      <w:r>
+        <w:t>C:\\git\\cheongnyeon-alimi\\docs\\architecture\\system_flow.md)</w:t>
+      </w:r>
+    </w:p>
+    <w:p>
+      <w:pPr>
+        <w:numPr>
+          <w:ilvl w:val="0"/>
+          <w:numId w:val="11"/>
+        </w:numPr>
+      </w:pPr>
+      <w:r>
+        <w:t>[</w:t>
+      </w:r>
+      <w:proofErr w:type="gramStart"/>
+      <w:r>
+        <w:t>container_structure.md](</w:t>
+      </w:r>
+      <w:proofErr w:type="gramEnd"/>
+      <w:r>
+        <w:t>C:\\git\\cheongnyeon-alimi\\docs\\architecture\\container_structure.md)</w:t>
+      </w:r>
+    </w:p>
+    <w:p>
+      <w:pPr>
+        <w:numPr>
+          <w:ilvl w:val="0"/>
+          <w:numId w:val="11"/>
+        </w:numPr>
+      </w:pPr>
+      <w:r>
+        <w:t>[</w:t>
+      </w:r>
+      <w:proofErr w:type="gramStart"/>
+      <w:r>
+        <w:t>decisions/README.md](</w:t>
+      </w:r>
+      <w:proofErr w:type="gramEnd"/>
+      <w:r>
+        <w:t>C:\\git\\cheongnyeon-alimi\\docs\\architecture\\decisions\\README.md)</w:t>
+      </w:r>
+    </w:p>
+    <w:p>
+      <w:r>
+        <w:lastRenderedPageBreak/>
+        <w:t>함께 갱신한 문서:</w:t>
+      </w:r>
+    </w:p>
+    <w:p>
+      <w:pPr>
+        <w:numPr>
+          <w:ilvl w:val="0"/>
+          <w:numId w:val="12"/>
+        </w:numPr>
+      </w:pPr>
+      <w:r>
+        <w:t>docs/architecture/README.md</w:t>
+      </w:r>
+    </w:p>
+    <w:p>
+      <w:pPr>
+        <w:numPr>
+          <w:ilvl w:val="0"/>
+          <w:numId w:val="12"/>
+        </w:numPr>
+      </w:pPr>
+      <w:r>
+        <w:t>docs/index.md</w:t>
+      </w:r>
+    </w:p>
+    <w:p>
+      <w:pPr>
+        <w:numPr>
+          <w:ilvl w:val="0"/>
+          <w:numId w:val="12"/>
+        </w:numPr>
+      </w:pPr>
+      <w:r>
+        <w:t>CHANGELOG.md</w:t>
+      </w:r>
+    </w:p>
+    <w:p>
+      <w:pPr>
+        <w:numPr>
+          <w:ilvl w:val="0"/>
+          <w:numId w:val="12"/>
+        </w:numPr>
+      </w:pPr>
+      <w:r>
+        <w:t>docs/development/development_notes.md</w:t>
+      </w:r>
+    </w:p>
+    <w:p>
+      <w:r>
+        <w:t>핵심 결정:</w:t>
+      </w:r>
+    </w:p>
+    <w:p>
+      <w:pPr>
+        <w:numPr>
+          <w:ilvl w:val="0"/>
+          <w:numId w:val="13"/>
+        </w:numPr>
+      </w:pPr>
+      <w:proofErr w:type="spellStart"/>
+      <w:r>
+        <w:t>Collector·Extractor·Normalizer·Validator</w:t>
+      </w:r>
+      <w:proofErr w:type="spellEnd"/>
+      <w:r>
+        <w:t>의 책임 분리</w:t>
+      </w:r>
+    </w:p>
+    <w:p>
+      <w:pPr>
+        <w:numPr>
+          <w:ilvl w:val="0"/>
+          <w:numId w:val="13"/>
+        </w:numPr>
+      </w:pPr>
+      <w:r>
+        <w:t>JSON Schema를 팀 간 논리적 데이터 계약으로 정의</w:t>
+      </w:r>
+    </w:p>
+    <w:p>
+      <w:pPr>
+        <w:numPr>
+          <w:ilvl w:val="0"/>
+          <w:numId w:val="13"/>
+        </w:numPr>
+      </w:pPr>
+      <w:r>
+        <w:t>실제 Raw 데이터는 Git에서 제외</w:t>
+      </w:r>
+    </w:p>
+    <w:p>
+      <w:pPr>
+        <w:numPr>
+          <w:ilvl w:val="0"/>
+          <w:numId w:val="13"/>
+        </w:numPr>
+      </w:pPr>
+      <w:r>
+        <w:t>초기 컨테이너는 frontend, backend, database로 제한</w:t>
+      </w:r>
+    </w:p>
+    <w:p>
+      <w:pPr>
+        <w:numPr>
+          <w:ilvl w:val="0"/>
+          <w:numId w:val="13"/>
+        </w:numPr>
+      </w:pPr>
+      <w:proofErr w:type="spellStart"/>
+      <w:r>
+        <w:t>Collector·Scheduler</w:t>
+      </w:r>
+      <w:proofErr w:type="spellEnd"/>
+      <w:r>
+        <w:t xml:space="preserve"> 분리는 필요 조건이 생겼을 때 ADR로 검토</w:t>
+      </w:r>
+    </w:p>
+    <w:p>
+      <w:pPr>
+        <w:numPr>
+          <w:ilvl w:val="0"/>
+          <w:numId w:val="13"/>
+        </w:numPr>
+      </w:pPr>
+      <w:r>
+        <w:t xml:space="preserve">목표 아키텍처와 현재 </w:t>
+      </w:r>
+      <w:proofErr w:type="spellStart"/>
+      <w:r>
+        <w:t>미구현</w:t>
+      </w:r>
+      <w:proofErr w:type="spellEnd"/>
+      <w:r>
+        <w:t xml:space="preserve"> 상태를 명확하게 구분</w:t>
+      </w:r>
+    </w:p>
+    <w:p>
+      <w:r>
+        <w:t>검증 결과:</w:t>
+      </w:r>
+    </w:p>
+    <w:p>
+      <w:pPr>
+        <w:numPr>
+          <w:ilvl w:val="0"/>
+          <w:numId w:val="14"/>
+        </w:numPr>
+      </w:pPr>
+      <w:r>
+        <w:t>Markdown 링크 정상</w:t>
+      </w:r>
+    </w:p>
+    <w:p>
+      <w:pPr>
+        <w:numPr>
+          <w:ilvl w:val="0"/>
+          <w:numId w:val="14"/>
+        </w:numPr>
+      </w:pPr>
+      <w:r>
+        <w:t>D3 필수 산출물 모두 존재</w:t>
+      </w:r>
+    </w:p>
+    <w:p>
+      <w:pPr>
+        <w:numPr>
+          <w:ilvl w:val="0"/>
+          <w:numId w:val="14"/>
+        </w:numPr>
+      </w:pPr>
+      <w:r>
+        <w:t>네 문서의 공통 용어와 파이프라인 순서 일치</w:t>
+      </w:r>
+    </w:p>
+    <w:p>
+      <w:pPr>
+        <w:numPr>
+          <w:ilvl w:val="0"/>
+          <w:numId w:val="14"/>
+        </w:numPr>
+      </w:pPr>
+      <w:r>
+        <w:t>목표 구조와 현재 구현 상태 구분 확인</w:t>
+      </w:r>
+    </w:p>
+    <w:p>
+      <w:pPr>
+        <w:numPr>
+          <w:ilvl w:val="0"/>
+          <w:numId w:val="14"/>
+        </w:numPr>
+      </w:pPr>
+      <w:r>
+        <w:t>빈 파일·빈 docs 디렉터리 없음</w:t>
+      </w:r>
+    </w:p>
+    <w:p>
+      <w:pPr>
+        <w:numPr>
+          <w:ilvl w:val="0"/>
+          <w:numId w:val="14"/>
+        </w:numPr>
+      </w:pPr>
+      <w:proofErr w:type="spellStart"/>
+      <w:r>
+        <w:t>opensource_</w:t>
+      </w:r>
+      <w:proofErr w:type="gramStart"/>
+      <w:r>
+        <w:t>plan</w:t>
+      </w:r>
+      <w:proofErr w:type="spellEnd"/>
+      <w:r>
+        <w:t>/ 변경</w:t>
+      </w:r>
+      <w:proofErr w:type="gramEnd"/>
+      <w:r>
+        <w:t xml:space="preserve"> 없음</w:t>
+      </w:r>
+    </w:p>
+    <w:p>
+      <w:pPr>
+        <w:numPr>
+          <w:ilvl w:val="0"/>
+          <w:numId w:val="14"/>
+        </w:numPr>
+      </w:pPr>
+      <w:r>
+        <w:t>git diff --check 통과</w:t>
+      </w:r>
+    </w:p>
+    <w:p>
+      <w:pPr>
+        <w:numPr>
+          <w:ilvl w:val="0"/>
+          <w:numId w:val="14"/>
+        </w:numPr>
+      </w:pPr>
+      <w:r>
+        <w:t>임시 파일 없음</w:t>
+      </w:r>
+    </w:p>
+    <w:p>
+      <w:r>
+        <w:t>간단한 코드 리뷰: 차단할 문제는 없습니다. 특히 Collector를 독립 모듈로 유지하면서 초기부터 별도 컨테이너를 만들지 않아 구조적 분리와 운영 복잡도 사이의 균형이 맞습니다. 컨테이너 구조는 아직 구현되지 않았다는 표시도 전 문서에 일관되게 적용했습니다.</w:t>
+      </w:r>
+    </w:p>
+    <w:p>
+      <w:r>
+        <w:t xml:space="preserve">권장 </w:t>
+      </w:r>
+      <w:proofErr w:type="spellStart"/>
+      <w:r>
+        <w:t>커밋</w:t>
+      </w:r>
+      <w:proofErr w:type="spellEnd"/>
+      <w:r>
+        <w:t xml:space="preserve"> 메시지:</w:t>
+      </w:r>
+    </w:p>
+    <w:p>
+      <w:r>
+        <w:t>docs(architecture): define system architecture baseline</w:t>
+      </w:r>
+    </w:p>
+    <w:p>
+      <w:r>
+        <w:rPr>
+          <w:rFonts w:hint="eastAsia"/>
+        </w:rPr>
+        <w:lastRenderedPageBreak/>
+        <w:t>5.</w:t>
       </w:r>
     </w:p>
     <w:p>
@@ -1338,6 +2042,453 @@
 <file path=word/numbering.xml><?xml version="1.0" encoding="utf-8"?>
 <w:numbering xmlns:wpc="http://schemas.microsoft.com/office/word/2010/wordprocessingCanvas" xmlns:cx="http://schemas.microsoft.com/office/drawing/2014/chartex" xmlns:cx1="http://schemas.microsoft.com/office/drawing/2015/9/8/chartex" xmlns:cx2="http://schemas.microsoft.com/office/drawing/2015/10/21/chartex" xmlns:cx3="http://schemas.microsoft.com/office/drawing/2016/5/9/chartex" xmlns:cx4="http://schemas.microsoft.com/office/drawing/2016/5/10/chartex" xmlns:cx5="http://schemas.microsoft.com/office/drawing/2016/5/11/chartex" xmlns:cx6="http://schemas.microsoft.com/office/drawing/2016/5/12/chartex" xmlns:cx7="http://schemas.microsoft.com/office/drawing/2016/5/13/chartex" xmlns:cx8="http://schemas.microsoft.com/office/drawing/2016/5/14/chartex" xmlns:mc="http://schemas.openxmlformats.org/markup-compatibility/2006" xmlns:aink="http://schemas.microsoft.com/office/drawing/2016/ink" xmlns:am3d="http://schemas.microsoft.com/office/drawing/2017/model3d" xmlns:o="urn:schemas-microsoft-com:office:office" xmlns:oel="http://schemas.microsoft.com/office/2019/extlst" xmlns:r="http://schemas.openxmlformats.org/officeDocument/2006/relationships" xmlns:m="http://schemas.openxmlformats.org/officeDocument/2006/math" xmlns:v="urn:schemas-microsoft-com:vml" xmlns:wp14="http://schemas.microsoft.com/office/word/2010/wordprocessingDrawing" xmlns:wp="http://schemas.openxmlformats.org/drawingml/2006/wordprocessingDrawing" xmlns:w10="urn:schemas-microsoft-com:office:word" xmlns:w="http://schemas.openxmlformats.org/wordprocessingml/2006/main" xmlns:w14="http://schemas.microsoft.com/office/word/2010/wordml" xmlns:w15="http://schemas.microsoft.com/office/word/2012/wordml" xmlns:w16cex="http://schemas.microsoft.com/office/word/2018/wordml/cex" xmlns:w16cid="http://schemas.microsoft.com/office/word/2016/wordml/cid" xmlns:w16="http://schemas.microsoft.com/office/word/2018/wordml" xmlns:w16sdtdh="http://schemas.microsoft.com/office/word/2020/wordml/sdtdatahash" xmlns:w16se="http://schemas.microsoft.com/office/word/2015/wordml/symex" xmlns:wpg="http://schemas.microsoft.com/office/word/2010/wordprocessingGroup" xmlns:wpi="http://schemas.microsoft.com/office/word/2010/wordprocessingInk" xmlns:wne="http://schemas.microsoft.com/office/word/2006/wordml" xmlns:wps="http://schemas.microsoft.com/office/word/2010/wordprocessingShape" mc:Ignorable="w14 w15 w16se w16cid w16 w16cex w16sdtdh wp14">
   <w:abstractNum w:abstractNumId="0" w15:restartNumberingAfterBreak="0">
+    <w:nsid w:val="085C5711"/>
+    <w:multiLevelType w:val="multilevel"/>
+    <w:tmpl w:val="E356ECB6"/>
+    <w:lvl w:ilvl="0">
+      <w:start w:val="1"/>
+      <w:numFmt w:val="bullet"/>
+      <w:lvlText w:val=""/>
+      <w:lvlJc w:val="left"/>
+      <w:pPr>
+        <w:tabs>
+          <w:tab w:val="num" w:pos="720"/>
+        </w:tabs>
+        <w:ind w:left="720" w:hanging="360"/>
+      </w:pPr>
+      <w:rPr>
+        <w:rFonts w:ascii="Symbol" w:hAnsi="Symbol" w:hint="default"/>
+        <w:sz w:val="20"/>
+      </w:rPr>
+    </w:lvl>
+    <w:lvl w:ilvl="1" w:tentative="1">
+      <w:start w:val="1"/>
+      <w:numFmt w:val="bullet"/>
+      <w:lvlText w:val="o"/>
+      <w:lvlJc w:val="left"/>
+      <w:pPr>
+        <w:tabs>
+          <w:tab w:val="num" w:pos="1440"/>
+        </w:tabs>
+        <w:ind w:left="1440" w:hanging="360"/>
+      </w:pPr>
+      <w:rPr>
+        <w:rFonts w:ascii="Courier New" w:hAnsi="Courier New" w:hint="default"/>
+        <w:sz w:val="20"/>
+      </w:rPr>
+    </w:lvl>
+    <w:lvl w:ilvl="2" w:tentative="1">
+      <w:start w:val="1"/>
+      <w:numFmt w:val="bullet"/>
+      <w:lvlText w:val=""/>
+      <w:lvlJc w:val="left"/>
+      <w:pPr>
+        <w:tabs>
+          <w:tab w:val="num" w:pos="2160"/>
+        </w:tabs>
+        <w:ind w:left="2160" w:hanging="360"/>
+      </w:pPr>
+      <w:rPr>
+        <w:rFonts w:ascii="Wingdings" w:hAnsi="Wingdings" w:hint="default"/>
+        <w:sz w:val="20"/>
+      </w:rPr>
+    </w:lvl>
+    <w:lvl w:ilvl="3" w:tentative="1">
+      <w:start w:val="1"/>
+      <w:numFmt w:val="bullet"/>
+      <w:lvlText w:val=""/>
+      <w:lvlJc w:val="left"/>
+      <w:pPr>
+        <w:tabs>
+          <w:tab w:val="num" w:pos="2880"/>
+        </w:tabs>
+        <w:ind w:left="2880" w:hanging="360"/>
+      </w:pPr>
+      <w:rPr>
+        <w:rFonts w:ascii="Wingdings" w:hAnsi="Wingdings" w:hint="default"/>
+        <w:sz w:val="20"/>
+      </w:rPr>
+    </w:lvl>
+    <w:lvl w:ilvl="4" w:tentative="1">
+      <w:start w:val="1"/>
+      <w:numFmt w:val="bullet"/>
+      <w:lvlText w:val=""/>
+      <w:lvlJc w:val="left"/>
+      <w:pPr>
+        <w:tabs>
+          <w:tab w:val="num" w:pos="3600"/>
+        </w:tabs>
+        <w:ind w:left="3600" w:hanging="360"/>
+      </w:pPr>
+      <w:rPr>
+        <w:rFonts w:ascii="Wingdings" w:hAnsi="Wingdings" w:hint="default"/>
+        <w:sz w:val="20"/>
+      </w:rPr>
+    </w:lvl>
+    <w:lvl w:ilvl="5" w:tentative="1">
+      <w:start w:val="1"/>
+      <w:numFmt w:val="bullet"/>
+      <w:lvlText w:val=""/>
+      <w:lvlJc w:val="left"/>
+      <w:pPr>
+        <w:tabs>
+          <w:tab w:val="num" w:pos="4320"/>
+        </w:tabs>
+        <w:ind w:left="4320" w:hanging="360"/>
+      </w:pPr>
+      <w:rPr>
+        <w:rFonts w:ascii="Wingdings" w:hAnsi="Wingdings" w:hint="default"/>
+        <w:sz w:val="20"/>
+      </w:rPr>
+    </w:lvl>
+    <w:lvl w:ilvl="6" w:tentative="1">
+      <w:start w:val="1"/>
+      <w:numFmt w:val="bullet"/>
+      <w:lvlText w:val=""/>
+      <w:lvlJc w:val="left"/>
+      <w:pPr>
+        <w:tabs>
+          <w:tab w:val="num" w:pos="5040"/>
+        </w:tabs>
+        <w:ind w:left="5040" w:hanging="360"/>
+      </w:pPr>
+      <w:rPr>
+        <w:rFonts w:ascii="Wingdings" w:hAnsi="Wingdings" w:hint="default"/>
+        <w:sz w:val="20"/>
+      </w:rPr>
+    </w:lvl>
+    <w:lvl w:ilvl="7" w:tentative="1">
+      <w:start w:val="1"/>
+      <w:numFmt w:val="bullet"/>
+      <w:lvlText w:val=""/>
+      <w:lvlJc w:val="left"/>
+      <w:pPr>
+        <w:tabs>
+          <w:tab w:val="num" w:pos="5760"/>
+        </w:tabs>
+        <w:ind w:left="5760" w:hanging="360"/>
+      </w:pPr>
+      <w:rPr>
+        <w:rFonts w:ascii="Wingdings" w:hAnsi="Wingdings" w:hint="default"/>
+        <w:sz w:val="20"/>
+      </w:rPr>
+    </w:lvl>
+    <w:lvl w:ilvl="8" w:tentative="1">
+      <w:start w:val="1"/>
+      <w:numFmt w:val="bullet"/>
+      <w:lvlText w:val=""/>
+      <w:lvlJc w:val="left"/>
+      <w:pPr>
+        <w:tabs>
+          <w:tab w:val="num" w:pos="6480"/>
+        </w:tabs>
+        <w:ind w:left="6480" w:hanging="360"/>
+      </w:pPr>
+      <w:rPr>
+        <w:rFonts w:ascii="Wingdings" w:hAnsi="Wingdings" w:hint="default"/>
+        <w:sz w:val="20"/>
+      </w:rPr>
+    </w:lvl>
+  </w:abstractNum>
+  <w:abstractNum w:abstractNumId="1" w15:restartNumberingAfterBreak="0">
+    <w:nsid w:val="1FDF5752"/>
+    <w:multiLevelType w:val="multilevel"/>
+    <w:tmpl w:val="79949B0C"/>
+    <w:lvl w:ilvl="0">
+      <w:start w:val="1"/>
+      <w:numFmt w:val="bullet"/>
+      <w:lvlText w:val=""/>
+      <w:lvlJc w:val="left"/>
+      <w:pPr>
+        <w:tabs>
+          <w:tab w:val="num" w:pos="720"/>
+        </w:tabs>
+        <w:ind w:left="720" w:hanging="360"/>
+      </w:pPr>
+      <w:rPr>
+        <w:rFonts w:ascii="Symbol" w:hAnsi="Symbol" w:hint="default"/>
+        <w:sz w:val="20"/>
+      </w:rPr>
+    </w:lvl>
+    <w:lvl w:ilvl="1" w:tentative="1">
+      <w:start w:val="1"/>
+      <w:numFmt w:val="bullet"/>
+      <w:lvlText w:val="o"/>
+      <w:lvlJc w:val="left"/>
+      <w:pPr>
+        <w:tabs>
+          <w:tab w:val="num" w:pos="1440"/>
+        </w:tabs>
+        <w:ind w:left="1440" w:hanging="360"/>
+      </w:pPr>
+      <w:rPr>
+        <w:rFonts w:ascii="Courier New" w:hAnsi="Courier New" w:hint="default"/>
+        <w:sz w:val="20"/>
+      </w:rPr>
+    </w:lvl>
+    <w:lvl w:ilvl="2" w:tentative="1">
+      <w:start w:val="1"/>
+      <w:numFmt w:val="bullet"/>
+      <w:lvlText w:val=""/>
+      <w:lvlJc w:val="left"/>
+      <w:pPr>
+        <w:tabs>
+          <w:tab w:val="num" w:pos="2160"/>
+        </w:tabs>
+        <w:ind w:left="2160" w:hanging="360"/>
+      </w:pPr>
+      <w:rPr>
+        <w:rFonts w:ascii="Wingdings" w:hAnsi="Wingdings" w:hint="default"/>
+        <w:sz w:val="20"/>
+      </w:rPr>
+    </w:lvl>
+    <w:lvl w:ilvl="3" w:tentative="1">
+      <w:start w:val="1"/>
+      <w:numFmt w:val="bullet"/>
+      <w:lvlText w:val=""/>
+      <w:lvlJc w:val="left"/>
+      <w:pPr>
+        <w:tabs>
+          <w:tab w:val="num" w:pos="2880"/>
+        </w:tabs>
+        <w:ind w:left="2880" w:hanging="360"/>
+      </w:pPr>
+      <w:rPr>
+        <w:rFonts w:ascii="Wingdings" w:hAnsi="Wingdings" w:hint="default"/>
+        <w:sz w:val="20"/>
+      </w:rPr>
+    </w:lvl>
+    <w:lvl w:ilvl="4" w:tentative="1">
+      <w:start w:val="1"/>
+      <w:numFmt w:val="bullet"/>
+      <w:lvlText w:val=""/>
+      <w:lvlJc w:val="left"/>
+      <w:pPr>
+        <w:tabs>
+          <w:tab w:val="num" w:pos="3600"/>
+        </w:tabs>
+        <w:ind w:left="3600" w:hanging="360"/>
+      </w:pPr>
+      <w:rPr>
+        <w:rFonts w:ascii="Wingdings" w:hAnsi="Wingdings" w:hint="default"/>
+        <w:sz w:val="20"/>
+      </w:rPr>
+    </w:lvl>
+    <w:lvl w:ilvl="5" w:tentative="1">
+      <w:start w:val="1"/>
+      <w:numFmt w:val="bullet"/>
+      <w:lvlText w:val=""/>
+      <w:lvlJc w:val="left"/>
+      <w:pPr>
+        <w:tabs>
+          <w:tab w:val="num" w:pos="4320"/>
+        </w:tabs>
+        <w:ind w:left="4320" w:hanging="360"/>
+      </w:pPr>
+      <w:rPr>
+        <w:rFonts w:ascii="Wingdings" w:hAnsi="Wingdings" w:hint="default"/>
+        <w:sz w:val="20"/>
+      </w:rPr>
+    </w:lvl>
+    <w:lvl w:ilvl="6" w:tentative="1">
+      <w:start w:val="1"/>
+      <w:numFmt w:val="bullet"/>
+      <w:lvlText w:val=""/>
+      <w:lvlJc w:val="left"/>
+      <w:pPr>
+        <w:tabs>
+          <w:tab w:val="num" w:pos="5040"/>
+        </w:tabs>
+        <w:ind w:left="5040" w:hanging="360"/>
+      </w:pPr>
+      <w:rPr>
+        <w:rFonts w:ascii="Wingdings" w:hAnsi="Wingdings" w:hint="default"/>
+        <w:sz w:val="20"/>
+      </w:rPr>
+    </w:lvl>
+    <w:lvl w:ilvl="7" w:tentative="1">
+      <w:start w:val="1"/>
+      <w:numFmt w:val="bullet"/>
+      <w:lvlText w:val=""/>
+      <w:lvlJc w:val="left"/>
+      <w:pPr>
+        <w:tabs>
+          <w:tab w:val="num" w:pos="5760"/>
+        </w:tabs>
+        <w:ind w:left="5760" w:hanging="360"/>
+      </w:pPr>
+      <w:rPr>
+        <w:rFonts w:ascii="Wingdings" w:hAnsi="Wingdings" w:hint="default"/>
+        <w:sz w:val="20"/>
+      </w:rPr>
+    </w:lvl>
+    <w:lvl w:ilvl="8" w:tentative="1">
+      <w:start w:val="1"/>
+      <w:numFmt w:val="bullet"/>
+      <w:lvlText w:val=""/>
+      <w:lvlJc w:val="left"/>
+      <w:pPr>
+        <w:tabs>
+          <w:tab w:val="num" w:pos="6480"/>
+        </w:tabs>
+        <w:ind w:left="6480" w:hanging="360"/>
+      </w:pPr>
+      <w:rPr>
+        <w:rFonts w:ascii="Wingdings" w:hAnsi="Wingdings" w:hint="default"/>
+        <w:sz w:val="20"/>
+      </w:rPr>
+    </w:lvl>
+  </w:abstractNum>
+  <w:abstractNum w:abstractNumId="2" w15:restartNumberingAfterBreak="0">
+    <w:nsid w:val="221C3F36"/>
+    <w:multiLevelType w:val="multilevel"/>
+    <w:tmpl w:val="76284016"/>
+    <w:lvl w:ilvl="0">
+      <w:start w:val="1"/>
+      <w:numFmt w:val="bullet"/>
+      <w:lvlText w:val=""/>
+      <w:lvlJc w:val="left"/>
+      <w:pPr>
+        <w:tabs>
+          <w:tab w:val="num" w:pos="720"/>
+        </w:tabs>
+        <w:ind w:left="720" w:hanging="360"/>
+      </w:pPr>
+      <w:rPr>
+        <w:rFonts w:ascii="Symbol" w:hAnsi="Symbol" w:hint="default"/>
+        <w:sz w:val="20"/>
+      </w:rPr>
+    </w:lvl>
+    <w:lvl w:ilvl="1" w:tentative="1">
+      <w:start w:val="1"/>
+      <w:numFmt w:val="bullet"/>
+      <w:lvlText w:val="o"/>
+      <w:lvlJc w:val="left"/>
+      <w:pPr>
+        <w:tabs>
+          <w:tab w:val="num" w:pos="1440"/>
+        </w:tabs>
+        <w:ind w:left="1440" w:hanging="360"/>
+      </w:pPr>
+      <w:rPr>
+        <w:rFonts w:ascii="Courier New" w:hAnsi="Courier New" w:hint="default"/>
+        <w:sz w:val="20"/>
+      </w:rPr>
+    </w:lvl>
+    <w:lvl w:ilvl="2" w:tentative="1">
+      <w:start w:val="1"/>
+      <w:numFmt w:val="bullet"/>
+      <w:lvlText w:val=""/>
+      <w:lvlJc w:val="left"/>
+      <w:pPr>
+        <w:tabs>
+          <w:tab w:val="num" w:pos="2160"/>
+        </w:tabs>
+        <w:ind w:left="2160" w:hanging="360"/>
+      </w:pPr>
+      <w:rPr>
+        <w:rFonts w:ascii="Wingdings" w:hAnsi="Wingdings" w:hint="default"/>
+        <w:sz w:val="20"/>
+      </w:rPr>
+    </w:lvl>
+    <w:lvl w:ilvl="3" w:tentative="1">
+      <w:start w:val="1"/>
+      <w:numFmt w:val="bullet"/>
+      <w:lvlText w:val=""/>
+      <w:lvlJc w:val="left"/>
+      <w:pPr>
+        <w:tabs>
+          <w:tab w:val="num" w:pos="2880"/>
+        </w:tabs>
+        <w:ind w:left="2880" w:hanging="360"/>
+      </w:pPr>
+      <w:rPr>
+        <w:rFonts w:ascii="Wingdings" w:hAnsi="Wingdings" w:hint="default"/>
+        <w:sz w:val="20"/>
+      </w:rPr>
+    </w:lvl>
+    <w:lvl w:ilvl="4" w:tentative="1">
+      <w:start w:val="1"/>
+      <w:numFmt w:val="bullet"/>
+      <w:lvlText w:val=""/>
+      <w:lvlJc w:val="left"/>
+      <w:pPr>
+        <w:tabs>
+          <w:tab w:val="num" w:pos="3600"/>
+        </w:tabs>
+        <w:ind w:left="3600" w:hanging="360"/>
+      </w:pPr>
+      <w:rPr>
+        <w:rFonts w:ascii="Wingdings" w:hAnsi="Wingdings" w:hint="default"/>
+        <w:sz w:val="20"/>
+      </w:rPr>
+    </w:lvl>
+    <w:lvl w:ilvl="5" w:tentative="1">
+      <w:start w:val="1"/>
+      <w:numFmt w:val="bullet"/>
+      <w:lvlText w:val=""/>
+      <w:lvlJc w:val="left"/>
+      <w:pPr>
+        <w:tabs>
+          <w:tab w:val="num" w:pos="4320"/>
+        </w:tabs>
+        <w:ind w:left="4320" w:hanging="360"/>
+      </w:pPr>
+      <w:rPr>
+        <w:rFonts w:ascii="Wingdings" w:hAnsi="Wingdings" w:hint="default"/>
+        <w:sz w:val="20"/>
+      </w:rPr>
+    </w:lvl>
+    <w:lvl w:ilvl="6" w:tentative="1">
+      <w:start w:val="1"/>
+      <w:numFmt w:val="bullet"/>
+      <w:lvlText w:val=""/>
+      <w:lvlJc w:val="left"/>
+      <w:pPr>
+        <w:tabs>
+          <w:tab w:val="num" w:pos="5040"/>
+        </w:tabs>
+        <w:ind w:left="5040" w:hanging="360"/>
+      </w:pPr>
+      <w:rPr>
+        <w:rFonts w:ascii="Wingdings" w:hAnsi="Wingdings" w:hint="default"/>
+        <w:sz w:val="20"/>
+      </w:rPr>
+    </w:lvl>
+    <w:lvl w:ilvl="7" w:tentative="1">
+      <w:start w:val="1"/>
+      <w:numFmt w:val="bullet"/>
+      <w:lvlText w:val=""/>
+      <w:lvlJc w:val="left"/>
+      <w:pPr>
+        <w:tabs>
+          <w:tab w:val="num" w:pos="5760"/>
+        </w:tabs>
+        <w:ind w:left="5760" w:hanging="360"/>
+      </w:pPr>
+      <w:rPr>
+        <w:rFonts w:ascii="Wingdings" w:hAnsi="Wingdings" w:hint="default"/>
+        <w:sz w:val="20"/>
+      </w:rPr>
+    </w:lvl>
+    <w:lvl w:ilvl="8" w:tentative="1">
+      <w:start w:val="1"/>
+      <w:numFmt w:val="bullet"/>
+      <w:lvlText w:val=""/>
+      <w:lvlJc w:val="left"/>
+      <w:pPr>
+        <w:tabs>
+          <w:tab w:val="num" w:pos="6480"/>
+        </w:tabs>
+        <w:ind w:left="6480" w:hanging="360"/>
+      </w:pPr>
+      <w:rPr>
+        <w:rFonts w:ascii="Wingdings" w:hAnsi="Wingdings" w:hint="default"/>
+        <w:sz w:val="20"/>
+      </w:rPr>
+    </w:lvl>
+  </w:abstractNum>
+  <w:abstractNum w:abstractNumId="3" w15:restartNumberingAfterBreak="0">
     <w:nsid w:val="27117FFB"/>
     <w:multiLevelType w:val="multilevel"/>
     <w:tmpl w:val="0C5C762E"/>
@@ -1486,7 +2637,7 @@
       </w:rPr>
     </w:lvl>
   </w:abstractNum>
-  <w:abstractNum w:abstractNumId="1" w15:restartNumberingAfterBreak="0">
+  <w:abstractNum w:abstractNumId="4" w15:restartNumberingAfterBreak="0">
     <w:nsid w:val="27965D24"/>
     <w:multiLevelType w:val="multilevel"/>
     <w:tmpl w:val="049899E8"/>
@@ -1635,7 +2786,7 @@
       </w:rPr>
     </w:lvl>
   </w:abstractNum>
-  <w:abstractNum w:abstractNumId="2" w15:restartNumberingAfterBreak="0">
+  <w:abstractNum w:abstractNumId="5" w15:restartNumberingAfterBreak="0">
     <w:nsid w:val="2D5C644F"/>
     <w:multiLevelType w:val="hybridMultilevel"/>
     <w:tmpl w:val="E4CCF9F4"/>
@@ -1724,7 +2875,7 @@
       </w:pPr>
     </w:lvl>
   </w:abstractNum>
-  <w:abstractNum w:abstractNumId="3" w15:restartNumberingAfterBreak="0">
+  <w:abstractNum w:abstractNumId="6" w15:restartNumberingAfterBreak="0">
     <w:nsid w:val="2E54028D"/>
     <w:multiLevelType w:val="multilevel"/>
     <w:tmpl w:val="09369F8E"/>
@@ -1873,7 +3024,7 @@
       </w:rPr>
     </w:lvl>
   </w:abstractNum>
-  <w:abstractNum w:abstractNumId="4" w15:restartNumberingAfterBreak="0">
+  <w:abstractNum w:abstractNumId="7" w15:restartNumberingAfterBreak="0">
     <w:nsid w:val="3E271797"/>
     <w:multiLevelType w:val="multilevel"/>
     <w:tmpl w:val="3E164BD8"/>
@@ -2022,7 +3173,7 @@
       </w:rPr>
     </w:lvl>
   </w:abstractNum>
-  <w:abstractNum w:abstractNumId="5" w15:restartNumberingAfterBreak="0">
+  <w:abstractNum w:abstractNumId="8" w15:restartNumberingAfterBreak="0">
     <w:nsid w:val="3E714592"/>
     <w:multiLevelType w:val="hybridMultilevel"/>
     <w:tmpl w:val="8716DA70"/>
@@ -2111,7 +3262,7 @@
       </w:pPr>
     </w:lvl>
   </w:abstractNum>
-  <w:abstractNum w:abstractNumId="6" w15:restartNumberingAfterBreak="0">
+  <w:abstractNum w:abstractNumId="9" w15:restartNumberingAfterBreak="0">
     <w:nsid w:val="48C167EF"/>
     <w:multiLevelType w:val="multilevel"/>
     <w:tmpl w:val="33B8865A"/>
@@ -2260,7 +3411,156 @@
       </w:rPr>
     </w:lvl>
   </w:abstractNum>
-  <w:abstractNum w:abstractNumId="7" w15:restartNumberingAfterBreak="0">
+  <w:abstractNum w:abstractNumId="10" w15:restartNumberingAfterBreak="0">
+    <w:nsid w:val="5B8F5461"/>
+    <w:multiLevelType w:val="multilevel"/>
+    <w:tmpl w:val="CE3E9F9A"/>
+    <w:lvl w:ilvl="0">
+      <w:start w:val="1"/>
+      <w:numFmt w:val="bullet"/>
+      <w:lvlText w:val=""/>
+      <w:lvlJc w:val="left"/>
+      <w:pPr>
+        <w:tabs>
+          <w:tab w:val="num" w:pos="720"/>
+        </w:tabs>
+        <w:ind w:left="720" w:hanging="360"/>
+      </w:pPr>
+      <w:rPr>
+        <w:rFonts w:ascii="Symbol" w:hAnsi="Symbol" w:hint="default"/>
+        <w:sz w:val="20"/>
+      </w:rPr>
+    </w:lvl>
+    <w:lvl w:ilvl="1" w:tentative="1">
+      <w:start w:val="1"/>
+      <w:numFmt w:val="bullet"/>
+      <w:lvlText w:val="o"/>
+      <w:lvlJc w:val="left"/>
+      <w:pPr>
+        <w:tabs>
+          <w:tab w:val="num" w:pos="1440"/>
+        </w:tabs>
+        <w:ind w:left="1440" w:hanging="360"/>
+      </w:pPr>
+      <w:rPr>
+        <w:rFonts w:ascii="Courier New" w:hAnsi="Courier New" w:hint="default"/>
+        <w:sz w:val="20"/>
+      </w:rPr>
+    </w:lvl>
+    <w:lvl w:ilvl="2" w:tentative="1">
+      <w:start w:val="1"/>
+      <w:numFmt w:val="bullet"/>
+      <w:lvlText w:val=""/>
+      <w:lvlJc w:val="left"/>
+      <w:pPr>
+        <w:tabs>
+          <w:tab w:val="num" w:pos="2160"/>
+        </w:tabs>
+        <w:ind w:left="2160" w:hanging="360"/>
+      </w:pPr>
+      <w:rPr>
+        <w:rFonts w:ascii="Wingdings" w:hAnsi="Wingdings" w:hint="default"/>
+        <w:sz w:val="20"/>
+      </w:rPr>
+    </w:lvl>
+    <w:lvl w:ilvl="3" w:tentative="1">
+      <w:start w:val="1"/>
+      <w:numFmt w:val="bullet"/>
+      <w:lvlText w:val=""/>
+      <w:lvlJc w:val="left"/>
+      <w:pPr>
+        <w:tabs>
+          <w:tab w:val="num" w:pos="2880"/>
+        </w:tabs>
+        <w:ind w:left="2880" w:hanging="360"/>
+      </w:pPr>
+      <w:rPr>
+        <w:rFonts w:ascii="Wingdings" w:hAnsi="Wingdings" w:hint="default"/>
+        <w:sz w:val="20"/>
+      </w:rPr>
+    </w:lvl>
+    <w:lvl w:ilvl="4" w:tentative="1">
+      <w:start w:val="1"/>
+      <w:numFmt w:val="bullet"/>
+      <w:lvlText w:val=""/>
+      <w:lvlJc w:val="left"/>
+      <w:pPr>
+        <w:tabs>
+          <w:tab w:val="num" w:pos="3600"/>
+        </w:tabs>
+        <w:ind w:left="3600" w:hanging="360"/>
+      </w:pPr>
+      <w:rPr>
+        <w:rFonts w:ascii="Wingdings" w:hAnsi="Wingdings" w:hint="default"/>
+        <w:sz w:val="20"/>
+      </w:rPr>
+    </w:lvl>
+    <w:lvl w:ilvl="5" w:tentative="1">
+      <w:start w:val="1"/>
+      <w:numFmt w:val="bullet"/>
+      <w:lvlText w:val=""/>
+      <w:lvlJc w:val="left"/>
+      <w:pPr>
+        <w:tabs>
+          <w:tab w:val="num" w:pos="4320"/>
+        </w:tabs>
+        <w:ind w:left="4320" w:hanging="360"/>
+      </w:pPr>
+      <w:rPr>
+        <w:rFonts w:ascii="Wingdings" w:hAnsi="Wingdings" w:hint="default"/>
+        <w:sz w:val="20"/>
+      </w:rPr>
+    </w:lvl>
+    <w:lvl w:ilvl="6" w:tentative="1">
+      <w:start w:val="1"/>
+      <w:numFmt w:val="bullet"/>
+      <w:lvlText w:val=""/>
+      <w:lvlJc w:val="left"/>
+      <w:pPr>
+        <w:tabs>
+          <w:tab w:val="num" w:pos="5040"/>
+        </w:tabs>
+        <w:ind w:left="5040" w:hanging="360"/>
+      </w:pPr>
+      <w:rPr>
+        <w:rFonts w:ascii="Wingdings" w:hAnsi="Wingdings" w:hint="default"/>
+        <w:sz w:val="20"/>
+      </w:rPr>
+    </w:lvl>
+    <w:lvl w:ilvl="7" w:tentative="1">
+      <w:start w:val="1"/>
+      <w:numFmt w:val="bullet"/>
+      <w:lvlText w:val=""/>
+      <w:lvlJc w:val="left"/>
+      <w:pPr>
+        <w:tabs>
+          <w:tab w:val="num" w:pos="5760"/>
+        </w:tabs>
+        <w:ind w:left="5760" w:hanging="360"/>
+      </w:pPr>
+      <w:rPr>
+        <w:rFonts w:ascii="Wingdings" w:hAnsi="Wingdings" w:hint="default"/>
+        <w:sz w:val="20"/>
+      </w:rPr>
+    </w:lvl>
+    <w:lvl w:ilvl="8" w:tentative="1">
+      <w:start w:val="1"/>
+      <w:numFmt w:val="bullet"/>
+      <w:lvlText w:val=""/>
+      <w:lvlJc w:val="left"/>
+      <w:pPr>
+        <w:tabs>
+          <w:tab w:val="num" w:pos="6480"/>
+        </w:tabs>
+        <w:ind w:left="6480" w:hanging="360"/>
+      </w:pPr>
+      <w:rPr>
+        <w:rFonts w:ascii="Wingdings" w:hAnsi="Wingdings" w:hint="default"/>
+        <w:sz w:val="20"/>
+      </w:rPr>
+    </w:lvl>
+  </w:abstractNum>
+  <w:abstractNum w:abstractNumId="11" w15:restartNumberingAfterBreak="0">
     <w:nsid w:val="67240F69"/>
     <w:multiLevelType w:val="multilevel"/>
     <w:tmpl w:val="A3D83C64"/>
@@ -2409,7 +3709,7 @@
       </w:rPr>
     </w:lvl>
   </w:abstractNum>
-  <w:abstractNum w:abstractNumId="8" w15:restartNumberingAfterBreak="0">
+  <w:abstractNum w:abstractNumId="12" w15:restartNumberingAfterBreak="0">
     <w:nsid w:val="67806DC6"/>
     <w:multiLevelType w:val="multilevel"/>
     <w:tmpl w:val="02025B42"/>
@@ -2558,32 +3858,196 @@
       </w:rPr>
     </w:lvl>
   </w:abstractNum>
+  <w:abstractNum w:abstractNumId="13" w15:restartNumberingAfterBreak="0">
+    <w:nsid w:val="724E6DA3"/>
+    <w:multiLevelType w:val="multilevel"/>
+    <w:tmpl w:val="B374E1A4"/>
+    <w:lvl w:ilvl="0">
+      <w:start w:val="1"/>
+      <w:numFmt w:val="bullet"/>
+      <w:lvlText w:val=""/>
+      <w:lvlJc w:val="left"/>
+      <w:pPr>
+        <w:tabs>
+          <w:tab w:val="num" w:pos="720"/>
+        </w:tabs>
+        <w:ind w:left="720" w:hanging="360"/>
+      </w:pPr>
+      <w:rPr>
+        <w:rFonts w:ascii="Symbol" w:hAnsi="Symbol" w:hint="default"/>
+        <w:sz w:val="20"/>
+      </w:rPr>
+    </w:lvl>
+    <w:lvl w:ilvl="1" w:tentative="1">
+      <w:start w:val="1"/>
+      <w:numFmt w:val="bullet"/>
+      <w:lvlText w:val="o"/>
+      <w:lvlJc w:val="left"/>
+      <w:pPr>
+        <w:tabs>
+          <w:tab w:val="num" w:pos="1440"/>
+        </w:tabs>
+        <w:ind w:left="1440" w:hanging="360"/>
+      </w:pPr>
+      <w:rPr>
+        <w:rFonts w:ascii="Courier New" w:hAnsi="Courier New" w:hint="default"/>
+        <w:sz w:val="20"/>
+      </w:rPr>
+    </w:lvl>
+    <w:lvl w:ilvl="2" w:tentative="1">
+      <w:start w:val="1"/>
+      <w:numFmt w:val="bullet"/>
+      <w:lvlText w:val=""/>
+      <w:lvlJc w:val="left"/>
+      <w:pPr>
+        <w:tabs>
+          <w:tab w:val="num" w:pos="2160"/>
+        </w:tabs>
+        <w:ind w:left="2160" w:hanging="360"/>
+      </w:pPr>
+      <w:rPr>
+        <w:rFonts w:ascii="Wingdings" w:hAnsi="Wingdings" w:hint="default"/>
+        <w:sz w:val="20"/>
+      </w:rPr>
+    </w:lvl>
+    <w:lvl w:ilvl="3" w:tentative="1">
+      <w:start w:val="1"/>
+      <w:numFmt w:val="bullet"/>
+      <w:lvlText w:val=""/>
+      <w:lvlJc w:val="left"/>
+      <w:pPr>
+        <w:tabs>
+          <w:tab w:val="num" w:pos="2880"/>
+        </w:tabs>
+        <w:ind w:left="2880" w:hanging="360"/>
+      </w:pPr>
+      <w:rPr>
+        <w:rFonts w:ascii="Wingdings" w:hAnsi="Wingdings" w:hint="default"/>
+        <w:sz w:val="20"/>
+      </w:rPr>
+    </w:lvl>
+    <w:lvl w:ilvl="4" w:tentative="1">
+      <w:start w:val="1"/>
+      <w:numFmt w:val="bullet"/>
+      <w:lvlText w:val=""/>
+      <w:lvlJc w:val="left"/>
+      <w:pPr>
+        <w:tabs>
+          <w:tab w:val="num" w:pos="3600"/>
+        </w:tabs>
+        <w:ind w:left="3600" w:hanging="360"/>
+      </w:pPr>
+      <w:rPr>
+        <w:rFonts w:ascii="Wingdings" w:hAnsi="Wingdings" w:hint="default"/>
+        <w:sz w:val="20"/>
+      </w:rPr>
+    </w:lvl>
+    <w:lvl w:ilvl="5" w:tentative="1">
+      <w:start w:val="1"/>
+      <w:numFmt w:val="bullet"/>
+      <w:lvlText w:val=""/>
+      <w:lvlJc w:val="left"/>
+      <w:pPr>
+        <w:tabs>
+          <w:tab w:val="num" w:pos="4320"/>
+        </w:tabs>
+        <w:ind w:left="4320" w:hanging="360"/>
+      </w:pPr>
+      <w:rPr>
+        <w:rFonts w:ascii="Wingdings" w:hAnsi="Wingdings" w:hint="default"/>
+        <w:sz w:val="20"/>
+      </w:rPr>
+    </w:lvl>
+    <w:lvl w:ilvl="6" w:tentative="1">
+      <w:start w:val="1"/>
+      <w:numFmt w:val="bullet"/>
+      <w:lvlText w:val=""/>
+      <w:lvlJc w:val="left"/>
+      <w:pPr>
+        <w:tabs>
+          <w:tab w:val="num" w:pos="5040"/>
+        </w:tabs>
+        <w:ind w:left="5040" w:hanging="360"/>
+      </w:pPr>
+      <w:rPr>
+        <w:rFonts w:ascii="Wingdings" w:hAnsi="Wingdings" w:hint="default"/>
+        <w:sz w:val="20"/>
+      </w:rPr>
+    </w:lvl>
+    <w:lvl w:ilvl="7" w:tentative="1">
+      <w:start w:val="1"/>
+      <w:numFmt w:val="bullet"/>
+      <w:lvlText w:val=""/>
+      <w:lvlJc w:val="left"/>
+      <w:pPr>
+        <w:tabs>
+          <w:tab w:val="num" w:pos="5760"/>
+        </w:tabs>
+        <w:ind w:left="5760" w:hanging="360"/>
+      </w:pPr>
+      <w:rPr>
+        <w:rFonts w:ascii="Wingdings" w:hAnsi="Wingdings" w:hint="default"/>
+        <w:sz w:val="20"/>
+      </w:rPr>
+    </w:lvl>
+    <w:lvl w:ilvl="8" w:tentative="1">
+      <w:start w:val="1"/>
+      <w:numFmt w:val="bullet"/>
+      <w:lvlText w:val=""/>
+      <w:lvlJc w:val="left"/>
+      <w:pPr>
+        <w:tabs>
+          <w:tab w:val="num" w:pos="6480"/>
+        </w:tabs>
+        <w:ind w:left="6480" w:hanging="360"/>
+      </w:pPr>
+      <w:rPr>
+        <w:rFonts w:ascii="Wingdings" w:hAnsi="Wingdings" w:hint="default"/>
+        <w:sz w:val="20"/>
+      </w:rPr>
+    </w:lvl>
+  </w:abstractNum>
   <w:num w:numId="1" w16cid:durableId="813789872">
+    <w:abstractNumId w:val="5"/>
+  </w:num>
+  <w:num w:numId="2" w16cid:durableId="218054268">
+    <w:abstractNumId w:val="8"/>
+  </w:num>
+  <w:num w:numId="3" w16cid:durableId="773482401">
+    <w:abstractNumId w:val="3"/>
+  </w:num>
+  <w:num w:numId="4" w16cid:durableId="1227841907">
+    <w:abstractNumId w:val="9"/>
+  </w:num>
+  <w:num w:numId="5" w16cid:durableId="87775347">
+    <w:abstractNumId w:val="7"/>
+  </w:num>
+  <w:num w:numId="6" w16cid:durableId="1280914734">
+    <w:abstractNumId w:val="6"/>
+  </w:num>
+  <w:num w:numId="7" w16cid:durableId="586039891">
+    <w:abstractNumId w:val="11"/>
+  </w:num>
+  <w:num w:numId="8" w16cid:durableId="1771202012">
+    <w:abstractNumId w:val="4"/>
+  </w:num>
+  <w:num w:numId="9" w16cid:durableId="900680235">
+    <w:abstractNumId w:val="12"/>
+  </w:num>
+  <w:num w:numId="10" w16cid:durableId="1596590889">
+    <w:abstractNumId w:val="1"/>
+  </w:num>
+  <w:num w:numId="11" w16cid:durableId="969483552">
+    <w:abstractNumId w:val="10"/>
+  </w:num>
+  <w:num w:numId="12" w16cid:durableId="1125592">
+    <w:abstractNumId w:val="13"/>
+  </w:num>
+  <w:num w:numId="13" w16cid:durableId="1858687678">
     <w:abstractNumId w:val="2"/>
   </w:num>
-  <w:num w:numId="2" w16cid:durableId="218054268">
-    <w:abstractNumId w:val="5"/>
-  </w:num>
-  <w:num w:numId="3" w16cid:durableId="773482401">
+  <w:num w:numId="14" w16cid:durableId="1161384303">
     <w:abstractNumId w:val="0"/>
-  </w:num>
-  <w:num w:numId="4" w16cid:durableId="1227841907">
-    <w:abstractNumId w:val="6"/>
-  </w:num>
-  <w:num w:numId="5" w16cid:durableId="87775347">
-    <w:abstractNumId w:val="4"/>
-  </w:num>
-  <w:num w:numId="6" w16cid:durableId="1280914734">
-    <w:abstractNumId w:val="3"/>
-  </w:num>
-  <w:num w:numId="7" w16cid:durableId="586039891">
-    <w:abstractNumId w:val="7"/>
-  </w:num>
-  <w:num w:numId="8" w16cid:durableId="1771202012">
-    <w:abstractNumId w:val="1"/>
-  </w:num>
-  <w:num w:numId="9" w16cid:durableId="900680235">
-    <w:abstractNumId w:val="8"/>
   </w:num>
 </w:numbering>
 </file>

</xml_diff>

<commit_message>
feat(docs): add documentation quality validator
</commit_message>
<xml_diff>
--- a/opensource_plan/개발 노트/1주차 개발노트.docx
+++ b/opensource_plan/개발 노트/1주차 개발노트.docx
@@ -779,7 +779,15 @@
         <w:t>다음</w:t>
       </w:r>
       <w:r>
-        <w:t xml:space="preserve"> Slice D2는 별도 논리 단위이므로 D1 커밋 후 현재 </w:t>
+        <w:t xml:space="preserve"> Slice D2는 별도 논리 단위이므로 D1 </w:t>
+      </w:r>
+      <w:proofErr w:type="spellStart"/>
+      <w:r>
+        <w:t>커밋</w:t>
+      </w:r>
+      <w:proofErr w:type="spellEnd"/>
+      <w:r>
+        <w:t xml:space="preserve"> 후 현재 </w:t>
       </w:r>
       <w:proofErr w:type="spellStart"/>
       <w:r>
@@ -1970,6 +1978,2525 @@
         </w:rPr>
         <w:lastRenderedPageBreak/>
         <w:t>5.</w:t>
+      </w:r>
+    </w:p>
+    <w:p>
+      <w:r>
+        <w:t xml:space="preserve">Slice D4 완료했습니다. </w:t>
+      </w:r>
+      <w:proofErr w:type="spellStart"/>
+      <w:r>
+        <w:t>커밋은</w:t>
+      </w:r>
+      <w:proofErr w:type="spellEnd"/>
+      <w:r>
+        <w:t xml:space="preserve"> 하지 않았습니다.</w:t>
+      </w:r>
+    </w:p>
+    <w:p>
+      <w:r>
+        <w:t>주요 산출물:</w:t>
+      </w:r>
+    </w:p>
+    <w:p>
+      <w:pPr>
+        <w:numPr>
+          <w:ilvl w:val="0"/>
+          <w:numId w:val="15"/>
+        </w:numPr>
+      </w:pPr>
+      <w:r>
+        <w:t>[</w:t>
+      </w:r>
+      <w:proofErr w:type="gramStart"/>
+      <w:r>
+        <w:t>data_sources.md](</w:t>
+      </w:r>
+      <w:proofErr w:type="gramEnd"/>
+      <w:r>
+        <w:t>C:\\git\\cheongnyeon-alimi\\docs\\data\\data_sources.md)</w:t>
+      </w:r>
+    </w:p>
+    <w:p>
+      <w:pPr>
+        <w:numPr>
+          <w:ilvl w:val="0"/>
+          <w:numId w:val="15"/>
+        </w:numPr>
+      </w:pPr>
+      <w:r>
+        <w:t>[</w:t>
+      </w:r>
+      <w:proofErr w:type="gramStart"/>
+      <w:r>
+        <w:t>data_schema.md](</w:t>
+      </w:r>
+      <w:proofErr w:type="gramEnd"/>
+      <w:r>
+        <w:t>C:\\git\\cheongnyeon-alimi\\docs\\data\\data_schema.md)</w:t>
+      </w:r>
+    </w:p>
+    <w:p>
+      <w:pPr>
+        <w:numPr>
+          <w:ilvl w:val="0"/>
+          <w:numId w:val="15"/>
+        </w:numPr>
+      </w:pPr>
+      <w:r>
+        <w:t>[</w:t>
+      </w:r>
+      <w:proofErr w:type="gramStart"/>
+      <w:r>
+        <w:t>normalization_rules.md](</w:t>
+      </w:r>
+      <w:proofErr w:type="gramEnd"/>
+      <w:r>
+        <w:t>C:\\git\\cheongnyeon-alimi\\docs\\data\\normalization_rules.md)</w:t>
+      </w:r>
+    </w:p>
+    <w:p>
+      <w:pPr>
+        <w:numPr>
+          <w:ilvl w:val="0"/>
+          <w:numId w:val="15"/>
+        </w:numPr>
+      </w:pPr>
+      <w:r>
+        <w:t>[</w:t>
+      </w:r>
+      <w:proofErr w:type="gramStart"/>
+      <w:r>
+        <w:t>collection_policy.md](</w:t>
+      </w:r>
+      <w:proofErr w:type="gramEnd"/>
+      <w:r>
+        <w:t>C:\\git\\cheongnyeon-alimi\\docs\\data\\collection_policy.md)</w:t>
+      </w:r>
+    </w:p>
+    <w:p>
+      <w:pPr>
+        <w:numPr>
+          <w:ilvl w:val="0"/>
+          <w:numId w:val="15"/>
+        </w:numPr>
+      </w:pPr>
+      <w:r>
+        <w:t>[</w:t>
+      </w:r>
+      <w:proofErr w:type="gramStart"/>
+      <w:r>
+        <w:t>data/README.md](</w:t>
+      </w:r>
+      <w:proofErr w:type="gramEnd"/>
+      <w:r>
+        <w:t>C:\\git\\cheongnyeon-alimi\\docs\\data\\README.md)</w:t>
+      </w:r>
+    </w:p>
+    <w:p>
+      <w:r>
+        <w:t>핵심 내용:</w:t>
+      </w:r>
+    </w:p>
+    <w:p>
+      <w:pPr>
+        <w:numPr>
+          <w:ilvl w:val="0"/>
+          <w:numId w:val="16"/>
+        </w:numPr>
+      </w:pPr>
+      <w:proofErr w:type="spellStart"/>
+      <w:r>
+        <w:t>온통청년</w:t>
+      </w:r>
+      <w:proofErr w:type="spellEnd"/>
+      <w:r>
+        <w:t xml:space="preserve"> API와 HTTPS 웹 소스의 확정·</w:t>
+      </w:r>
+      <w:proofErr w:type="spellStart"/>
+      <w:r>
+        <w:t>미확정</w:t>
+      </w:r>
+      <w:proofErr w:type="spellEnd"/>
+      <w:r>
+        <w:t xml:space="preserve"> 범위 분리</w:t>
+      </w:r>
+    </w:p>
+    <w:p>
+      <w:pPr>
+        <w:numPr>
+          <w:ilvl w:val="0"/>
+          <w:numId w:val="16"/>
+        </w:numPr>
+      </w:pPr>
+      <w:proofErr w:type="spellStart"/>
+      <w:r>
+        <w:t>Raw·Extracted·Normalized</w:t>
+      </w:r>
+      <w:proofErr w:type="spellEnd"/>
+      <w:r>
+        <w:t xml:space="preserve"> 3단계 계약 정의</w:t>
+      </w:r>
+    </w:p>
+    <w:p>
+      <w:pPr>
+        <w:numPr>
+          <w:ilvl w:val="0"/>
+          <w:numId w:val="16"/>
+        </w:numPr>
+      </w:pPr>
+      <w:r>
+        <w:t xml:space="preserve">단일 </w:t>
+      </w:r>
+      <w:proofErr w:type="spellStart"/>
+      <w:r>
+        <w:t>선택값은</w:t>
+      </w:r>
+      <w:proofErr w:type="spellEnd"/>
+      <w:r>
+        <w:t xml:space="preserve"> null, </w:t>
+      </w:r>
+      <w:proofErr w:type="spellStart"/>
+      <w:r>
+        <w:t>복수값은</w:t>
+      </w:r>
+      <w:proofErr w:type="spellEnd"/>
+      <w:r>
+        <w:t xml:space="preserve"> []로 통일</w:t>
+      </w:r>
+    </w:p>
+    <w:p>
+      <w:pPr>
+        <w:numPr>
+          <w:ilvl w:val="0"/>
+          <w:numId w:val="16"/>
+        </w:numPr>
+      </w:pPr>
+      <w:r>
+        <w:t>날짜·지역·연령·카테고리 정규화 기준</w:t>
+      </w:r>
+    </w:p>
+    <w:p>
+      <w:pPr>
+        <w:numPr>
+          <w:ilvl w:val="0"/>
+          <w:numId w:val="16"/>
+        </w:numPr>
+      </w:pPr>
+      <w:r>
+        <w:t>원문, 출처 URL, 수집 시각, SHA-256 Hash 보존</w:t>
+      </w:r>
+    </w:p>
+    <w:p>
+      <w:pPr>
+        <w:numPr>
+          <w:ilvl w:val="0"/>
+          <w:numId w:val="16"/>
+        </w:numPr>
+      </w:pPr>
+      <w:proofErr w:type="spellStart"/>
+      <w:r>
+        <w:t>Fixture·Seed</w:t>
+      </w:r>
+      <w:proofErr w:type="spellEnd"/>
+      <w:r>
+        <w:t>와 실제 Runtime 데이터 분리</w:t>
+      </w:r>
+    </w:p>
+    <w:p>
+      <w:pPr>
+        <w:numPr>
+          <w:ilvl w:val="0"/>
+          <w:numId w:val="16"/>
+        </w:numPr>
+      </w:pPr>
+      <w:r>
+        <w:t>인증키·개인정보·라이선스 안전 기준</w:t>
+      </w:r>
+    </w:p>
+    <w:p>
+      <w:pPr>
+        <w:numPr>
+          <w:ilvl w:val="0"/>
+          <w:numId w:val="16"/>
+        </w:numPr>
+      </w:pPr>
+      <w:r>
+        <w:t>JSON Schema와 설명 문서의 동시 갱신 규칙</w:t>
+      </w:r>
+    </w:p>
+    <w:p>
+      <w:r>
+        <w:t>주의사항:</w:t>
+      </w:r>
+    </w:p>
+    <w:p>
+      <w:pPr>
+        <w:numPr>
+          <w:ilvl w:val="0"/>
+          <w:numId w:val="17"/>
+        </w:numPr>
+      </w:pPr>
+      <w:proofErr w:type="spellStart"/>
+      <w:r>
+        <w:t>application_status</w:t>
+      </w:r>
+      <w:proofErr w:type="spellEnd"/>
+      <w:r>
+        <w:t xml:space="preserve">의 always와 open 충돌은 임의로 해결하지 않고 </w:t>
+      </w:r>
+      <w:proofErr w:type="spellStart"/>
+      <w:r>
+        <w:t>미확정</w:t>
+      </w:r>
+      <w:proofErr w:type="spellEnd"/>
+      <w:r>
+        <w:t xml:space="preserve"> 사항으로 기록했습니다.</w:t>
+      </w:r>
+    </w:p>
+    <w:p>
+      <w:pPr>
+        <w:numPr>
+          <w:ilvl w:val="0"/>
+          <w:numId w:val="17"/>
+        </w:numPr>
+      </w:pPr>
+      <w:r>
+        <w:t xml:space="preserve">작업 전부터 수정되어 있던 </w:t>
+      </w:r>
+      <w:proofErr w:type="spellStart"/>
+      <w:r>
+        <w:t>opensource_plan</w:t>
+      </w:r>
+      <w:proofErr w:type="spellEnd"/>
+      <w:r>
+        <w:t>/개발 노트/1주차 개발노트.docx는 건드리지 않고 보존했습니다.</w:t>
+      </w:r>
+    </w:p>
+    <w:p>
+      <w:pPr>
+        <w:numPr>
+          <w:ilvl w:val="0"/>
+          <w:numId w:val="17"/>
+        </w:numPr>
+      </w:pPr>
+      <w:r>
+        <w:t xml:space="preserve">따라서 </w:t>
+      </w:r>
+      <w:proofErr w:type="spellStart"/>
+      <w:r>
+        <w:t>커밋</w:t>
+      </w:r>
+      <w:proofErr w:type="spellEnd"/>
+      <w:r>
+        <w:t xml:space="preserve"> 시 git </w:t>
+      </w:r>
+      <w:proofErr w:type="gramStart"/>
+      <w:r>
+        <w:t>add .을</w:t>
+      </w:r>
+      <w:proofErr w:type="gramEnd"/>
+      <w:r>
+        <w:t xml:space="preserve"> 사용하면 해당 Word 문서까지 포함될 수 있으니 주</w:t>
+      </w:r>
+      <w:r>
+        <w:lastRenderedPageBreak/>
+        <w:t>의해야 합니다.</w:t>
+      </w:r>
+    </w:p>
+    <w:p>
+      <w:r>
+        <w:t>검증 결과:</w:t>
+      </w:r>
+    </w:p>
+    <w:p>
+      <w:pPr>
+        <w:numPr>
+          <w:ilvl w:val="0"/>
+          <w:numId w:val="18"/>
+        </w:numPr>
+      </w:pPr>
+      <w:r>
+        <w:t>Markdown 링크 정상</w:t>
+      </w:r>
+    </w:p>
+    <w:p>
+      <w:pPr>
+        <w:numPr>
+          <w:ilvl w:val="0"/>
+          <w:numId w:val="18"/>
+        </w:numPr>
+      </w:pPr>
+      <w:r>
+        <w:t>필수 D4 산출물 존재</w:t>
+      </w:r>
+    </w:p>
+    <w:p>
+      <w:pPr>
+        <w:numPr>
+          <w:ilvl w:val="0"/>
+          <w:numId w:val="18"/>
+        </w:numPr>
+      </w:pPr>
+      <w:r>
+        <w:t>데이터 단계와 null·배열 규칙 일치</w:t>
+      </w:r>
+    </w:p>
+    <w:p>
+      <w:pPr>
+        <w:numPr>
+          <w:ilvl w:val="0"/>
+          <w:numId w:val="18"/>
+        </w:numPr>
+      </w:pPr>
+      <w:proofErr w:type="spellStart"/>
+      <w:r>
+        <w:t>application_status</w:t>
+      </w:r>
+      <w:proofErr w:type="spellEnd"/>
+      <w:r>
+        <w:t xml:space="preserve"> </w:t>
+      </w:r>
+      <w:proofErr w:type="spellStart"/>
+      <w:r>
+        <w:t>미확정</w:t>
+      </w:r>
+      <w:proofErr w:type="spellEnd"/>
+      <w:r>
+        <w:t xml:space="preserve"> 표시 확인</w:t>
+      </w:r>
+    </w:p>
+    <w:p>
+      <w:pPr>
+        <w:numPr>
+          <w:ilvl w:val="0"/>
+          <w:numId w:val="18"/>
+        </w:numPr>
+      </w:pPr>
+      <w:r>
+        <w:t>JSON Schema 동기화 절차 확인</w:t>
+      </w:r>
+    </w:p>
+    <w:p>
+      <w:pPr>
+        <w:numPr>
+          <w:ilvl w:val="0"/>
+          <w:numId w:val="18"/>
+        </w:numPr>
+      </w:pPr>
+      <w:proofErr w:type="spellStart"/>
+      <w:r>
+        <w:t>비밀값</w:t>
+      </w:r>
+      <w:proofErr w:type="spellEnd"/>
+      <w:r>
+        <w:t xml:space="preserve"> 할당 없음</w:t>
+      </w:r>
+    </w:p>
+    <w:p>
+      <w:pPr>
+        <w:numPr>
+          <w:ilvl w:val="0"/>
+          <w:numId w:val="18"/>
+        </w:numPr>
+      </w:pPr>
+      <w:r>
+        <w:t>빈 파일·빈 docs 디렉터리 없음</w:t>
+      </w:r>
+    </w:p>
+    <w:p>
+      <w:pPr>
+        <w:numPr>
+          <w:ilvl w:val="0"/>
+          <w:numId w:val="18"/>
+        </w:numPr>
+      </w:pPr>
+      <w:r>
+        <w:t>작업 파일의 git diff --check 통과</w:t>
+      </w:r>
+    </w:p>
+    <w:p>
+      <w:pPr>
+        <w:numPr>
+          <w:ilvl w:val="0"/>
+          <w:numId w:val="18"/>
+        </w:numPr>
+      </w:pPr>
+      <w:r>
+        <w:t>임시 파일 없음</w:t>
+      </w:r>
+    </w:p>
+    <w:p>
+      <w:r>
+        <w:t xml:space="preserve">간단한 코드 리뷰: 차단할 문제는 없습니다. </w:t>
+      </w:r>
+      <w:proofErr w:type="spellStart"/>
+      <w:r>
+        <w:t>미확정</w:t>
+      </w:r>
+      <w:proofErr w:type="spellEnd"/>
+      <w:r>
+        <w:t xml:space="preserve"> 소스·</w:t>
+      </w:r>
+      <w:proofErr w:type="spellStart"/>
+      <w:r>
+        <w:t>enum</w:t>
+      </w:r>
+      <w:proofErr w:type="spellEnd"/>
+      <w:r>
+        <w:t xml:space="preserve">을 </w:t>
+      </w:r>
+      <w:proofErr w:type="spellStart"/>
+      <w:r>
+        <w:t>확정값과</w:t>
+      </w:r>
+      <w:proofErr w:type="spellEnd"/>
+      <w:r>
+        <w:t xml:space="preserve"> 명확히 분리했고, 실제 Schema가 아직 없다는 상태도 문서 전반에 표시했습니다.</w:t>
+      </w:r>
+    </w:p>
+    <w:p>
+      <w:r>
+        <w:t xml:space="preserve">권장 </w:t>
+      </w:r>
+      <w:proofErr w:type="spellStart"/>
+      <w:r>
+        <w:t>커밋</w:t>
+      </w:r>
+      <w:proofErr w:type="spellEnd"/>
+      <w:r>
+        <w:t xml:space="preserve"> 메시지:</w:t>
+      </w:r>
+    </w:p>
+    <w:p>
+      <w:r>
+        <w:t>docs(data): define data documentation baseline</w:t>
+      </w:r>
+    </w:p>
+    <w:p>
+      <w:r>
+        <w:t xml:space="preserve">안전하게 D4 파일만 </w:t>
+      </w:r>
+      <w:proofErr w:type="spellStart"/>
+      <w:r>
+        <w:t>스테이징하려면</w:t>
+      </w:r>
+      <w:proofErr w:type="spellEnd"/>
+      <w:r>
+        <w:t>:</w:t>
+      </w:r>
+    </w:p>
+    <w:p>
+      <w:r>
+        <w:t>git add CHANGELOG.md docs/data docs/index.md docs/development/development_notes.md</w:t>
+      </w:r>
+    </w:p>
+    <w:p>
+      <w:r>
+        <w:t xml:space="preserve">다음 D5도 같은 Docs Forest이므로 새 </w:t>
+      </w:r>
+      <w:proofErr w:type="spellStart"/>
+      <w:r>
+        <w:t>브랜치</w:t>
+      </w:r>
+      <w:proofErr w:type="spellEnd"/>
+      <w:r>
+        <w:t xml:space="preserve"> 없이 현재 </w:t>
+      </w:r>
+      <w:proofErr w:type="spellStart"/>
+      <w:r>
+        <w:t>브랜치에서</w:t>
+      </w:r>
+      <w:proofErr w:type="spellEnd"/>
+      <w:r>
+        <w:t xml:space="preserve"> 진행하면 됩니다.</w:t>
+      </w:r>
+    </w:p>
+    <w:p>
+      <w:pPr>
+        <w:widowControl/>
+        <w:wordWrap/>
+        <w:autoSpaceDE/>
+        <w:autoSpaceDN/>
+      </w:pPr>
+      <w:r>
+        <w:br w:type="page"/>
+      </w:r>
+    </w:p>
+    <w:p>
+      <w:r>
+        <w:rPr>
+          <w:rFonts w:hint="eastAsia"/>
+        </w:rPr>
+        <w:lastRenderedPageBreak/>
+        <w:t>6.</w:t>
+      </w:r>
+    </w:p>
+    <w:p>
+      <w:r>
+        <w:t xml:space="preserve">아, 나는 </w:t>
+      </w:r>
+      <w:proofErr w:type="spellStart"/>
+      <w:r>
+        <w:t>development_notes</w:t>
+      </w:r>
+      <w:proofErr w:type="spellEnd"/>
+      <w:r>
+        <w:t xml:space="preserve">라는 디렉토리 안에 시스템 구축한 문서를 넣으려고 </w:t>
+      </w:r>
+      <w:proofErr w:type="spellStart"/>
+      <w:r>
+        <w:t>했던건데</w:t>
+      </w:r>
+      <w:proofErr w:type="spellEnd"/>
+      <w:r>
+        <w:t xml:space="preserve">? development_notes.md에 모든 시스템 개발 내용을 </w:t>
+      </w:r>
+      <w:proofErr w:type="spellStart"/>
+      <w:proofErr w:type="gramStart"/>
+      <w:r>
+        <w:t>넣는게</w:t>
+      </w:r>
+      <w:proofErr w:type="spellEnd"/>
+      <w:proofErr w:type="gramEnd"/>
+      <w:r>
+        <w:t xml:space="preserve"> 아니라. 그래야 문서 하나하나 보고 개발 내용을 확인할 수 </w:t>
+      </w:r>
+      <w:proofErr w:type="spellStart"/>
+      <w:r>
+        <w:t>있잖아</w:t>
+      </w:r>
+      <w:proofErr w:type="spellEnd"/>
+      <w:r>
+        <w:t xml:space="preserve">. 예를 들면 지금은 docs시스템을 구축하고 있고, 나중에 데이터 스키마면 데이터 스키마 개발 문서를 </w:t>
+      </w:r>
+      <w:proofErr w:type="spellStart"/>
+      <w:r>
+        <w:t>development_notes</w:t>
+      </w:r>
+      <w:proofErr w:type="spellEnd"/>
+      <w:r>
+        <w:t xml:space="preserve"> 디렉토리에 </w:t>
+      </w:r>
+      <w:proofErr w:type="spellStart"/>
+      <w:r>
+        <w:t>넣는거지</w:t>
+      </w:r>
+      <w:proofErr w:type="spellEnd"/>
+    </w:p>
+    <w:p>
+      <w:r>
+        <w:t>5:21 PM</w:t>
+      </w:r>
+    </w:p>
+    <w:p>
+      <w:r>
+        <w:t xml:space="preserve">맞다. 내가 development_notes.md를 누적 로그 파일로 해석했는데, 사용자의 의도는 </w:t>
+      </w:r>
+      <w:r>
+        <w:rPr>
+          <w:b/>
+          <w:bCs/>
+        </w:rPr>
+        <w:t xml:space="preserve">개발 항목별 문서를 보관하는 </w:t>
+      </w:r>
+      <w:proofErr w:type="spellStart"/>
+      <w:r>
+        <w:rPr>
+          <w:b/>
+          <w:bCs/>
+        </w:rPr>
+        <w:t>development_</w:t>
+      </w:r>
+      <w:proofErr w:type="gramStart"/>
+      <w:r>
+        <w:rPr>
+          <w:b/>
+          <w:bCs/>
+        </w:rPr>
+        <w:t>notes</w:t>
+      </w:r>
+      <w:proofErr w:type="spellEnd"/>
+      <w:r>
+        <w:rPr>
+          <w:b/>
+          <w:bCs/>
+        </w:rPr>
+        <w:t>/ 디렉터리</w:t>
+      </w:r>
+      <w:r>
+        <w:t>였다</w:t>
+      </w:r>
+      <w:proofErr w:type="gramEnd"/>
+      <w:r>
+        <w:t>. 지금 구조는 장기적으로 한 파일이 지나치게 커지므로 수정하는 것이 맞다.</w:t>
+      </w:r>
+    </w:p>
+    <w:p>
+      <w:r>
+        <w:t>권장 구조는 다음과 같다.</w:t>
+      </w:r>
+    </w:p>
+    <w:p>
+      <w:r>
+        <w:t>docs/development/</w:t>
+      </w:r>
+    </w:p>
+    <w:p>
+      <w:r>
+        <w:t>├── README.md</w:t>
+      </w:r>
+    </w:p>
+    <w:p>
+      <w:r>
+        <w:t xml:space="preserve">└── </w:t>
+      </w:r>
+      <w:proofErr w:type="spellStart"/>
+      <w:r>
+        <w:t>development_notes</w:t>
+      </w:r>
+      <w:proofErr w:type="spellEnd"/>
+      <w:r>
+        <w:t>/</w:t>
+      </w:r>
+    </w:p>
+    <w:p>
+      <w:r>
+        <w:t xml:space="preserve">    ├── README.md</w:t>
+      </w:r>
+    </w:p>
+    <w:p>
+      <w:r>
+        <w:t xml:space="preserve">    ├── docs_system.md</w:t>
+      </w:r>
+    </w:p>
+    <w:p>
+      <w:r>
+        <w:t xml:space="preserve">    ├── collaboration_policy.md</w:t>
+      </w:r>
+    </w:p>
+    <w:p>
+      <w:r>
+        <w:t xml:space="preserve">    ├── architecture_baseline.md</w:t>
+      </w:r>
+    </w:p>
+    <w:p>
+      <w:r>
+        <w:t xml:space="preserve">    └── data_documentation_baseline.md</w:t>
+      </w:r>
+    </w:p>
+    <w:p>
+      <w:r>
+        <w:t>이후 실제 데이터 개발에서는 독립 문서가 추가된다.</w:t>
+      </w:r>
+    </w:p>
+    <w:p>
+      <w:proofErr w:type="spellStart"/>
+      <w:r>
+        <w:t>development_notes</w:t>
+      </w:r>
+      <w:proofErr w:type="spellEnd"/>
+      <w:r>
+        <w:t>/</w:t>
+      </w:r>
+    </w:p>
+    <w:p>
+      <w:r>
+        <w:t>├── data_schema.md</w:t>
+      </w:r>
+    </w:p>
+    <w:p>
+      <w:r>
+        <w:t>├── collector_pipeline.md</w:t>
+      </w:r>
+    </w:p>
+    <w:p>
+      <w:r>
+        <w:t>├── youthcenter_api_collector.md</w:t>
+      </w:r>
+    </w:p>
+    <w:p>
+      <w:r>
+        <w:t>├── normalizer.md</w:t>
+      </w:r>
+    </w:p>
+    <w:p>
+      <w:r>
+        <w:t>└── fixture_and_seed.md</w:t>
+      </w:r>
+    </w:p>
+    <w:p>
+      <w:r>
+        <w:t>역할은 다음과 같이 나누면 된다.</w:t>
+      </w:r>
+    </w:p>
+    <w:p>
+      <w:pPr>
+        <w:numPr>
+          <w:ilvl w:val="0"/>
+          <w:numId w:val="19"/>
+        </w:numPr>
+      </w:pPr>
+      <w:proofErr w:type="spellStart"/>
+      <w:r>
+        <w:lastRenderedPageBreak/>
+        <w:t>development_notes</w:t>
+      </w:r>
+      <w:proofErr w:type="spellEnd"/>
+      <w:r>
+        <w:t>/README.md: 개발 문서 목록과 작성 기준</w:t>
+      </w:r>
+    </w:p>
+    <w:p>
+      <w:pPr>
+        <w:numPr>
+          <w:ilvl w:val="0"/>
+          <w:numId w:val="19"/>
+        </w:numPr>
+      </w:pPr>
+      <w:r>
+        <w:t>docs_system.md: D0~D1 구현 내용</w:t>
+      </w:r>
+    </w:p>
+    <w:p>
+      <w:pPr>
+        <w:numPr>
+          <w:ilvl w:val="0"/>
+          <w:numId w:val="19"/>
+        </w:numPr>
+      </w:pPr>
+      <w:r>
+        <w:t>collaboration_policy.md: D2 구현 내용</w:t>
+      </w:r>
+    </w:p>
+    <w:p>
+      <w:pPr>
+        <w:numPr>
+          <w:ilvl w:val="0"/>
+          <w:numId w:val="19"/>
+        </w:numPr>
+      </w:pPr>
+      <w:r>
+        <w:t>architecture_baseline.md: D3 구현 내용</w:t>
+      </w:r>
+    </w:p>
+    <w:p>
+      <w:pPr>
+        <w:numPr>
+          <w:ilvl w:val="0"/>
+          <w:numId w:val="19"/>
+        </w:numPr>
+      </w:pPr>
+      <w:r>
+        <w:t>data_documentation_baseline.md: D4 구현 내용</w:t>
+      </w:r>
+    </w:p>
+    <w:p>
+      <w:pPr>
+        <w:numPr>
+          <w:ilvl w:val="0"/>
+          <w:numId w:val="19"/>
+        </w:numPr>
+      </w:pPr>
+      <w:r>
+        <w:t>향후 문서: 기능이나 시스템 단위로 하나씩 추가</w:t>
+      </w:r>
+    </w:p>
+    <w:p>
+      <w:r>
+        <w:t>각 문서는 다음 형식을 공유한다.</w:t>
+      </w:r>
+    </w:p>
+    <w:p>
+      <w:r>
+        <w:t>작업 정보</w:t>
+      </w:r>
+    </w:p>
+    <w:p>
+      <w:r>
+        <w:t>목적</w:t>
+      </w:r>
+    </w:p>
+    <w:p>
+      <w:r>
+        <w:t>구현 내용</w:t>
+      </w:r>
+    </w:p>
+    <w:p>
+      <w:r>
+        <w:t>주요 변경 파일</w:t>
+      </w:r>
+    </w:p>
+    <w:p>
+      <w:r>
+        <w:t>설계 결정</w:t>
+      </w:r>
+    </w:p>
+    <w:p>
+      <w:r>
+        <w:t>검증 결과</w:t>
+      </w:r>
+    </w:p>
+    <w:p>
+      <w:r>
+        <w:t>남은 작업</w:t>
+      </w:r>
+    </w:p>
+    <w:p>
+      <w:r>
+        <w:t>따라서 기존 docs/development/development_notes.md는 삭제하고 내용을 위 네 문서로 분리해야 한다. 함께 수정할 대상은 다음과 같다.</w:t>
+      </w:r>
+    </w:p>
+    <w:p>
+      <w:pPr>
+        <w:numPr>
+          <w:ilvl w:val="0"/>
+          <w:numId w:val="20"/>
+        </w:numPr>
+      </w:pPr>
+      <w:r>
+        <w:t>docs/index.md</w:t>
+      </w:r>
+    </w:p>
+    <w:p>
+      <w:pPr>
+        <w:numPr>
+          <w:ilvl w:val="0"/>
+          <w:numId w:val="20"/>
+        </w:numPr>
+      </w:pPr>
+      <w:r>
+        <w:t>docs/development/README.md</w:t>
+      </w:r>
+    </w:p>
+    <w:p>
+      <w:pPr>
+        <w:numPr>
+          <w:ilvl w:val="0"/>
+          <w:numId w:val="20"/>
+        </w:numPr>
+      </w:pPr>
+      <w:r>
+        <w:t>docs/governance/documentation_policy.md</w:t>
+      </w:r>
+    </w:p>
+    <w:p>
+      <w:pPr>
+        <w:numPr>
+          <w:ilvl w:val="0"/>
+          <w:numId w:val="20"/>
+        </w:numPr>
+      </w:pPr>
+      <w:r>
+        <w:t>docs/develop_plan/README.md</w:t>
+      </w:r>
+    </w:p>
+    <w:p>
+      <w:pPr>
+        <w:numPr>
+          <w:ilvl w:val="0"/>
+          <w:numId w:val="20"/>
+        </w:numPr>
+      </w:pPr>
+      <w:r>
+        <w:t>기존 문서의 development_notes.md 링크와 설명</w:t>
+      </w:r>
+    </w:p>
+    <w:p>
+      <w:r>
+        <w:t xml:space="preserve">이 수정은 단순 취향이 아니라 문서 책임 구조 교정이므로, D5에 섞기 전에 현재 </w:t>
+      </w:r>
+      <w:proofErr w:type="spellStart"/>
+      <w:r>
+        <w:t>브랜치에서</w:t>
+      </w:r>
+      <w:proofErr w:type="spellEnd"/>
+      <w:r>
+        <w:t xml:space="preserve"> 별도 </w:t>
+      </w:r>
+      <w:proofErr w:type="spellStart"/>
+      <w:r>
+        <w:t>커밋으로</w:t>
+      </w:r>
+      <w:proofErr w:type="spellEnd"/>
+      <w:r>
+        <w:t xml:space="preserve"> 먼저 정리하는 편이 안전하다. 새 </w:t>
+      </w:r>
+      <w:proofErr w:type="spellStart"/>
+      <w:r>
+        <w:t>브랜치는</w:t>
+      </w:r>
+      <w:proofErr w:type="spellEnd"/>
+      <w:r>
+        <w:t xml:space="preserve"> 필요 없다.</w:t>
+      </w:r>
+    </w:p>
+    <w:p>
+      <w:r>
+        <w:t>수정 작업 이름은 다음처럼 잡으면 된다.</w:t>
+      </w:r>
+    </w:p>
+    <w:p>
+      <w:r>
+        <w:t>Docs 구조 교정 — 개발 기록을 항목별 문서 디렉터리로 분리</w:t>
+      </w:r>
+    </w:p>
+    <w:p>
+      <w:r>
+        <w:t xml:space="preserve">권장 </w:t>
+      </w:r>
+      <w:proofErr w:type="spellStart"/>
+      <w:r>
+        <w:t>커밋</w:t>
+      </w:r>
+      <w:proofErr w:type="spellEnd"/>
+      <w:r>
+        <w:t xml:space="preserve"> 메시지는 다음이다.</w:t>
+      </w:r>
+    </w:p>
+    <w:p>
+      <w:r>
+        <w:lastRenderedPageBreak/>
+        <w:t>docs(development): split development notes by work area</w:t>
+      </w:r>
+    </w:p>
+    <w:p>
+      <w:r>
+        <w:t>아직 파일은 수정하지 않았다. 이 구조로 바로 교정 작업을 진행하면 된다.</w:t>
+      </w:r>
+    </w:p>
+    <w:p>
+      <w:r>
+        <w:t>5:21 PM</w:t>
+      </w:r>
+    </w:p>
+    <w:p>
+      <w:r>
+        <w:t>어 수정하자.</w:t>
+      </w:r>
+    </w:p>
+    <w:p>
+      <w:r>
+        <w:t>5:22 PM</w:t>
+      </w:r>
+    </w:p>
+    <w:p>
+      <w:r>
+        <w:t>Worked for 2m 31s</w:t>
+      </w:r>
+    </w:p>
+    <w:p>
+      <w:r>
+        <w:t xml:space="preserve">개발 기록 구조를 의도에 맞게 수정했습니다. </w:t>
+      </w:r>
+      <w:proofErr w:type="spellStart"/>
+      <w:r>
+        <w:t>커밋은</w:t>
+      </w:r>
+      <w:proofErr w:type="spellEnd"/>
+      <w:r>
+        <w:t xml:space="preserve"> 하지 않았습니다.</w:t>
+      </w:r>
+    </w:p>
+    <w:p>
+      <w:r>
+        <w:t>새 구조:</w:t>
+      </w:r>
+    </w:p>
+    <w:p>
+      <w:r>
+        <w:t>docs/development/</w:t>
+      </w:r>
+      <w:proofErr w:type="spellStart"/>
+      <w:r>
+        <w:t>development_notes</w:t>
+      </w:r>
+      <w:proofErr w:type="spellEnd"/>
+      <w:r>
+        <w:t>/</w:t>
+      </w:r>
+    </w:p>
+    <w:p>
+      <w:r>
+        <w:t>├── README.md</w:t>
+      </w:r>
+    </w:p>
+    <w:p>
+      <w:r>
+        <w:t>├── docs_system.md</w:t>
+      </w:r>
+    </w:p>
+    <w:p>
+      <w:r>
+        <w:t>├── collaboration_policy.md</w:t>
+      </w:r>
+    </w:p>
+    <w:p>
+      <w:r>
+        <w:t>├── architecture_baseline.md</w:t>
+      </w:r>
+    </w:p>
+    <w:p>
+      <w:r>
+        <w:t>└── data_documentation_baseline.md</w:t>
+      </w:r>
+    </w:p>
+    <w:p>
+      <w:r>
+        <w:t>변경 사항:</w:t>
+      </w:r>
+    </w:p>
+    <w:p>
+      <w:pPr>
+        <w:numPr>
+          <w:ilvl w:val="0"/>
+          <w:numId w:val="21"/>
+        </w:numPr>
+      </w:pPr>
+      <w:r>
+        <w:t>기존 단일 development_notes.md 삭제</w:t>
+      </w:r>
+    </w:p>
+    <w:p>
+      <w:pPr>
+        <w:numPr>
+          <w:ilvl w:val="0"/>
+          <w:numId w:val="21"/>
+        </w:numPr>
+      </w:pPr>
+      <w:r>
+        <w:t>D0~D1 기록을 docs_system.md로 통합</w:t>
+      </w:r>
+    </w:p>
+    <w:p>
+      <w:pPr>
+        <w:numPr>
+          <w:ilvl w:val="0"/>
+          <w:numId w:val="21"/>
+        </w:numPr>
+      </w:pPr>
+      <w:r>
+        <w:t>D2~D4 기록을 작업 영역별 문서로 분리</w:t>
+      </w:r>
+    </w:p>
+    <w:p>
+      <w:pPr>
+        <w:numPr>
+          <w:ilvl w:val="0"/>
+          <w:numId w:val="21"/>
+        </w:numPr>
+      </w:pPr>
+      <w:r>
+        <w:t>개발 기록 색인과 작성 기준 추가</w:t>
+      </w:r>
+    </w:p>
+    <w:p>
+      <w:pPr>
+        <w:numPr>
+          <w:ilvl w:val="0"/>
+          <w:numId w:val="21"/>
+        </w:numPr>
+      </w:pPr>
+      <w:r>
+        <w:t>docs/index.md, 문서화 정책, 개발 계획 안내의 기존 링크 수정</w:t>
+      </w:r>
+    </w:p>
+    <w:p>
+      <w:pPr>
+        <w:numPr>
+          <w:ilvl w:val="0"/>
+          <w:numId w:val="21"/>
+        </w:numPr>
+      </w:pPr>
+      <w:r>
+        <w:t>향후 data_schema.md, collector_pipeline.md 같은 기능별 기록을 추가할 수 있도록 규칙 정의</w:t>
+      </w:r>
+    </w:p>
+    <w:p>
+      <w:r>
+        <w:t>검증 결과:</w:t>
+      </w:r>
+    </w:p>
+    <w:p>
+      <w:pPr>
+        <w:numPr>
+          <w:ilvl w:val="0"/>
+          <w:numId w:val="22"/>
+        </w:numPr>
+      </w:pPr>
+      <w:r>
+        <w:t>기존 development_notes.md 참조 완전 제거</w:t>
+      </w:r>
+    </w:p>
+    <w:p>
+      <w:pPr>
+        <w:numPr>
+          <w:ilvl w:val="0"/>
+          <w:numId w:val="22"/>
+        </w:numPr>
+      </w:pPr>
+      <w:r>
+        <w:t>D0~D4 기록 이전 확인</w:t>
+      </w:r>
+    </w:p>
+    <w:p>
+      <w:pPr>
+        <w:numPr>
+          <w:ilvl w:val="0"/>
+          <w:numId w:val="22"/>
+        </w:numPr>
+      </w:pPr>
+      <w:r>
+        <w:lastRenderedPageBreak/>
+        <w:t>모든 Markdown 링크 정상</w:t>
+      </w:r>
+    </w:p>
+    <w:p>
+      <w:pPr>
+        <w:numPr>
+          <w:ilvl w:val="0"/>
+          <w:numId w:val="22"/>
+        </w:numPr>
+      </w:pPr>
+      <w:r>
+        <w:t>빈 파일·빈 docs 디렉터리 없음</w:t>
+      </w:r>
+    </w:p>
+    <w:p>
+      <w:pPr>
+        <w:numPr>
+          <w:ilvl w:val="0"/>
+          <w:numId w:val="22"/>
+        </w:numPr>
+      </w:pPr>
+      <w:r>
+        <w:t>git diff --check 통과</w:t>
+      </w:r>
+    </w:p>
+    <w:p>
+      <w:pPr>
+        <w:numPr>
+          <w:ilvl w:val="0"/>
+          <w:numId w:val="22"/>
+        </w:numPr>
+      </w:pPr>
+      <w:r>
+        <w:t>임시 파일 없음</w:t>
+      </w:r>
+    </w:p>
+    <w:p>
+      <w:pPr>
+        <w:numPr>
+          <w:ilvl w:val="0"/>
+          <w:numId w:val="22"/>
+        </w:numPr>
+      </w:pPr>
+      <w:r>
+        <w:t xml:space="preserve">기존에 수정된 </w:t>
+      </w:r>
+      <w:proofErr w:type="spellStart"/>
+      <w:r>
+        <w:t>opensource_plan</w:t>
+      </w:r>
+      <w:proofErr w:type="spellEnd"/>
+      <w:r>
+        <w:t>/개발 노트/1주차 개발노트.docx는 그대로 보존</w:t>
+      </w:r>
+    </w:p>
+    <w:p>
+      <w:r>
+        <w:t>간단한 코드 리뷰: 차단할 문제는 없습니다. 이제 하나의 파일이 비대해지지 않고, 개발자가 관심 있는 시스템이나 기능의 구현 기록만 독립적으로 확인할 수 있습니다.</w:t>
+      </w:r>
+    </w:p>
+    <w:p>
+      <w:r>
+        <w:t xml:space="preserve">구조 교정용 권장 </w:t>
+      </w:r>
+      <w:proofErr w:type="spellStart"/>
+      <w:r>
+        <w:t>커밋</w:t>
+      </w:r>
+      <w:proofErr w:type="spellEnd"/>
+      <w:r>
+        <w:t xml:space="preserve"> 메시지:</w:t>
+      </w:r>
+    </w:p>
+    <w:p>
+      <w:r>
+        <w:t>docs(development): organize development notes by work area</w:t>
+      </w:r>
+    </w:p>
+    <w:p>
+      <w:r>
+        <w:t xml:space="preserve">다만 현재 작업 트리에는 아직 커밋하지 않은 D4 변경도 함께 있습니다. git </w:t>
+      </w:r>
+      <w:proofErr w:type="gramStart"/>
+      <w:r>
+        <w:t>add .은</w:t>
+      </w:r>
+      <w:proofErr w:type="gramEnd"/>
+      <w:r>
+        <w:t xml:space="preserve"> 사용자 Word 문서까지 포함하므로 사용하지 않는 것이 안전합니다. D4와 구조 교정을 한 </w:t>
+      </w:r>
+      <w:proofErr w:type="spellStart"/>
+      <w:r>
+        <w:t>커밋으로</w:t>
+      </w:r>
+      <w:proofErr w:type="spellEnd"/>
+      <w:r>
+        <w:t xml:space="preserve"> 묶는다면 다음 메시지가 더 정확합니다.</w:t>
+      </w:r>
+    </w:p>
+    <w:p>
+      <w:r>
+        <w:t>docs(data): define data baseline and organize development notes</w:t>
+      </w:r>
+    </w:p>
+    <w:p>
+      <w:r>
+        <w:t xml:space="preserve">다음 D5도 현재 </w:t>
+      </w:r>
+      <w:proofErr w:type="spellStart"/>
+      <w:r>
+        <w:t>브랜치에서</w:t>
+      </w:r>
+      <w:proofErr w:type="spellEnd"/>
+      <w:r>
+        <w:t xml:space="preserve"> 계속 진행하면 됩니다.</w:t>
+      </w:r>
+    </w:p>
+    <w:p>
+      <w:pPr>
+        <w:widowControl/>
+        <w:wordWrap/>
+        <w:autoSpaceDE/>
+        <w:autoSpaceDN/>
+      </w:pPr>
+      <w:r>
+        <w:br w:type="page"/>
+      </w:r>
+    </w:p>
+    <w:p>
+      <w:r>
+        <w:rPr>
+          <w:rFonts w:hint="eastAsia"/>
+        </w:rPr>
+        <w:lastRenderedPageBreak/>
+        <w:t>7.</w:t>
+      </w:r>
+    </w:p>
+    <w:p>
+      <w:r>
+        <w:t xml:space="preserve">아니지. </w:t>
+      </w:r>
+      <w:proofErr w:type="spellStart"/>
+      <w:r>
+        <w:t>development_notes</w:t>
+      </w:r>
+      <w:proofErr w:type="spellEnd"/>
+      <w:r>
+        <w:t xml:space="preserve"> 디렉토리에 마크다운으로 </w:t>
+      </w:r>
+      <w:proofErr w:type="spellStart"/>
+      <w:r>
+        <w:t>넣는거까진</w:t>
+      </w:r>
+      <w:proofErr w:type="spellEnd"/>
+      <w:r>
+        <w:t xml:space="preserve"> 맞아. 근데 Forest로 보고 개발노트를 </w:t>
+      </w:r>
+      <w:proofErr w:type="spellStart"/>
+      <w:r>
+        <w:t>작성해야지</w:t>
+      </w:r>
+      <w:proofErr w:type="spellEnd"/>
+      <w:r>
+        <w:t xml:space="preserve">. 지금처럼 </w:t>
+      </w:r>
+      <w:proofErr w:type="spellStart"/>
+      <w:r>
+        <w:t>작게작게</w:t>
+      </w:r>
+      <w:proofErr w:type="spellEnd"/>
+      <w:r>
+        <w:t xml:space="preserve"> 넣는 것이 아니라. 지금 뭘 개발하고 </w:t>
+      </w:r>
+      <w:proofErr w:type="spellStart"/>
+      <w:r>
+        <w:t>있는거야</w:t>
+      </w:r>
+      <w:proofErr w:type="spellEnd"/>
+      <w:r>
+        <w:t xml:space="preserve">, docs 시스템을 구축하고 </w:t>
+      </w:r>
+      <w:proofErr w:type="spellStart"/>
+      <w:r>
+        <w:t>있는거지</w:t>
+      </w:r>
+      <w:proofErr w:type="spellEnd"/>
+      <w:r>
+        <w:t xml:space="preserve">? 그럼 docs system 개발문서 하나만 있어야지. </w:t>
+      </w:r>
+      <w:proofErr w:type="spellStart"/>
+      <w:r>
+        <w:t>이해했어</w:t>
+      </w:r>
+      <w:proofErr w:type="spellEnd"/>
+      <w:r>
+        <w:t>?</w:t>
+      </w:r>
+      <w:r>
+        <w:br/>
+        <w:t xml:space="preserve">데이터 작업할 때는 데이터 스키마, </w:t>
+      </w:r>
+      <w:proofErr w:type="spellStart"/>
+      <w:r>
+        <w:t>크롤링</w:t>
+      </w:r>
+      <w:proofErr w:type="spellEnd"/>
+      <w:r>
+        <w:t xml:space="preserve"> 등으로 forest 개발 문서를 적어야지. 물론, 그 개발 문서는 정확하고 상세히 적어주어야 하고.</w:t>
+      </w:r>
+      <w:r>
+        <w:br/>
+        <w:t xml:space="preserve">또한, </w:t>
+      </w:r>
+      <w:proofErr w:type="spellStart"/>
+      <w:r>
+        <w:t>develop_plan</w:t>
+      </w:r>
+      <w:proofErr w:type="spellEnd"/>
+      <w:r>
+        <w:t xml:space="preserve">은 "C:\git\cheongnyeon-alimi\opensource_plan\개발 계획\1. docs 구조 설계.docx" 이걸 참고해서, 데이터 담당의 첫번째 개발 계획 문서. 뭐 이런 식으로 적어주면 되겠지? 그리고 </w:t>
+      </w:r>
+      <w:proofErr w:type="spellStart"/>
+      <w:r>
+        <w:t>develop_plan</w:t>
+      </w:r>
+      <w:proofErr w:type="spellEnd"/>
+      <w:r>
+        <w:t>을 development 디렉토리 안에 넣어주고. 그러면 깔끔하게 되겠지?</w:t>
+      </w:r>
+    </w:p>
+    <w:p>
+      <w:r>
+        <w:t>5:27 PM</w:t>
+      </w:r>
+    </w:p>
+    <w:p>
+      <w:r>
+        <w:t xml:space="preserve">이해했다. 기준은 </w:t>
+      </w:r>
+      <w:r>
+        <w:rPr>
+          <w:b/>
+          <w:bCs/>
+        </w:rPr>
+        <w:t>Slice가 아니라 Forest 단위</w:t>
+      </w:r>
+      <w:r>
+        <w:t>다.</w:t>
+      </w:r>
+    </w:p>
+    <w:p>
+      <w:r>
+        <w:t>현재 우리가 개발 중인 것은 하나의 Docs System Forest이므로 개발 노트도 하나만 있어야 한다.</w:t>
+      </w:r>
+    </w:p>
+    <w:p>
+      <w:r>
+        <w:t>docs/development/</w:t>
+      </w:r>
+    </w:p>
+    <w:p>
+      <w:r>
+        <w:t>├── README.md</w:t>
+      </w:r>
+    </w:p>
+    <w:p>
+      <w:r>
+        <w:t xml:space="preserve">├── </w:t>
+      </w:r>
+      <w:proofErr w:type="spellStart"/>
+      <w:r>
+        <w:t>develop_plan</w:t>
+      </w:r>
+      <w:proofErr w:type="spellEnd"/>
+      <w:r>
+        <w:t>/</w:t>
+      </w:r>
+    </w:p>
+    <w:p>
+      <w:r>
+        <w:t>│   ├── README.md</w:t>
+      </w:r>
+    </w:p>
+    <w:p>
+      <w:r>
+        <w:t>│   ├── 01_docs_system.md</w:t>
+      </w:r>
+    </w:p>
+    <w:p>
+      <w:r>
+        <w:t>│   └── 02_data_pipeline_week_01.md</w:t>
+      </w:r>
+    </w:p>
+    <w:p>
+      <w:r>
+        <w:t xml:space="preserve">└── </w:t>
+      </w:r>
+      <w:proofErr w:type="spellStart"/>
+      <w:r>
+        <w:t>development_notes</w:t>
+      </w:r>
+      <w:proofErr w:type="spellEnd"/>
+      <w:r>
+        <w:t>/</w:t>
+      </w:r>
+    </w:p>
+    <w:p>
+      <w:r>
+        <w:t xml:space="preserve">    ├── README.md</w:t>
+      </w:r>
+    </w:p>
+    <w:p>
+      <w:r>
+        <w:t xml:space="preserve">    └── docs_system.md</w:t>
+      </w:r>
+    </w:p>
+    <w:p>
+      <w:r>
+        <w:t>역할은 다음과 같다.</w:t>
+      </w:r>
+    </w:p>
+    <w:p>
+      <w:pPr>
+        <w:numPr>
+          <w:ilvl w:val="0"/>
+          <w:numId w:val="23"/>
+        </w:numPr>
+      </w:pPr>
+      <w:r>
+        <w:t>develop_plan/01_docs_system.md</w:t>
+      </w:r>
+    </w:p>
+    <w:p>
+      <w:pPr>
+        <w:numPr>
+          <w:ilvl w:val="1"/>
+          <w:numId w:val="23"/>
+        </w:numPr>
+      </w:pPr>
+      <w:proofErr w:type="spellStart"/>
+      <w:r>
+        <w:t>opensource_plan</w:t>
+      </w:r>
+      <w:proofErr w:type="spellEnd"/>
+      <w:r>
+        <w:t>/개발 계획/1. docs 구조 설계.docx를 기반으로 작성</w:t>
+      </w:r>
+    </w:p>
+    <w:p>
+      <w:pPr>
+        <w:numPr>
+          <w:ilvl w:val="1"/>
+          <w:numId w:val="23"/>
+        </w:numPr>
+      </w:pPr>
+      <w:r>
+        <w:t>Docs Forest의 D0~D6 전체 계획, 의존성, 완료 기준 관리</w:t>
+      </w:r>
+    </w:p>
+    <w:p>
+      <w:pPr>
+        <w:numPr>
+          <w:ilvl w:val="0"/>
+          <w:numId w:val="23"/>
+        </w:numPr>
+      </w:pPr>
+      <w:r>
+        <w:lastRenderedPageBreak/>
+        <w:t>development_notes/docs_system.md</w:t>
+      </w:r>
+    </w:p>
+    <w:p>
+      <w:pPr>
+        <w:numPr>
+          <w:ilvl w:val="1"/>
+          <w:numId w:val="23"/>
+        </w:numPr>
+      </w:pPr>
+      <w:r>
+        <w:t>Docs Forest를 실제로 어떻게 구축했는지 상세히 누적</w:t>
+      </w:r>
+    </w:p>
+    <w:p>
+      <w:pPr>
+        <w:numPr>
+          <w:ilvl w:val="1"/>
+          <w:numId w:val="23"/>
+        </w:numPr>
+      </w:pPr>
+      <w:r>
+        <w:t xml:space="preserve">D0~D6은 문서 내부의 </w:t>
+      </w:r>
+      <w:proofErr w:type="spellStart"/>
+      <w:r>
+        <w:t>섹션으로</w:t>
+      </w:r>
+      <w:proofErr w:type="spellEnd"/>
+      <w:r>
+        <w:t xml:space="preserve"> 구분</w:t>
+      </w:r>
+    </w:p>
+    <w:p>
+      <w:pPr>
+        <w:numPr>
+          <w:ilvl w:val="1"/>
+          <w:numId w:val="23"/>
+        </w:numPr>
+      </w:pPr>
+      <w:r>
+        <w:t>설계 결정, 변경 파일, 검증 결과, 발견된 문제와 남은 작업 기록</w:t>
+      </w:r>
+    </w:p>
+    <w:p>
+      <w:pPr>
+        <w:numPr>
+          <w:ilvl w:val="0"/>
+          <w:numId w:val="23"/>
+        </w:numPr>
+      </w:pPr>
+      <w:r>
+        <w:t>develop_plan/02_data_pipeline_week_01.md</w:t>
+      </w:r>
+    </w:p>
+    <w:p>
+      <w:pPr>
+        <w:numPr>
+          <w:ilvl w:val="1"/>
+          <w:numId w:val="23"/>
+        </w:numPr>
+      </w:pPr>
+      <w:r>
+        <w:t>데이터 담당의 첫 번째 본격 데이터 개발 계획</w:t>
+      </w:r>
+    </w:p>
+    <w:p>
+      <w:pPr>
+        <w:numPr>
+          <w:ilvl w:val="1"/>
+          <w:numId w:val="23"/>
+        </w:numPr>
+      </w:pPr>
+      <w:r>
+        <w:t>데이터 파이프라인 Slice 0~10을 하나의 계획 문서에서 관리</w:t>
+      </w:r>
+    </w:p>
+    <w:p>
+      <w:pPr>
+        <w:numPr>
+          <w:ilvl w:val="0"/>
+          <w:numId w:val="23"/>
+        </w:numPr>
+      </w:pPr>
+      <w:r>
+        <w:t>향후 실제 데이터 개발 기록</w:t>
+      </w:r>
+    </w:p>
+    <w:p>
+      <w:pPr>
+        <w:numPr>
+          <w:ilvl w:val="1"/>
+          <w:numId w:val="23"/>
+        </w:numPr>
+      </w:pPr>
+      <w:r>
+        <w:t>데이터 Schema Forest: development_notes/data_schema.md</w:t>
+      </w:r>
+    </w:p>
+    <w:p>
+      <w:pPr>
+        <w:numPr>
+          <w:ilvl w:val="1"/>
+          <w:numId w:val="23"/>
+        </w:numPr>
+      </w:pPr>
+      <w:r>
+        <w:t>수집·</w:t>
+      </w:r>
+      <w:proofErr w:type="spellStart"/>
+      <w:r>
+        <w:t>크롤링</w:t>
+      </w:r>
+      <w:proofErr w:type="spellEnd"/>
+      <w:r>
+        <w:t xml:space="preserve"> Forest: development_notes/data_collection.md</w:t>
+      </w:r>
+    </w:p>
+    <w:p>
+      <w:pPr>
+        <w:numPr>
+          <w:ilvl w:val="1"/>
+          <w:numId w:val="23"/>
+        </w:numPr>
+      </w:pPr>
+      <w:r>
+        <w:t>정규화 Forest: development_notes/normalization.md</w:t>
+      </w:r>
+    </w:p>
+    <w:p>
+      <w:pPr>
+        <w:numPr>
+          <w:ilvl w:val="1"/>
+          <w:numId w:val="23"/>
+        </w:numPr>
+      </w:pPr>
+      <w:proofErr w:type="spellStart"/>
+      <w:r>
+        <w:t>Fixture·Seed</w:t>
+      </w:r>
+      <w:proofErr w:type="spellEnd"/>
+      <w:r>
+        <w:t xml:space="preserve"> Forest: 필요하면 별도 Forest로 분리</w:t>
+      </w:r>
+    </w:p>
+    <w:p>
+      <w:r>
+        <w:t>즉:</w:t>
+      </w:r>
+    </w:p>
+    <w:p>
+      <w:r>
+        <w:t>Forest 하나</w:t>
+      </w:r>
+    </w:p>
+    <w:p>
+      <w:r>
+        <w:t>├── 개발 계획 문서 하나</w:t>
+      </w:r>
+    </w:p>
+    <w:p>
+      <w:r>
+        <w:t>└── 상세 개발 기록 문서 하나</w:t>
+      </w:r>
+    </w:p>
+    <w:p>
+      <w:r>
+        <w:t xml:space="preserve">    └── 내부에서 Slice별 진행 내용 구분</w:t>
+      </w:r>
+    </w:p>
+    <w:p>
+      <w:r>
+        <w:t>현재 만들어진 다음 문서들은 너무 잘게 나뉜 것이므로 제거하고:</w:t>
+      </w:r>
+    </w:p>
+    <w:p>
+      <w:r>
+        <w:t>collaboration_policy.md</w:t>
+      </w:r>
+    </w:p>
+    <w:p>
+      <w:r>
+        <w:t>architecture_baseline.md</w:t>
+      </w:r>
+    </w:p>
+    <w:p>
+      <w:r>
+        <w:t>data_documentation_baseline.md</w:t>
+      </w:r>
+    </w:p>
+    <w:p>
+      <w:r>
+        <w:t xml:space="preserve">내용을 모두 development_notes/docs_system.md 안의 D2, D3, D4 </w:t>
+      </w:r>
+      <w:proofErr w:type="spellStart"/>
+      <w:r>
+        <w:t>섹션으로</w:t>
+      </w:r>
+      <w:proofErr w:type="spellEnd"/>
+      <w:r>
+        <w:t xml:space="preserve"> 통합해야 한다.</w:t>
+      </w:r>
+    </w:p>
+    <w:p>
+      <w:r>
+        <w:t>또한 기존 루트 수준의:</w:t>
+      </w:r>
+    </w:p>
+    <w:p>
+      <w:r>
+        <w:t>docs/</w:t>
+      </w:r>
+      <w:proofErr w:type="spellStart"/>
+      <w:r>
+        <w:t>develop_plan</w:t>
+      </w:r>
+      <w:proofErr w:type="spellEnd"/>
+      <w:r>
+        <w:t>/</w:t>
+      </w:r>
+    </w:p>
+    <w:p>
+      <w:r>
+        <w:lastRenderedPageBreak/>
+        <w:t>은 다음으로 이동해야 한다.</w:t>
+      </w:r>
+    </w:p>
+    <w:p>
+      <w:r>
+        <w:t>docs/development/</w:t>
+      </w:r>
+      <w:proofErr w:type="spellStart"/>
+      <w:r>
+        <w:t>develop_plan</w:t>
+      </w:r>
+      <w:proofErr w:type="spellEnd"/>
+      <w:r>
+        <w:t>/</w:t>
+      </w:r>
+    </w:p>
+    <w:p>
+      <w:r>
+        <w:t>이 구조가 계획과 실제 개발 결과를 같은 개발 영역 아래에서 대응시켜 가장 깔끔하다. 아직 이번 메시지에서는 추가 수정하지 않았다. 다음 수정에서는 이 구조로 정확히 교정하면 된다.</w:t>
+      </w:r>
+    </w:p>
+    <w:p>
+      <w:pPr>
+        <w:widowControl/>
+        <w:wordWrap/>
+        <w:autoSpaceDE/>
+        <w:autoSpaceDN/>
+      </w:pPr>
+      <w:r>
+        <w:br w:type="page"/>
+      </w:r>
+    </w:p>
+    <w:p>
+      <w:r>
+        <w:rPr>
+          <w:rFonts w:hint="eastAsia"/>
+        </w:rPr>
+        <w:lastRenderedPageBreak/>
+        <w:t>8.</w:t>
+      </w:r>
+    </w:p>
+    <w:p>
+      <w:r>
+        <w:t>정하자. 그리고 governance나 index에 지금 한 것과 다른 내용이 있다면 올바르게 수정하자.</w:t>
+      </w:r>
+    </w:p>
+    <w:p>
+      <w:r>
+        <w:t>5:28 PM</w:t>
+      </w:r>
+    </w:p>
+    <w:p>
+      <w:r>
+        <w:t>Worked for 6m 20s</w:t>
+      </w:r>
+    </w:p>
+    <w:p>
+      <w:r>
+        <w:t xml:space="preserve">Forest 기준으로 문서 구조를 올바르게 교정했습니다. </w:t>
+      </w:r>
+      <w:proofErr w:type="spellStart"/>
+      <w:r>
+        <w:t>커밋은</w:t>
+      </w:r>
+      <w:proofErr w:type="spellEnd"/>
+      <w:r>
+        <w:t xml:space="preserve"> 하지 않았습니다.</w:t>
+      </w:r>
+    </w:p>
+    <w:p>
+      <w:r>
+        <w:t>최종 구조:</w:t>
+      </w:r>
+    </w:p>
+    <w:p>
+      <w:r>
+        <w:t>docs/development/</w:t>
+      </w:r>
+    </w:p>
+    <w:p>
+      <w:r>
+        <w:t>├── README.md</w:t>
+      </w:r>
+    </w:p>
+    <w:p>
+      <w:r>
+        <w:t xml:space="preserve">├── </w:t>
+      </w:r>
+      <w:proofErr w:type="spellStart"/>
+      <w:r>
+        <w:t>develop_plan</w:t>
+      </w:r>
+      <w:proofErr w:type="spellEnd"/>
+      <w:r>
+        <w:t>/</w:t>
+      </w:r>
+    </w:p>
+    <w:p>
+      <w:r>
+        <w:t>│   ├── README.md</w:t>
+      </w:r>
+    </w:p>
+    <w:p>
+      <w:r>
+        <w:t>│   └── 01_docs_system.md</w:t>
+      </w:r>
+    </w:p>
+    <w:p>
+      <w:r>
+        <w:t xml:space="preserve">└── </w:t>
+      </w:r>
+      <w:proofErr w:type="spellStart"/>
+      <w:r>
+        <w:t>development_notes</w:t>
+      </w:r>
+      <w:proofErr w:type="spellEnd"/>
+      <w:r>
+        <w:t>/</w:t>
+      </w:r>
+    </w:p>
+    <w:p>
+      <w:r>
+        <w:t xml:space="preserve">    ├── README.md</w:t>
+      </w:r>
+    </w:p>
+    <w:p>
+      <w:r>
+        <w:t xml:space="preserve">    └── docs_system.md</w:t>
+      </w:r>
+    </w:p>
+    <w:p>
+      <w:r>
+        <w:t>핵심 변경:</w:t>
+      </w:r>
+    </w:p>
+    <w:p>
+      <w:pPr>
+        <w:numPr>
+          <w:ilvl w:val="0"/>
+          <w:numId w:val="24"/>
+        </w:numPr>
+      </w:pPr>
+      <w:r>
+        <w:t>개발 계획과 개발 기록을 docs/</w:t>
+      </w:r>
+      <w:proofErr w:type="gramStart"/>
+      <w:r>
+        <w:t>development/ 아래로</w:t>
+      </w:r>
+      <w:proofErr w:type="gramEnd"/>
+      <w:r>
+        <w:t xml:space="preserve"> 통합</w:t>
+      </w:r>
+    </w:p>
+    <w:p>
+      <w:pPr>
+        <w:numPr>
+          <w:ilvl w:val="0"/>
+          <w:numId w:val="24"/>
+        </w:numPr>
+      </w:pPr>
+      <w:r>
+        <w:t>Docs System Forest에 계획 문서와 개발 기록 문서 각각 하나만 유지</w:t>
+      </w:r>
+    </w:p>
+    <w:p>
+      <w:pPr>
+        <w:numPr>
+          <w:ilvl w:val="0"/>
+          <w:numId w:val="24"/>
+        </w:numPr>
+      </w:pPr>
+      <w:r>
+        <w:t>D0~D6은 각 문서 내부의 Slice 섹션과 진행표로 관리</w:t>
+      </w:r>
+    </w:p>
+    <w:p>
+      <w:pPr>
+        <w:numPr>
+          <w:ilvl w:val="0"/>
+          <w:numId w:val="24"/>
+        </w:numPr>
+      </w:pPr>
+      <w:r>
+        <w:t>D0~D4의 상세 기록을 docs_system.md 하나로 통합</w:t>
+      </w:r>
+    </w:p>
+    <w:p>
+      <w:pPr>
+        <w:numPr>
+          <w:ilvl w:val="0"/>
+          <w:numId w:val="24"/>
+        </w:numPr>
+      </w:pPr>
+      <w:r>
+        <w:t>D5는 현재 일부가 구현됐으므로 in-progress로 표시</w:t>
+      </w:r>
+    </w:p>
+    <w:p>
+      <w:pPr>
+        <w:numPr>
+          <w:ilvl w:val="0"/>
+          <w:numId w:val="24"/>
+        </w:numPr>
+      </w:pPr>
+      <w:r>
+        <w:t>기존 세분화 개발 기록 3개와 docs/</w:t>
+      </w:r>
+      <w:proofErr w:type="spellStart"/>
+      <w:r>
+        <w:t>develop_</w:t>
+      </w:r>
+      <w:proofErr w:type="gramStart"/>
+      <w:r>
+        <w:t>plan</w:t>
+      </w:r>
+      <w:proofErr w:type="spellEnd"/>
+      <w:r>
+        <w:t>/ 제거</w:t>
+      </w:r>
+      <w:proofErr w:type="gramEnd"/>
+    </w:p>
+    <w:p>
+      <w:pPr>
+        <w:numPr>
+          <w:ilvl w:val="0"/>
+          <w:numId w:val="24"/>
+        </w:numPr>
+      </w:pPr>
+      <w:r>
+        <w:t xml:space="preserve">Governance, Index, 각 영역 README의 이전 경로와 </w:t>
+      </w:r>
+      <w:proofErr w:type="spellStart"/>
+      <w:r>
+        <w:t>작업별</w:t>
+      </w:r>
+      <w:proofErr w:type="spellEnd"/>
+      <w:r>
+        <w:t xml:space="preserve"> 기록 표현 수정</w:t>
+      </w:r>
+    </w:p>
+    <w:p>
+      <w:pPr>
+        <w:numPr>
+          <w:ilvl w:val="0"/>
+          <w:numId w:val="24"/>
+        </w:numPr>
+      </w:pPr>
+      <w:r>
+        <w:t>첫 Data Forest 계획은 D5에서 정확하게 작성하도록 미리 생성하지 않음</w:t>
+      </w:r>
+    </w:p>
+    <w:p>
+      <w:r>
+        <w:t>검증 결과:</w:t>
+      </w:r>
+    </w:p>
+    <w:p>
+      <w:pPr>
+        <w:numPr>
+          <w:ilvl w:val="0"/>
+          <w:numId w:val="25"/>
+        </w:numPr>
+      </w:pPr>
+      <w:r>
+        <w:lastRenderedPageBreak/>
+        <w:t>Forest 계획과 개발 기록의 상호 링크 정상</w:t>
+      </w:r>
+    </w:p>
+    <w:p>
+      <w:pPr>
+        <w:numPr>
+          <w:ilvl w:val="0"/>
+          <w:numId w:val="25"/>
+        </w:numPr>
+      </w:pPr>
+      <w:r>
+        <w:t>Docs Forest D0~D6 모두 계획·기록에 포함</w:t>
+      </w:r>
+    </w:p>
+    <w:p>
+      <w:pPr>
+        <w:numPr>
+          <w:ilvl w:val="0"/>
+          <w:numId w:val="25"/>
+        </w:numPr>
+      </w:pPr>
+      <w:r>
+        <w:t>이전 docs/</w:t>
+      </w:r>
+      <w:proofErr w:type="spellStart"/>
+      <w:r>
+        <w:t>develop_</w:t>
+      </w:r>
+      <w:proofErr w:type="gramStart"/>
+      <w:r>
+        <w:t>plan</w:t>
+      </w:r>
+      <w:proofErr w:type="spellEnd"/>
+      <w:r>
+        <w:t>/ 경로와</w:t>
+      </w:r>
+      <w:proofErr w:type="gramEnd"/>
+      <w:r>
+        <w:t xml:space="preserve"> 세분화 문서 참조 없음</w:t>
+      </w:r>
+    </w:p>
+    <w:p>
+      <w:pPr>
+        <w:numPr>
+          <w:ilvl w:val="0"/>
+          <w:numId w:val="25"/>
+        </w:numPr>
+      </w:pPr>
+      <w:r>
+        <w:t>Markdown 링크 정상</w:t>
+      </w:r>
+    </w:p>
+    <w:p>
+      <w:pPr>
+        <w:numPr>
+          <w:ilvl w:val="0"/>
+          <w:numId w:val="25"/>
+        </w:numPr>
+      </w:pPr>
+      <w:r>
+        <w:t>빈 파일·빈 디렉터리 없음</w:t>
+      </w:r>
+    </w:p>
+    <w:p>
+      <w:pPr>
+        <w:numPr>
+          <w:ilvl w:val="0"/>
+          <w:numId w:val="25"/>
+        </w:numPr>
+      </w:pPr>
+      <w:r>
+        <w:t>git diff --check 통과</w:t>
+      </w:r>
+    </w:p>
+    <w:p>
+      <w:pPr>
+        <w:numPr>
+          <w:ilvl w:val="0"/>
+          <w:numId w:val="25"/>
+        </w:numPr>
+      </w:pPr>
+      <w:r>
+        <w:t>사용자 수정 Word 문서 보존</w:t>
+      </w:r>
+    </w:p>
+    <w:p>
+      <w:pPr>
+        <w:numPr>
+          <w:ilvl w:val="0"/>
+          <w:numId w:val="25"/>
+        </w:numPr>
+      </w:pPr>
+      <w:r>
+        <w:t>임시 파일 없음</w:t>
+      </w:r>
+    </w:p>
+    <w:p>
+      <w:r>
+        <w:t>간단한 코드 리뷰: 차단할 문제는 없습니다. 이제 계획과 기록이 Forest당 하나씩 대응하고, Slice는 내부 진행 단위로만 사용됩니다. 장기적으로도 Data Schema, Data Collection, Normalization 등의 Forest별 문서를 정확하고 상세하게 추가할 수 있는 구조입니다.</w:t>
+      </w:r>
+    </w:p>
+    <w:p>
+      <w:r>
+        <w:t xml:space="preserve">구조 교정용 </w:t>
+      </w:r>
+      <w:proofErr w:type="spellStart"/>
+      <w:r>
+        <w:t>커밋</w:t>
+      </w:r>
+      <w:proofErr w:type="spellEnd"/>
+      <w:r>
+        <w:t xml:space="preserve"> 메시지:</w:t>
+      </w:r>
+    </w:p>
+    <w:p>
+      <w:r>
+        <w:t>docs(development): organize plans and notes by forest</w:t>
+      </w:r>
+    </w:p>
+    <w:p>
+      <w:r>
+        <w:t xml:space="preserve">현재 </w:t>
+      </w:r>
+      <w:proofErr w:type="spellStart"/>
+      <w:r>
+        <w:t>미커밋</w:t>
+      </w:r>
+      <w:proofErr w:type="spellEnd"/>
+      <w:r>
+        <w:t xml:space="preserve"> D4 변경까지 함께 커밋한다면 다음이 더 정확합니다.</w:t>
+      </w:r>
+    </w:p>
+    <w:p>
+      <w:r>
+        <w:t>docs(development): align data baseline with forest documentation</w:t>
+      </w:r>
+    </w:p>
+    <w:p>
+      <w:r>
+        <w:t xml:space="preserve">다음 작업도 현재 </w:t>
+      </w:r>
+      <w:proofErr w:type="spellStart"/>
+      <w:r>
+        <w:t>브랜치에서</w:t>
+      </w:r>
+      <w:proofErr w:type="spellEnd"/>
+      <w:r>
+        <w:t xml:space="preserve"> 계속 진행하면 됩니다.</w:t>
+      </w:r>
+    </w:p>
+    <w:p>
+      <w:pPr>
+        <w:widowControl/>
+        <w:wordWrap/>
+        <w:autoSpaceDE/>
+        <w:autoSpaceDN/>
+      </w:pPr>
+      <w:r>
+        <w:br w:type="page"/>
+      </w:r>
+    </w:p>
+    <w:p>
+      <w:r>
+        <w:rPr>
+          <w:rFonts w:hint="eastAsia"/>
+        </w:rPr>
+        <w:lastRenderedPageBreak/>
+        <w:t>9.</w:t>
+      </w:r>
+    </w:p>
+    <w:p>
+      <w:r>
+        <w:t xml:space="preserve">D5를 완료 처리하고 D6까지 구현했습니다. </w:t>
+      </w:r>
+      <w:proofErr w:type="spellStart"/>
+      <w:r>
+        <w:t>커밋은</w:t>
+      </w:r>
+      <w:proofErr w:type="spellEnd"/>
+      <w:r>
+        <w:t xml:space="preserve"> 하지 않았습니다.</w:t>
+      </w:r>
+    </w:p>
+    <w:p>
+      <w:r>
+        <w:t>주요 결과:</w:t>
+      </w:r>
+    </w:p>
+    <w:p>
+      <w:pPr>
+        <w:numPr>
+          <w:ilvl w:val="0"/>
+          <w:numId w:val="26"/>
+        </w:numPr>
+      </w:pPr>
+      <w:r>
+        <w:t>D5에서 첫 Data Forest 계획 요구 제거</w:t>
+      </w:r>
+    </w:p>
+    <w:p>
+      <w:pPr>
+        <w:numPr>
+          <w:ilvl w:val="0"/>
+          <w:numId w:val="26"/>
+        </w:numPr>
+      </w:pPr>
+      <w:r>
+        <w:t>Docs System Forest 계획·기록 상태를 completed로 변경</w:t>
+      </w:r>
+    </w:p>
+    <w:p>
+      <w:pPr>
+        <w:numPr>
+          <w:ilvl w:val="0"/>
+          <w:numId w:val="26"/>
+        </w:numPr>
+      </w:pPr>
+      <w:r>
+        <w:t xml:space="preserve">[문서 </w:t>
+      </w:r>
+      <w:proofErr w:type="spellStart"/>
+      <w:r>
+        <w:t>검증기</w:t>
+      </w:r>
+      <w:proofErr w:type="spellEnd"/>
+      <w:r>
+        <w:t>](C:\\git\\</w:t>
+      </w:r>
+      <w:proofErr w:type="spellStart"/>
+      <w:r>
+        <w:t>cheongnyeon-alimi</w:t>
+      </w:r>
+      <w:proofErr w:type="spellEnd"/>
+      <w:r>
+        <w:t>\\scripts\\validate_docs.py) 추가</w:t>
+      </w:r>
+    </w:p>
+    <w:p>
+      <w:pPr>
+        <w:numPr>
+          <w:ilvl w:val="0"/>
+          <w:numId w:val="26"/>
+        </w:numPr>
+      </w:pPr>
+      <w:r>
+        <w:t>[단위 테스트](C:\\git\\</w:t>
+      </w:r>
+      <w:proofErr w:type="spellStart"/>
+      <w:r>
+        <w:t>cheongnyeon-alimi</w:t>
+      </w:r>
+      <w:proofErr w:type="spellEnd"/>
+      <w:r>
+        <w:t>\\tests\\test_validate_docs.py) 추가</w:t>
+      </w:r>
+    </w:p>
+    <w:p>
+      <w:pPr>
+        <w:numPr>
+          <w:ilvl w:val="0"/>
+          <w:numId w:val="26"/>
+        </w:numPr>
+      </w:pPr>
+      <w:r>
+        <w:t>[문서 품질 검증 가이드](C:\\git\\cheongnyeon-alimi\\docs\\development\\documentation_validation.md) 추가</w:t>
+      </w:r>
+    </w:p>
+    <w:p>
+      <w:pPr>
+        <w:numPr>
+          <w:ilvl w:val="0"/>
+          <w:numId w:val="26"/>
+        </w:numPr>
+      </w:pPr>
+      <w:r>
+        <w:t>Governance와 docs index에 실행 규칙 연결</w:t>
+      </w:r>
+    </w:p>
+    <w:p>
+      <w:r>
+        <w:t>검증기는 다음을 검사합니다.</w:t>
+      </w:r>
+    </w:p>
+    <w:p>
+      <w:pPr>
+        <w:numPr>
+          <w:ilvl w:val="0"/>
+          <w:numId w:val="27"/>
+        </w:numPr>
+      </w:pPr>
+      <w:r>
+        <w:t>필수 문서</w:t>
+      </w:r>
+    </w:p>
+    <w:p>
+      <w:pPr>
+        <w:numPr>
+          <w:ilvl w:val="0"/>
+          <w:numId w:val="27"/>
+        </w:numPr>
+      </w:pPr>
+      <w:r>
+        <w:t>Markdown 상대 링크</w:t>
+      </w:r>
+    </w:p>
+    <w:p>
+      <w:pPr>
+        <w:numPr>
+          <w:ilvl w:val="0"/>
+          <w:numId w:val="27"/>
+        </w:numPr>
+      </w:pPr>
+      <w:r>
+        <w:t>이전 저장소명</w:t>
+      </w:r>
+    </w:p>
+    <w:p>
+      <w:pPr>
+        <w:numPr>
+          <w:ilvl w:val="0"/>
+          <w:numId w:val="27"/>
+        </w:numPr>
+      </w:pPr>
+      <w:proofErr w:type="spellStart"/>
+      <w:r>
+        <w:t>비밀값</w:t>
+      </w:r>
+      <w:proofErr w:type="spellEnd"/>
+      <w:r>
+        <w:t xml:space="preserve"> 할당 패턴</w:t>
+      </w:r>
+    </w:p>
+    <w:p>
+      <w:pPr>
+        <w:numPr>
+          <w:ilvl w:val="0"/>
+          <w:numId w:val="27"/>
+        </w:numPr>
+      </w:pPr>
+      <w:r>
+        <w:t>빈 문서·디렉터리</w:t>
+      </w:r>
+    </w:p>
+    <w:p>
+      <w:pPr>
+        <w:numPr>
+          <w:ilvl w:val="0"/>
+          <w:numId w:val="27"/>
+        </w:numPr>
+      </w:pPr>
+      <w:r>
+        <w:t>Forest 계획과 개발 기록의 대응</w:t>
+      </w:r>
+    </w:p>
+    <w:p>
+      <w:pPr>
+        <w:numPr>
+          <w:ilvl w:val="0"/>
+          <w:numId w:val="27"/>
+        </w:numPr>
+      </w:pPr>
+      <w:r>
+        <w:t xml:space="preserve">필수 섹션과 </w:t>
+      </w:r>
+      <w:proofErr w:type="spellStart"/>
+      <w:r>
+        <w:t>상태값</w:t>
+      </w:r>
+      <w:proofErr w:type="spellEnd"/>
+    </w:p>
+    <w:p>
+      <w:pPr>
+        <w:numPr>
+          <w:ilvl w:val="0"/>
+          <w:numId w:val="27"/>
+        </w:numPr>
+      </w:pPr>
+      <w:r>
+        <w:t>완료된 Forest의 미완료 Slice</w:t>
+      </w:r>
+    </w:p>
+    <w:p>
+      <w:r>
+        <w:t>검증 결과:</w:t>
+      </w:r>
+    </w:p>
+    <w:p>
+      <w:r>
+        <w:t>Ran 4 tests</w:t>
+      </w:r>
+    </w:p>
+    <w:p>
+      <w:r>
+        <w:t>OK</w:t>
+      </w:r>
+    </w:p>
+    <w:p>
+      <w:r>
+        <w:t>Documentation validation passed.</w:t>
+      </w:r>
+    </w:p>
+    <w:p>
+      <w:r>
+        <w:t>Temporary test artifacts: none</w:t>
+      </w:r>
+    </w:p>
+    <w:p>
+      <w:r>
+        <w:t>간단한 코드 리뷰: 차단할 문제는 없습니다. 검증 로직이 Python 표준 라이브러리만 사용해 환경 의존성이 낮고, Forest 완료 상태와 Slice 상태의 불일치도 자동으로 차단합니</w:t>
+      </w:r>
+      <w:r>
+        <w:lastRenderedPageBreak/>
+        <w:t>다.</w:t>
+      </w:r>
+    </w:p>
+    <w:p>
+      <w:r>
+        <w:t xml:space="preserve">주의: </w:t>
+      </w:r>
+      <w:proofErr w:type="spellStart"/>
+      <w:r>
+        <w:t>opensource_plan</w:t>
+      </w:r>
+      <w:proofErr w:type="spellEnd"/>
+      <w:r>
+        <w:t xml:space="preserve">/개발 노트/에 Word 임시 잠금 파일 ~$...docx가 생성돼 있습니다. 이번 작업에서는 건드리지 않았습니다. Word 문서를 닫으면 일반적으로 사라지므로 </w:t>
+      </w:r>
+      <w:proofErr w:type="spellStart"/>
+      <w:r>
+        <w:t>커밋</w:t>
+      </w:r>
+      <w:proofErr w:type="spellEnd"/>
+      <w:r>
+        <w:t xml:space="preserve"> 전에 확인하고, git </w:t>
+      </w:r>
+      <w:proofErr w:type="gramStart"/>
+      <w:r>
+        <w:t>add .은</w:t>
+      </w:r>
+      <w:proofErr w:type="gramEnd"/>
+      <w:r>
+        <w:t xml:space="preserve"> 피해야 합니다.</w:t>
+      </w:r>
+    </w:p>
+    <w:p>
+      <w:r>
+        <w:t xml:space="preserve">권장 </w:t>
+      </w:r>
+      <w:proofErr w:type="spellStart"/>
+      <w:r>
+        <w:t>커밋</w:t>
+      </w:r>
+      <w:proofErr w:type="spellEnd"/>
+      <w:r>
+        <w:t xml:space="preserve"> 메시지:</w:t>
+      </w:r>
+    </w:p>
+    <w:p>
+      <w:r>
+        <w:t>feat(docs): add documentation quality validator</w:t>
+      </w:r>
+    </w:p>
+    <w:p>
+      <w:r>
+        <w:t xml:space="preserve">안전한 </w:t>
+      </w:r>
+      <w:proofErr w:type="spellStart"/>
+      <w:r>
+        <w:t>스테이징</w:t>
+      </w:r>
+      <w:proofErr w:type="spellEnd"/>
+      <w:r>
+        <w:t xml:space="preserve"> 범위:</w:t>
+      </w:r>
+    </w:p>
+    <w:p>
+      <w:r>
+        <w:t>git add CHANGELOG.md docs scripts/validate_docs.py tests/test_validate_docs.py</w:t>
+      </w:r>
+    </w:p>
+    <w:p>
+      <w:r>
+        <w:t xml:space="preserve">Docs System Forest는 D0~D6까지 완료됐습니다. 새 </w:t>
+      </w:r>
+      <w:proofErr w:type="spellStart"/>
+      <w:r>
+        <w:t>브랜치는</w:t>
+      </w:r>
+      <w:proofErr w:type="spellEnd"/>
+      <w:r>
+        <w:t xml:space="preserve"> 만들 필요 없습니다.</w:t>
       </w:r>
     </w:p>
     <w:p>
@@ -2042,6 +4569,304 @@
 <file path=word/numbering.xml><?xml version="1.0" encoding="utf-8"?>
 <w:numbering xmlns:wpc="http://schemas.microsoft.com/office/word/2010/wordprocessingCanvas" xmlns:cx="http://schemas.microsoft.com/office/drawing/2014/chartex" xmlns:cx1="http://schemas.microsoft.com/office/drawing/2015/9/8/chartex" xmlns:cx2="http://schemas.microsoft.com/office/drawing/2015/10/21/chartex" xmlns:cx3="http://schemas.microsoft.com/office/drawing/2016/5/9/chartex" xmlns:cx4="http://schemas.microsoft.com/office/drawing/2016/5/10/chartex" xmlns:cx5="http://schemas.microsoft.com/office/drawing/2016/5/11/chartex" xmlns:cx6="http://schemas.microsoft.com/office/drawing/2016/5/12/chartex" xmlns:cx7="http://schemas.microsoft.com/office/drawing/2016/5/13/chartex" xmlns:cx8="http://schemas.microsoft.com/office/drawing/2016/5/14/chartex" xmlns:mc="http://schemas.openxmlformats.org/markup-compatibility/2006" xmlns:aink="http://schemas.microsoft.com/office/drawing/2016/ink" xmlns:am3d="http://schemas.microsoft.com/office/drawing/2017/model3d" xmlns:o="urn:schemas-microsoft-com:office:office" xmlns:oel="http://schemas.microsoft.com/office/2019/extlst" xmlns:r="http://schemas.openxmlformats.org/officeDocument/2006/relationships" xmlns:m="http://schemas.openxmlformats.org/officeDocument/2006/math" xmlns:v="urn:schemas-microsoft-com:vml" xmlns:wp14="http://schemas.microsoft.com/office/word/2010/wordprocessingDrawing" xmlns:wp="http://schemas.openxmlformats.org/drawingml/2006/wordprocessingDrawing" xmlns:w10="urn:schemas-microsoft-com:office:word" xmlns:w="http://schemas.openxmlformats.org/wordprocessingml/2006/main" xmlns:w14="http://schemas.microsoft.com/office/word/2010/wordml" xmlns:w15="http://schemas.microsoft.com/office/word/2012/wordml" xmlns:w16cex="http://schemas.microsoft.com/office/word/2018/wordml/cex" xmlns:w16cid="http://schemas.microsoft.com/office/word/2016/wordml/cid" xmlns:w16="http://schemas.microsoft.com/office/word/2018/wordml" xmlns:w16sdtdh="http://schemas.microsoft.com/office/word/2020/wordml/sdtdatahash" xmlns:w16se="http://schemas.microsoft.com/office/word/2015/wordml/symex" xmlns:wpg="http://schemas.microsoft.com/office/word/2010/wordprocessingGroup" xmlns:wpi="http://schemas.microsoft.com/office/word/2010/wordprocessingInk" xmlns:wne="http://schemas.microsoft.com/office/word/2006/wordml" xmlns:wps="http://schemas.microsoft.com/office/word/2010/wordprocessingShape" mc:Ignorable="w14 w15 w16se w16cid w16 w16cex w16sdtdh wp14">
   <w:abstractNum w:abstractNumId="0" w15:restartNumberingAfterBreak="0">
+    <w:nsid w:val="018331F9"/>
+    <w:multiLevelType w:val="multilevel"/>
+    <w:tmpl w:val="ABC88C5C"/>
+    <w:lvl w:ilvl="0">
+      <w:start w:val="1"/>
+      <w:numFmt w:val="bullet"/>
+      <w:lvlText w:val=""/>
+      <w:lvlJc w:val="left"/>
+      <w:pPr>
+        <w:tabs>
+          <w:tab w:val="num" w:pos="720"/>
+        </w:tabs>
+        <w:ind w:left="720" w:hanging="360"/>
+      </w:pPr>
+      <w:rPr>
+        <w:rFonts w:ascii="Symbol" w:hAnsi="Symbol" w:hint="default"/>
+        <w:sz w:val="20"/>
+      </w:rPr>
+    </w:lvl>
+    <w:lvl w:ilvl="1" w:tentative="1">
+      <w:start w:val="1"/>
+      <w:numFmt w:val="bullet"/>
+      <w:lvlText w:val="o"/>
+      <w:lvlJc w:val="left"/>
+      <w:pPr>
+        <w:tabs>
+          <w:tab w:val="num" w:pos="1440"/>
+        </w:tabs>
+        <w:ind w:left="1440" w:hanging="360"/>
+      </w:pPr>
+      <w:rPr>
+        <w:rFonts w:ascii="Courier New" w:hAnsi="Courier New" w:hint="default"/>
+        <w:sz w:val="20"/>
+      </w:rPr>
+    </w:lvl>
+    <w:lvl w:ilvl="2" w:tentative="1">
+      <w:start w:val="1"/>
+      <w:numFmt w:val="bullet"/>
+      <w:lvlText w:val=""/>
+      <w:lvlJc w:val="left"/>
+      <w:pPr>
+        <w:tabs>
+          <w:tab w:val="num" w:pos="2160"/>
+        </w:tabs>
+        <w:ind w:left="2160" w:hanging="360"/>
+      </w:pPr>
+      <w:rPr>
+        <w:rFonts w:ascii="Wingdings" w:hAnsi="Wingdings" w:hint="default"/>
+        <w:sz w:val="20"/>
+      </w:rPr>
+    </w:lvl>
+    <w:lvl w:ilvl="3" w:tentative="1">
+      <w:start w:val="1"/>
+      <w:numFmt w:val="bullet"/>
+      <w:lvlText w:val=""/>
+      <w:lvlJc w:val="left"/>
+      <w:pPr>
+        <w:tabs>
+          <w:tab w:val="num" w:pos="2880"/>
+        </w:tabs>
+        <w:ind w:left="2880" w:hanging="360"/>
+      </w:pPr>
+      <w:rPr>
+        <w:rFonts w:ascii="Wingdings" w:hAnsi="Wingdings" w:hint="default"/>
+        <w:sz w:val="20"/>
+      </w:rPr>
+    </w:lvl>
+    <w:lvl w:ilvl="4" w:tentative="1">
+      <w:start w:val="1"/>
+      <w:numFmt w:val="bullet"/>
+      <w:lvlText w:val=""/>
+      <w:lvlJc w:val="left"/>
+      <w:pPr>
+        <w:tabs>
+          <w:tab w:val="num" w:pos="3600"/>
+        </w:tabs>
+        <w:ind w:left="3600" w:hanging="360"/>
+      </w:pPr>
+      <w:rPr>
+        <w:rFonts w:ascii="Wingdings" w:hAnsi="Wingdings" w:hint="default"/>
+        <w:sz w:val="20"/>
+      </w:rPr>
+    </w:lvl>
+    <w:lvl w:ilvl="5" w:tentative="1">
+      <w:start w:val="1"/>
+      <w:numFmt w:val="bullet"/>
+      <w:lvlText w:val=""/>
+      <w:lvlJc w:val="left"/>
+      <w:pPr>
+        <w:tabs>
+          <w:tab w:val="num" w:pos="4320"/>
+        </w:tabs>
+        <w:ind w:left="4320" w:hanging="360"/>
+      </w:pPr>
+      <w:rPr>
+        <w:rFonts w:ascii="Wingdings" w:hAnsi="Wingdings" w:hint="default"/>
+        <w:sz w:val="20"/>
+      </w:rPr>
+    </w:lvl>
+    <w:lvl w:ilvl="6" w:tentative="1">
+      <w:start w:val="1"/>
+      <w:numFmt w:val="bullet"/>
+      <w:lvlText w:val=""/>
+      <w:lvlJc w:val="left"/>
+      <w:pPr>
+        <w:tabs>
+          <w:tab w:val="num" w:pos="5040"/>
+        </w:tabs>
+        <w:ind w:left="5040" w:hanging="360"/>
+      </w:pPr>
+      <w:rPr>
+        <w:rFonts w:ascii="Wingdings" w:hAnsi="Wingdings" w:hint="default"/>
+        <w:sz w:val="20"/>
+      </w:rPr>
+    </w:lvl>
+    <w:lvl w:ilvl="7" w:tentative="1">
+      <w:start w:val="1"/>
+      <w:numFmt w:val="bullet"/>
+      <w:lvlText w:val=""/>
+      <w:lvlJc w:val="left"/>
+      <w:pPr>
+        <w:tabs>
+          <w:tab w:val="num" w:pos="5760"/>
+        </w:tabs>
+        <w:ind w:left="5760" w:hanging="360"/>
+      </w:pPr>
+      <w:rPr>
+        <w:rFonts w:ascii="Wingdings" w:hAnsi="Wingdings" w:hint="default"/>
+        <w:sz w:val="20"/>
+      </w:rPr>
+    </w:lvl>
+    <w:lvl w:ilvl="8" w:tentative="1">
+      <w:start w:val="1"/>
+      <w:numFmt w:val="bullet"/>
+      <w:lvlText w:val=""/>
+      <w:lvlJc w:val="left"/>
+      <w:pPr>
+        <w:tabs>
+          <w:tab w:val="num" w:pos="6480"/>
+        </w:tabs>
+        <w:ind w:left="6480" w:hanging="360"/>
+      </w:pPr>
+      <w:rPr>
+        <w:rFonts w:ascii="Wingdings" w:hAnsi="Wingdings" w:hint="default"/>
+        <w:sz w:val="20"/>
+      </w:rPr>
+    </w:lvl>
+  </w:abstractNum>
+  <w:abstractNum w:abstractNumId="1" w15:restartNumberingAfterBreak="0">
+    <w:nsid w:val="02E958EA"/>
+    <w:multiLevelType w:val="multilevel"/>
+    <w:tmpl w:val="86A60BC8"/>
+    <w:lvl w:ilvl="0">
+      <w:start w:val="1"/>
+      <w:numFmt w:val="bullet"/>
+      <w:lvlText w:val=""/>
+      <w:lvlJc w:val="left"/>
+      <w:pPr>
+        <w:tabs>
+          <w:tab w:val="num" w:pos="720"/>
+        </w:tabs>
+        <w:ind w:left="720" w:hanging="360"/>
+      </w:pPr>
+      <w:rPr>
+        <w:rFonts w:ascii="Symbol" w:hAnsi="Symbol" w:hint="default"/>
+        <w:sz w:val="20"/>
+      </w:rPr>
+    </w:lvl>
+    <w:lvl w:ilvl="1" w:tentative="1">
+      <w:start w:val="1"/>
+      <w:numFmt w:val="bullet"/>
+      <w:lvlText w:val="o"/>
+      <w:lvlJc w:val="left"/>
+      <w:pPr>
+        <w:tabs>
+          <w:tab w:val="num" w:pos="1440"/>
+        </w:tabs>
+        <w:ind w:left="1440" w:hanging="360"/>
+      </w:pPr>
+      <w:rPr>
+        <w:rFonts w:ascii="Courier New" w:hAnsi="Courier New" w:hint="default"/>
+        <w:sz w:val="20"/>
+      </w:rPr>
+    </w:lvl>
+    <w:lvl w:ilvl="2" w:tentative="1">
+      <w:start w:val="1"/>
+      <w:numFmt w:val="bullet"/>
+      <w:lvlText w:val=""/>
+      <w:lvlJc w:val="left"/>
+      <w:pPr>
+        <w:tabs>
+          <w:tab w:val="num" w:pos="2160"/>
+        </w:tabs>
+        <w:ind w:left="2160" w:hanging="360"/>
+      </w:pPr>
+      <w:rPr>
+        <w:rFonts w:ascii="Wingdings" w:hAnsi="Wingdings" w:hint="default"/>
+        <w:sz w:val="20"/>
+      </w:rPr>
+    </w:lvl>
+    <w:lvl w:ilvl="3" w:tentative="1">
+      <w:start w:val="1"/>
+      <w:numFmt w:val="bullet"/>
+      <w:lvlText w:val=""/>
+      <w:lvlJc w:val="left"/>
+      <w:pPr>
+        <w:tabs>
+          <w:tab w:val="num" w:pos="2880"/>
+        </w:tabs>
+        <w:ind w:left="2880" w:hanging="360"/>
+      </w:pPr>
+      <w:rPr>
+        <w:rFonts w:ascii="Wingdings" w:hAnsi="Wingdings" w:hint="default"/>
+        <w:sz w:val="20"/>
+      </w:rPr>
+    </w:lvl>
+    <w:lvl w:ilvl="4" w:tentative="1">
+      <w:start w:val="1"/>
+      <w:numFmt w:val="bullet"/>
+      <w:lvlText w:val=""/>
+      <w:lvlJc w:val="left"/>
+      <w:pPr>
+        <w:tabs>
+          <w:tab w:val="num" w:pos="3600"/>
+        </w:tabs>
+        <w:ind w:left="3600" w:hanging="360"/>
+      </w:pPr>
+      <w:rPr>
+        <w:rFonts w:ascii="Wingdings" w:hAnsi="Wingdings" w:hint="default"/>
+        <w:sz w:val="20"/>
+      </w:rPr>
+    </w:lvl>
+    <w:lvl w:ilvl="5" w:tentative="1">
+      <w:start w:val="1"/>
+      <w:numFmt w:val="bullet"/>
+      <w:lvlText w:val=""/>
+      <w:lvlJc w:val="left"/>
+      <w:pPr>
+        <w:tabs>
+          <w:tab w:val="num" w:pos="4320"/>
+        </w:tabs>
+        <w:ind w:left="4320" w:hanging="360"/>
+      </w:pPr>
+      <w:rPr>
+        <w:rFonts w:ascii="Wingdings" w:hAnsi="Wingdings" w:hint="default"/>
+        <w:sz w:val="20"/>
+      </w:rPr>
+    </w:lvl>
+    <w:lvl w:ilvl="6" w:tentative="1">
+      <w:start w:val="1"/>
+      <w:numFmt w:val="bullet"/>
+      <w:lvlText w:val=""/>
+      <w:lvlJc w:val="left"/>
+      <w:pPr>
+        <w:tabs>
+          <w:tab w:val="num" w:pos="5040"/>
+        </w:tabs>
+        <w:ind w:left="5040" w:hanging="360"/>
+      </w:pPr>
+      <w:rPr>
+        <w:rFonts w:ascii="Wingdings" w:hAnsi="Wingdings" w:hint="default"/>
+        <w:sz w:val="20"/>
+      </w:rPr>
+    </w:lvl>
+    <w:lvl w:ilvl="7" w:tentative="1">
+      <w:start w:val="1"/>
+      <w:numFmt w:val="bullet"/>
+      <w:lvlText w:val=""/>
+      <w:lvlJc w:val="left"/>
+      <w:pPr>
+        <w:tabs>
+          <w:tab w:val="num" w:pos="5760"/>
+        </w:tabs>
+        <w:ind w:left="5760" w:hanging="360"/>
+      </w:pPr>
+      <w:rPr>
+        <w:rFonts w:ascii="Wingdings" w:hAnsi="Wingdings" w:hint="default"/>
+        <w:sz w:val="20"/>
+      </w:rPr>
+    </w:lvl>
+    <w:lvl w:ilvl="8" w:tentative="1">
+      <w:start w:val="1"/>
+      <w:numFmt w:val="bullet"/>
+      <w:lvlText w:val=""/>
+      <w:lvlJc w:val="left"/>
+      <w:pPr>
+        <w:tabs>
+          <w:tab w:val="num" w:pos="6480"/>
+        </w:tabs>
+        <w:ind w:left="6480" w:hanging="360"/>
+      </w:pPr>
+      <w:rPr>
+        <w:rFonts w:ascii="Wingdings" w:hAnsi="Wingdings" w:hint="default"/>
+        <w:sz w:val="20"/>
+      </w:rPr>
+    </w:lvl>
+  </w:abstractNum>
+  <w:abstractNum w:abstractNumId="2" w15:restartNumberingAfterBreak="0">
     <w:nsid w:val="085C5711"/>
     <w:multiLevelType w:val="multilevel"/>
     <w:tmpl w:val="E356ECB6"/>
@@ -2190,7 +5015,156 @@
       </w:rPr>
     </w:lvl>
   </w:abstractNum>
-  <w:abstractNum w:abstractNumId="1" w15:restartNumberingAfterBreak="0">
+  <w:abstractNum w:abstractNumId="3" w15:restartNumberingAfterBreak="0">
+    <w:nsid w:val="19C72D22"/>
+    <w:multiLevelType w:val="multilevel"/>
+    <w:tmpl w:val="6AFA892C"/>
+    <w:lvl w:ilvl="0">
+      <w:start w:val="1"/>
+      <w:numFmt w:val="bullet"/>
+      <w:lvlText w:val=""/>
+      <w:lvlJc w:val="left"/>
+      <w:pPr>
+        <w:tabs>
+          <w:tab w:val="num" w:pos="720"/>
+        </w:tabs>
+        <w:ind w:left="720" w:hanging="360"/>
+      </w:pPr>
+      <w:rPr>
+        <w:rFonts w:ascii="Symbol" w:hAnsi="Symbol" w:hint="default"/>
+        <w:sz w:val="20"/>
+      </w:rPr>
+    </w:lvl>
+    <w:lvl w:ilvl="1" w:tentative="1">
+      <w:start w:val="1"/>
+      <w:numFmt w:val="bullet"/>
+      <w:lvlText w:val="o"/>
+      <w:lvlJc w:val="left"/>
+      <w:pPr>
+        <w:tabs>
+          <w:tab w:val="num" w:pos="1440"/>
+        </w:tabs>
+        <w:ind w:left="1440" w:hanging="360"/>
+      </w:pPr>
+      <w:rPr>
+        <w:rFonts w:ascii="Courier New" w:hAnsi="Courier New" w:hint="default"/>
+        <w:sz w:val="20"/>
+      </w:rPr>
+    </w:lvl>
+    <w:lvl w:ilvl="2" w:tentative="1">
+      <w:start w:val="1"/>
+      <w:numFmt w:val="bullet"/>
+      <w:lvlText w:val=""/>
+      <w:lvlJc w:val="left"/>
+      <w:pPr>
+        <w:tabs>
+          <w:tab w:val="num" w:pos="2160"/>
+        </w:tabs>
+        <w:ind w:left="2160" w:hanging="360"/>
+      </w:pPr>
+      <w:rPr>
+        <w:rFonts w:ascii="Wingdings" w:hAnsi="Wingdings" w:hint="default"/>
+        <w:sz w:val="20"/>
+      </w:rPr>
+    </w:lvl>
+    <w:lvl w:ilvl="3" w:tentative="1">
+      <w:start w:val="1"/>
+      <w:numFmt w:val="bullet"/>
+      <w:lvlText w:val=""/>
+      <w:lvlJc w:val="left"/>
+      <w:pPr>
+        <w:tabs>
+          <w:tab w:val="num" w:pos="2880"/>
+        </w:tabs>
+        <w:ind w:left="2880" w:hanging="360"/>
+      </w:pPr>
+      <w:rPr>
+        <w:rFonts w:ascii="Wingdings" w:hAnsi="Wingdings" w:hint="default"/>
+        <w:sz w:val="20"/>
+      </w:rPr>
+    </w:lvl>
+    <w:lvl w:ilvl="4" w:tentative="1">
+      <w:start w:val="1"/>
+      <w:numFmt w:val="bullet"/>
+      <w:lvlText w:val=""/>
+      <w:lvlJc w:val="left"/>
+      <w:pPr>
+        <w:tabs>
+          <w:tab w:val="num" w:pos="3600"/>
+        </w:tabs>
+        <w:ind w:left="3600" w:hanging="360"/>
+      </w:pPr>
+      <w:rPr>
+        <w:rFonts w:ascii="Wingdings" w:hAnsi="Wingdings" w:hint="default"/>
+        <w:sz w:val="20"/>
+      </w:rPr>
+    </w:lvl>
+    <w:lvl w:ilvl="5" w:tentative="1">
+      <w:start w:val="1"/>
+      <w:numFmt w:val="bullet"/>
+      <w:lvlText w:val=""/>
+      <w:lvlJc w:val="left"/>
+      <w:pPr>
+        <w:tabs>
+          <w:tab w:val="num" w:pos="4320"/>
+        </w:tabs>
+        <w:ind w:left="4320" w:hanging="360"/>
+      </w:pPr>
+      <w:rPr>
+        <w:rFonts w:ascii="Wingdings" w:hAnsi="Wingdings" w:hint="default"/>
+        <w:sz w:val="20"/>
+      </w:rPr>
+    </w:lvl>
+    <w:lvl w:ilvl="6" w:tentative="1">
+      <w:start w:val="1"/>
+      <w:numFmt w:val="bullet"/>
+      <w:lvlText w:val=""/>
+      <w:lvlJc w:val="left"/>
+      <w:pPr>
+        <w:tabs>
+          <w:tab w:val="num" w:pos="5040"/>
+        </w:tabs>
+        <w:ind w:left="5040" w:hanging="360"/>
+      </w:pPr>
+      <w:rPr>
+        <w:rFonts w:ascii="Wingdings" w:hAnsi="Wingdings" w:hint="default"/>
+        <w:sz w:val="20"/>
+      </w:rPr>
+    </w:lvl>
+    <w:lvl w:ilvl="7" w:tentative="1">
+      <w:start w:val="1"/>
+      <w:numFmt w:val="bullet"/>
+      <w:lvlText w:val=""/>
+      <w:lvlJc w:val="left"/>
+      <w:pPr>
+        <w:tabs>
+          <w:tab w:val="num" w:pos="5760"/>
+        </w:tabs>
+        <w:ind w:left="5760" w:hanging="360"/>
+      </w:pPr>
+      <w:rPr>
+        <w:rFonts w:ascii="Wingdings" w:hAnsi="Wingdings" w:hint="default"/>
+        <w:sz w:val="20"/>
+      </w:rPr>
+    </w:lvl>
+    <w:lvl w:ilvl="8" w:tentative="1">
+      <w:start w:val="1"/>
+      <w:numFmt w:val="bullet"/>
+      <w:lvlText w:val=""/>
+      <w:lvlJc w:val="left"/>
+      <w:pPr>
+        <w:tabs>
+          <w:tab w:val="num" w:pos="6480"/>
+        </w:tabs>
+        <w:ind w:left="6480" w:hanging="360"/>
+      </w:pPr>
+      <w:rPr>
+        <w:rFonts w:ascii="Wingdings" w:hAnsi="Wingdings" w:hint="default"/>
+        <w:sz w:val="20"/>
+      </w:rPr>
+    </w:lvl>
+  </w:abstractNum>
+  <w:abstractNum w:abstractNumId="4" w15:restartNumberingAfterBreak="0">
     <w:nsid w:val="1FDF5752"/>
     <w:multiLevelType w:val="multilevel"/>
     <w:tmpl w:val="79949B0C"/>
@@ -2339,7 +5313,7 @@
       </w:rPr>
     </w:lvl>
   </w:abstractNum>
-  <w:abstractNum w:abstractNumId="2" w15:restartNumberingAfterBreak="0">
+  <w:abstractNum w:abstractNumId="5" w15:restartNumberingAfterBreak="0">
     <w:nsid w:val="221C3F36"/>
     <w:multiLevelType w:val="multilevel"/>
     <w:tmpl w:val="76284016"/>
@@ -2488,7 +5462,156 @@
       </w:rPr>
     </w:lvl>
   </w:abstractNum>
-  <w:abstractNum w:abstractNumId="3" w15:restartNumberingAfterBreak="0">
+  <w:abstractNum w:abstractNumId="6" w15:restartNumberingAfterBreak="0">
+    <w:nsid w:val="22C47116"/>
+    <w:multiLevelType w:val="multilevel"/>
+    <w:tmpl w:val="4C7A39BA"/>
+    <w:lvl w:ilvl="0">
+      <w:start w:val="1"/>
+      <w:numFmt w:val="bullet"/>
+      <w:lvlText w:val=""/>
+      <w:lvlJc w:val="left"/>
+      <w:pPr>
+        <w:tabs>
+          <w:tab w:val="num" w:pos="720"/>
+        </w:tabs>
+        <w:ind w:left="720" w:hanging="360"/>
+      </w:pPr>
+      <w:rPr>
+        <w:rFonts w:ascii="Symbol" w:hAnsi="Symbol" w:hint="default"/>
+        <w:sz w:val="20"/>
+      </w:rPr>
+    </w:lvl>
+    <w:lvl w:ilvl="1" w:tentative="1">
+      <w:start w:val="1"/>
+      <w:numFmt w:val="bullet"/>
+      <w:lvlText w:val="o"/>
+      <w:lvlJc w:val="left"/>
+      <w:pPr>
+        <w:tabs>
+          <w:tab w:val="num" w:pos="1440"/>
+        </w:tabs>
+        <w:ind w:left="1440" w:hanging="360"/>
+      </w:pPr>
+      <w:rPr>
+        <w:rFonts w:ascii="Courier New" w:hAnsi="Courier New" w:hint="default"/>
+        <w:sz w:val="20"/>
+      </w:rPr>
+    </w:lvl>
+    <w:lvl w:ilvl="2" w:tentative="1">
+      <w:start w:val="1"/>
+      <w:numFmt w:val="bullet"/>
+      <w:lvlText w:val=""/>
+      <w:lvlJc w:val="left"/>
+      <w:pPr>
+        <w:tabs>
+          <w:tab w:val="num" w:pos="2160"/>
+        </w:tabs>
+        <w:ind w:left="2160" w:hanging="360"/>
+      </w:pPr>
+      <w:rPr>
+        <w:rFonts w:ascii="Wingdings" w:hAnsi="Wingdings" w:hint="default"/>
+        <w:sz w:val="20"/>
+      </w:rPr>
+    </w:lvl>
+    <w:lvl w:ilvl="3" w:tentative="1">
+      <w:start w:val="1"/>
+      <w:numFmt w:val="bullet"/>
+      <w:lvlText w:val=""/>
+      <w:lvlJc w:val="left"/>
+      <w:pPr>
+        <w:tabs>
+          <w:tab w:val="num" w:pos="2880"/>
+        </w:tabs>
+        <w:ind w:left="2880" w:hanging="360"/>
+      </w:pPr>
+      <w:rPr>
+        <w:rFonts w:ascii="Wingdings" w:hAnsi="Wingdings" w:hint="default"/>
+        <w:sz w:val="20"/>
+      </w:rPr>
+    </w:lvl>
+    <w:lvl w:ilvl="4" w:tentative="1">
+      <w:start w:val="1"/>
+      <w:numFmt w:val="bullet"/>
+      <w:lvlText w:val=""/>
+      <w:lvlJc w:val="left"/>
+      <w:pPr>
+        <w:tabs>
+          <w:tab w:val="num" w:pos="3600"/>
+        </w:tabs>
+        <w:ind w:left="3600" w:hanging="360"/>
+      </w:pPr>
+      <w:rPr>
+        <w:rFonts w:ascii="Wingdings" w:hAnsi="Wingdings" w:hint="default"/>
+        <w:sz w:val="20"/>
+      </w:rPr>
+    </w:lvl>
+    <w:lvl w:ilvl="5" w:tentative="1">
+      <w:start w:val="1"/>
+      <w:numFmt w:val="bullet"/>
+      <w:lvlText w:val=""/>
+      <w:lvlJc w:val="left"/>
+      <w:pPr>
+        <w:tabs>
+          <w:tab w:val="num" w:pos="4320"/>
+        </w:tabs>
+        <w:ind w:left="4320" w:hanging="360"/>
+      </w:pPr>
+      <w:rPr>
+        <w:rFonts w:ascii="Wingdings" w:hAnsi="Wingdings" w:hint="default"/>
+        <w:sz w:val="20"/>
+      </w:rPr>
+    </w:lvl>
+    <w:lvl w:ilvl="6" w:tentative="1">
+      <w:start w:val="1"/>
+      <w:numFmt w:val="bullet"/>
+      <w:lvlText w:val=""/>
+      <w:lvlJc w:val="left"/>
+      <w:pPr>
+        <w:tabs>
+          <w:tab w:val="num" w:pos="5040"/>
+        </w:tabs>
+        <w:ind w:left="5040" w:hanging="360"/>
+      </w:pPr>
+      <w:rPr>
+        <w:rFonts w:ascii="Wingdings" w:hAnsi="Wingdings" w:hint="default"/>
+        <w:sz w:val="20"/>
+      </w:rPr>
+    </w:lvl>
+    <w:lvl w:ilvl="7" w:tentative="1">
+      <w:start w:val="1"/>
+      <w:numFmt w:val="bullet"/>
+      <w:lvlText w:val=""/>
+      <w:lvlJc w:val="left"/>
+      <w:pPr>
+        <w:tabs>
+          <w:tab w:val="num" w:pos="5760"/>
+        </w:tabs>
+        <w:ind w:left="5760" w:hanging="360"/>
+      </w:pPr>
+      <w:rPr>
+        <w:rFonts w:ascii="Wingdings" w:hAnsi="Wingdings" w:hint="default"/>
+        <w:sz w:val="20"/>
+      </w:rPr>
+    </w:lvl>
+    <w:lvl w:ilvl="8" w:tentative="1">
+      <w:start w:val="1"/>
+      <w:numFmt w:val="bullet"/>
+      <w:lvlText w:val=""/>
+      <w:lvlJc w:val="left"/>
+      <w:pPr>
+        <w:tabs>
+          <w:tab w:val="num" w:pos="6480"/>
+        </w:tabs>
+        <w:ind w:left="6480" w:hanging="360"/>
+      </w:pPr>
+      <w:rPr>
+        <w:rFonts w:ascii="Wingdings" w:hAnsi="Wingdings" w:hint="default"/>
+        <w:sz w:val="20"/>
+      </w:rPr>
+    </w:lvl>
+  </w:abstractNum>
+  <w:abstractNum w:abstractNumId="7" w15:restartNumberingAfterBreak="0">
     <w:nsid w:val="27117FFB"/>
     <w:multiLevelType w:val="multilevel"/>
     <w:tmpl w:val="0C5C762E"/>
@@ -2637,7 +5760,7 @@
       </w:rPr>
     </w:lvl>
   </w:abstractNum>
-  <w:abstractNum w:abstractNumId="4" w15:restartNumberingAfterBreak="0">
+  <w:abstractNum w:abstractNumId="8" w15:restartNumberingAfterBreak="0">
     <w:nsid w:val="27965D24"/>
     <w:multiLevelType w:val="multilevel"/>
     <w:tmpl w:val="049899E8"/>
@@ -2786,7 +5909,156 @@
       </w:rPr>
     </w:lvl>
   </w:abstractNum>
-  <w:abstractNum w:abstractNumId="5" w15:restartNumberingAfterBreak="0">
+  <w:abstractNum w:abstractNumId="9" w15:restartNumberingAfterBreak="0">
+    <w:nsid w:val="293807B1"/>
+    <w:multiLevelType w:val="multilevel"/>
+    <w:tmpl w:val="87CE8FE8"/>
+    <w:lvl w:ilvl="0">
+      <w:start w:val="1"/>
+      <w:numFmt w:val="bullet"/>
+      <w:lvlText w:val=""/>
+      <w:lvlJc w:val="left"/>
+      <w:pPr>
+        <w:tabs>
+          <w:tab w:val="num" w:pos="720"/>
+        </w:tabs>
+        <w:ind w:left="720" w:hanging="360"/>
+      </w:pPr>
+      <w:rPr>
+        <w:rFonts w:ascii="Symbol" w:hAnsi="Symbol" w:hint="default"/>
+        <w:sz w:val="20"/>
+      </w:rPr>
+    </w:lvl>
+    <w:lvl w:ilvl="1" w:tentative="1">
+      <w:start w:val="1"/>
+      <w:numFmt w:val="bullet"/>
+      <w:lvlText w:val="o"/>
+      <w:lvlJc w:val="left"/>
+      <w:pPr>
+        <w:tabs>
+          <w:tab w:val="num" w:pos="1440"/>
+        </w:tabs>
+        <w:ind w:left="1440" w:hanging="360"/>
+      </w:pPr>
+      <w:rPr>
+        <w:rFonts w:ascii="Courier New" w:hAnsi="Courier New" w:hint="default"/>
+        <w:sz w:val="20"/>
+      </w:rPr>
+    </w:lvl>
+    <w:lvl w:ilvl="2" w:tentative="1">
+      <w:start w:val="1"/>
+      <w:numFmt w:val="bullet"/>
+      <w:lvlText w:val=""/>
+      <w:lvlJc w:val="left"/>
+      <w:pPr>
+        <w:tabs>
+          <w:tab w:val="num" w:pos="2160"/>
+        </w:tabs>
+        <w:ind w:left="2160" w:hanging="360"/>
+      </w:pPr>
+      <w:rPr>
+        <w:rFonts w:ascii="Wingdings" w:hAnsi="Wingdings" w:hint="default"/>
+        <w:sz w:val="20"/>
+      </w:rPr>
+    </w:lvl>
+    <w:lvl w:ilvl="3" w:tentative="1">
+      <w:start w:val="1"/>
+      <w:numFmt w:val="bullet"/>
+      <w:lvlText w:val=""/>
+      <w:lvlJc w:val="left"/>
+      <w:pPr>
+        <w:tabs>
+          <w:tab w:val="num" w:pos="2880"/>
+        </w:tabs>
+        <w:ind w:left="2880" w:hanging="360"/>
+      </w:pPr>
+      <w:rPr>
+        <w:rFonts w:ascii="Wingdings" w:hAnsi="Wingdings" w:hint="default"/>
+        <w:sz w:val="20"/>
+      </w:rPr>
+    </w:lvl>
+    <w:lvl w:ilvl="4" w:tentative="1">
+      <w:start w:val="1"/>
+      <w:numFmt w:val="bullet"/>
+      <w:lvlText w:val=""/>
+      <w:lvlJc w:val="left"/>
+      <w:pPr>
+        <w:tabs>
+          <w:tab w:val="num" w:pos="3600"/>
+        </w:tabs>
+        <w:ind w:left="3600" w:hanging="360"/>
+      </w:pPr>
+      <w:rPr>
+        <w:rFonts w:ascii="Wingdings" w:hAnsi="Wingdings" w:hint="default"/>
+        <w:sz w:val="20"/>
+      </w:rPr>
+    </w:lvl>
+    <w:lvl w:ilvl="5" w:tentative="1">
+      <w:start w:val="1"/>
+      <w:numFmt w:val="bullet"/>
+      <w:lvlText w:val=""/>
+      <w:lvlJc w:val="left"/>
+      <w:pPr>
+        <w:tabs>
+          <w:tab w:val="num" w:pos="4320"/>
+        </w:tabs>
+        <w:ind w:left="4320" w:hanging="360"/>
+      </w:pPr>
+      <w:rPr>
+        <w:rFonts w:ascii="Wingdings" w:hAnsi="Wingdings" w:hint="default"/>
+        <w:sz w:val="20"/>
+      </w:rPr>
+    </w:lvl>
+    <w:lvl w:ilvl="6" w:tentative="1">
+      <w:start w:val="1"/>
+      <w:numFmt w:val="bullet"/>
+      <w:lvlText w:val=""/>
+      <w:lvlJc w:val="left"/>
+      <w:pPr>
+        <w:tabs>
+          <w:tab w:val="num" w:pos="5040"/>
+        </w:tabs>
+        <w:ind w:left="5040" w:hanging="360"/>
+      </w:pPr>
+      <w:rPr>
+        <w:rFonts w:ascii="Wingdings" w:hAnsi="Wingdings" w:hint="default"/>
+        <w:sz w:val="20"/>
+      </w:rPr>
+    </w:lvl>
+    <w:lvl w:ilvl="7" w:tentative="1">
+      <w:start w:val="1"/>
+      <w:numFmt w:val="bullet"/>
+      <w:lvlText w:val=""/>
+      <w:lvlJc w:val="left"/>
+      <w:pPr>
+        <w:tabs>
+          <w:tab w:val="num" w:pos="5760"/>
+        </w:tabs>
+        <w:ind w:left="5760" w:hanging="360"/>
+      </w:pPr>
+      <w:rPr>
+        <w:rFonts w:ascii="Wingdings" w:hAnsi="Wingdings" w:hint="default"/>
+        <w:sz w:val="20"/>
+      </w:rPr>
+    </w:lvl>
+    <w:lvl w:ilvl="8" w:tentative="1">
+      <w:start w:val="1"/>
+      <w:numFmt w:val="bullet"/>
+      <w:lvlText w:val=""/>
+      <w:lvlJc w:val="left"/>
+      <w:pPr>
+        <w:tabs>
+          <w:tab w:val="num" w:pos="6480"/>
+        </w:tabs>
+        <w:ind w:left="6480" w:hanging="360"/>
+      </w:pPr>
+      <w:rPr>
+        <w:rFonts w:ascii="Wingdings" w:hAnsi="Wingdings" w:hint="default"/>
+        <w:sz w:val="20"/>
+      </w:rPr>
+    </w:lvl>
+  </w:abstractNum>
+  <w:abstractNum w:abstractNumId="10" w15:restartNumberingAfterBreak="0">
     <w:nsid w:val="2D5C644F"/>
     <w:multiLevelType w:val="hybridMultilevel"/>
     <w:tmpl w:val="E4CCF9F4"/>
@@ -2875,7 +6147,7 @@
       </w:pPr>
     </w:lvl>
   </w:abstractNum>
-  <w:abstractNum w:abstractNumId="6" w15:restartNumberingAfterBreak="0">
+  <w:abstractNum w:abstractNumId="11" w15:restartNumberingAfterBreak="0">
     <w:nsid w:val="2E54028D"/>
     <w:multiLevelType w:val="multilevel"/>
     <w:tmpl w:val="09369F8E"/>
@@ -3024,7 +6296,156 @@
       </w:rPr>
     </w:lvl>
   </w:abstractNum>
-  <w:abstractNum w:abstractNumId="7" w15:restartNumberingAfterBreak="0">
+  <w:abstractNum w:abstractNumId="12" w15:restartNumberingAfterBreak="0">
+    <w:nsid w:val="38ED09FD"/>
+    <w:multiLevelType w:val="multilevel"/>
+    <w:tmpl w:val="C926602E"/>
+    <w:lvl w:ilvl="0">
+      <w:start w:val="1"/>
+      <w:numFmt w:val="bullet"/>
+      <w:lvlText w:val=""/>
+      <w:lvlJc w:val="left"/>
+      <w:pPr>
+        <w:tabs>
+          <w:tab w:val="num" w:pos="720"/>
+        </w:tabs>
+        <w:ind w:left="720" w:hanging="360"/>
+      </w:pPr>
+      <w:rPr>
+        <w:rFonts w:ascii="Symbol" w:hAnsi="Symbol" w:hint="default"/>
+        <w:sz w:val="20"/>
+      </w:rPr>
+    </w:lvl>
+    <w:lvl w:ilvl="1" w:tentative="1">
+      <w:start w:val="1"/>
+      <w:numFmt w:val="bullet"/>
+      <w:lvlText w:val="o"/>
+      <w:lvlJc w:val="left"/>
+      <w:pPr>
+        <w:tabs>
+          <w:tab w:val="num" w:pos="1440"/>
+        </w:tabs>
+        <w:ind w:left="1440" w:hanging="360"/>
+      </w:pPr>
+      <w:rPr>
+        <w:rFonts w:ascii="Courier New" w:hAnsi="Courier New" w:hint="default"/>
+        <w:sz w:val="20"/>
+      </w:rPr>
+    </w:lvl>
+    <w:lvl w:ilvl="2" w:tentative="1">
+      <w:start w:val="1"/>
+      <w:numFmt w:val="bullet"/>
+      <w:lvlText w:val=""/>
+      <w:lvlJc w:val="left"/>
+      <w:pPr>
+        <w:tabs>
+          <w:tab w:val="num" w:pos="2160"/>
+        </w:tabs>
+        <w:ind w:left="2160" w:hanging="360"/>
+      </w:pPr>
+      <w:rPr>
+        <w:rFonts w:ascii="Wingdings" w:hAnsi="Wingdings" w:hint="default"/>
+        <w:sz w:val="20"/>
+      </w:rPr>
+    </w:lvl>
+    <w:lvl w:ilvl="3" w:tentative="1">
+      <w:start w:val="1"/>
+      <w:numFmt w:val="bullet"/>
+      <w:lvlText w:val=""/>
+      <w:lvlJc w:val="left"/>
+      <w:pPr>
+        <w:tabs>
+          <w:tab w:val="num" w:pos="2880"/>
+        </w:tabs>
+        <w:ind w:left="2880" w:hanging="360"/>
+      </w:pPr>
+      <w:rPr>
+        <w:rFonts w:ascii="Wingdings" w:hAnsi="Wingdings" w:hint="default"/>
+        <w:sz w:val="20"/>
+      </w:rPr>
+    </w:lvl>
+    <w:lvl w:ilvl="4" w:tentative="1">
+      <w:start w:val="1"/>
+      <w:numFmt w:val="bullet"/>
+      <w:lvlText w:val=""/>
+      <w:lvlJc w:val="left"/>
+      <w:pPr>
+        <w:tabs>
+          <w:tab w:val="num" w:pos="3600"/>
+        </w:tabs>
+        <w:ind w:left="3600" w:hanging="360"/>
+      </w:pPr>
+      <w:rPr>
+        <w:rFonts w:ascii="Wingdings" w:hAnsi="Wingdings" w:hint="default"/>
+        <w:sz w:val="20"/>
+      </w:rPr>
+    </w:lvl>
+    <w:lvl w:ilvl="5" w:tentative="1">
+      <w:start w:val="1"/>
+      <w:numFmt w:val="bullet"/>
+      <w:lvlText w:val=""/>
+      <w:lvlJc w:val="left"/>
+      <w:pPr>
+        <w:tabs>
+          <w:tab w:val="num" w:pos="4320"/>
+        </w:tabs>
+        <w:ind w:left="4320" w:hanging="360"/>
+      </w:pPr>
+      <w:rPr>
+        <w:rFonts w:ascii="Wingdings" w:hAnsi="Wingdings" w:hint="default"/>
+        <w:sz w:val="20"/>
+      </w:rPr>
+    </w:lvl>
+    <w:lvl w:ilvl="6" w:tentative="1">
+      <w:start w:val="1"/>
+      <w:numFmt w:val="bullet"/>
+      <w:lvlText w:val=""/>
+      <w:lvlJc w:val="left"/>
+      <w:pPr>
+        <w:tabs>
+          <w:tab w:val="num" w:pos="5040"/>
+        </w:tabs>
+        <w:ind w:left="5040" w:hanging="360"/>
+      </w:pPr>
+      <w:rPr>
+        <w:rFonts w:ascii="Wingdings" w:hAnsi="Wingdings" w:hint="default"/>
+        <w:sz w:val="20"/>
+      </w:rPr>
+    </w:lvl>
+    <w:lvl w:ilvl="7" w:tentative="1">
+      <w:start w:val="1"/>
+      <w:numFmt w:val="bullet"/>
+      <w:lvlText w:val=""/>
+      <w:lvlJc w:val="left"/>
+      <w:pPr>
+        <w:tabs>
+          <w:tab w:val="num" w:pos="5760"/>
+        </w:tabs>
+        <w:ind w:left="5760" w:hanging="360"/>
+      </w:pPr>
+      <w:rPr>
+        <w:rFonts w:ascii="Wingdings" w:hAnsi="Wingdings" w:hint="default"/>
+        <w:sz w:val="20"/>
+      </w:rPr>
+    </w:lvl>
+    <w:lvl w:ilvl="8" w:tentative="1">
+      <w:start w:val="1"/>
+      <w:numFmt w:val="bullet"/>
+      <w:lvlText w:val=""/>
+      <w:lvlJc w:val="left"/>
+      <w:pPr>
+        <w:tabs>
+          <w:tab w:val="num" w:pos="6480"/>
+        </w:tabs>
+        <w:ind w:left="6480" w:hanging="360"/>
+      </w:pPr>
+      <w:rPr>
+        <w:rFonts w:ascii="Wingdings" w:hAnsi="Wingdings" w:hint="default"/>
+        <w:sz w:val="20"/>
+      </w:rPr>
+    </w:lvl>
+  </w:abstractNum>
+  <w:abstractNum w:abstractNumId="13" w15:restartNumberingAfterBreak="0">
     <w:nsid w:val="3E271797"/>
     <w:multiLevelType w:val="multilevel"/>
     <w:tmpl w:val="3E164BD8"/>
@@ -3173,7 +6594,7 @@
       </w:rPr>
     </w:lvl>
   </w:abstractNum>
-  <w:abstractNum w:abstractNumId="8" w15:restartNumberingAfterBreak="0">
+  <w:abstractNum w:abstractNumId="14" w15:restartNumberingAfterBreak="0">
     <w:nsid w:val="3E714592"/>
     <w:multiLevelType w:val="hybridMultilevel"/>
     <w:tmpl w:val="8716DA70"/>
@@ -3262,7 +6683,7 @@
       </w:pPr>
     </w:lvl>
   </w:abstractNum>
-  <w:abstractNum w:abstractNumId="9" w15:restartNumberingAfterBreak="0">
+  <w:abstractNum w:abstractNumId="15" w15:restartNumberingAfterBreak="0">
     <w:nsid w:val="48C167EF"/>
     <w:multiLevelType w:val="multilevel"/>
     <w:tmpl w:val="33B8865A"/>
@@ -3411,7 +6832,454 @@
       </w:rPr>
     </w:lvl>
   </w:abstractNum>
-  <w:abstractNum w:abstractNumId="10" w15:restartNumberingAfterBreak="0">
+  <w:abstractNum w:abstractNumId="16" w15:restartNumberingAfterBreak="0">
+    <w:nsid w:val="4B084855"/>
+    <w:multiLevelType w:val="multilevel"/>
+    <w:tmpl w:val="2E921E52"/>
+    <w:lvl w:ilvl="0">
+      <w:start w:val="1"/>
+      <w:numFmt w:val="bullet"/>
+      <w:lvlText w:val=""/>
+      <w:lvlJc w:val="left"/>
+      <w:pPr>
+        <w:tabs>
+          <w:tab w:val="num" w:pos="720"/>
+        </w:tabs>
+        <w:ind w:left="720" w:hanging="360"/>
+      </w:pPr>
+      <w:rPr>
+        <w:rFonts w:ascii="Symbol" w:hAnsi="Symbol" w:hint="default"/>
+        <w:sz w:val="20"/>
+      </w:rPr>
+    </w:lvl>
+    <w:lvl w:ilvl="1" w:tentative="1">
+      <w:start w:val="1"/>
+      <w:numFmt w:val="bullet"/>
+      <w:lvlText w:val="o"/>
+      <w:lvlJc w:val="left"/>
+      <w:pPr>
+        <w:tabs>
+          <w:tab w:val="num" w:pos="1440"/>
+        </w:tabs>
+        <w:ind w:left="1440" w:hanging="360"/>
+      </w:pPr>
+      <w:rPr>
+        <w:rFonts w:ascii="Courier New" w:hAnsi="Courier New" w:hint="default"/>
+        <w:sz w:val="20"/>
+      </w:rPr>
+    </w:lvl>
+    <w:lvl w:ilvl="2" w:tentative="1">
+      <w:start w:val="1"/>
+      <w:numFmt w:val="bullet"/>
+      <w:lvlText w:val=""/>
+      <w:lvlJc w:val="left"/>
+      <w:pPr>
+        <w:tabs>
+          <w:tab w:val="num" w:pos="2160"/>
+        </w:tabs>
+        <w:ind w:left="2160" w:hanging="360"/>
+      </w:pPr>
+      <w:rPr>
+        <w:rFonts w:ascii="Wingdings" w:hAnsi="Wingdings" w:hint="default"/>
+        <w:sz w:val="20"/>
+      </w:rPr>
+    </w:lvl>
+    <w:lvl w:ilvl="3" w:tentative="1">
+      <w:start w:val="1"/>
+      <w:numFmt w:val="bullet"/>
+      <w:lvlText w:val=""/>
+      <w:lvlJc w:val="left"/>
+      <w:pPr>
+        <w:tabs>
+          <w:tab w:val="num" w:pos="2880"/>
+        </w:tabs>
+        <w:ind w:left="2880" w:hanging="360"/>
+      </w:pPr>
+      <w:rPr>
+        <w:rFonts w:ascii="Wingdings" w:hAnsi="Wingdings" w:hint="default"/>
+        <w:sz w:val="20"/>
+      </w:rPr>
+    </w:lvl>
+    <w:lvl w:ilvl="4" w:tentative="1">
+      <w:start w:val="1"/>
+      <w:numFmt w:val="bullet"/>
+      <w:lvlText w:val=""/>
+      <w:lvlJc w:val="left"/>
+      <w:pPr>
+        <w:tabs>
+          <w:tab w:val="num" w:pos="3600"/>
+        </w:tabs>
+        <w:ind w:left="3600" w:hanging="360"/>
+      </w:pPr>
+      <w:rPr>
+        <w:rFonts w:ascii="Wingdings" w:hAnsi="Wingdings" w:hint="default"/>
+        <w:sz w:val="20"/>
+      </w:rPr>
+    </w:lvl>
+    <w:lvl w:ilvl="5" w:tentative="1">
+      <w:start w:val="1"/>
+      <w:numFmt w:val="bullet"/>
+      <w:lvlText w:val=""/>
+      <w:lvlJc w:val="left"/>
+      <w:pPr>
+        <w:tabs>
+          <w:tab w:val="num" w:pos="4320"/>
+        </w:tabs>
+        <w:ind w:left="4320" w:hanging="360"/>
+      </w:pPr>
+      <w:rPr>
+        <w:rFonts w:ascii="Wingdings" w:hAnsi="Wingdings" w:hint="default"/>
+        <w:sz w:val="20"/>
+      </w:rPr>
+    </w:lvl>
+    <w:lvl w:ilvl="6" w:tentative="1">
+      <w:start w:val="1"/>
+      <w:numFmt w:val="bullet"/>
+      <w:lvlText w:val=""/>
+      <w:lvlJc w:val="left"/>
+      <w:pPr>
+        <w:tabs>
+          <w:tab w:val="num" w:pos="5040"/>
+        </w:tabs>
+        <w:ind w:left="5040" w:hanging="360"/>
+      </w:pPr>
+      <w:rPr>
+        <w:rFonts w:ascii="Wingdings" w:hAnsi="Wingdings" w:hint="default"/>
+        <w:sz w:val="20"/>
+      </w:rPr>
+    </w:lvl>
+    <w:lvl w:ilvl="7" w:tentative="1">
+      <w:start w:val="1"/>
+      <w:numFmt w:val="bullet"/>
+      <w:lvlText w:val=""/>
+      <w:lvlJc w:val="left"/>
+      <w:pPr>
+        <w:tabs>
+          <w:tab w:val="num" w:pos="5760"/>
+        </w:tabs>
+        <w:ind w:left="5760" w:hanging="360"/>
+      </w:pPr>
+      <w:rPr>
+        <w:rFonts w:ascii="Wingdings" w:hAnsi="Wingdings" w:hint="default"/>
+        <w:sz w:val="20"/>
+      </w:rPr>
+    </w:lvl>
+    <w:lvl w:ilvl="8" w:tentative="1">
+      <w:start w:val="1"/>
+      <w:numFmt w:val="bullet"/>
+      <w:lvlText w:val=""/>
+      <w:lvlJc w:val="left"/>
+      <w:pPr>
+        <w:tabs>
+          <w:tab w:val="num" w:pos="6480"/>
+        </w:tabs>
+        <w:ind w:left="6480" w:hanging="360"/>
+      </w:pPr>
+      <w:rPr>
+        <w:rFonts w:ascii="Wingdings" w:hAnsi="Wingdings" w:hint="default"/>
+        <w:sz w:val="20"/>
+      </w:rPr>
+    </w:lvl>
+  </w:abstractNum>
+  <w:abstractNum w:abstractNumId="17" w15:restartNumberingAfterBreak="0">
+    <w:nsid w:val="4F066DFF"/>
+    <w:multiLevelType w:val="multilevel"/>
+    <w:tmpl w:val="52C85A6A"/>
+    <w:lvl w:ilvl="0">
+      <w:start w:val="1"/>
+      <w:numFmt w:val="bullet"/>
+      <w:lvlText w:val=""/>
+      <w:lvlJc w:val="left"/>
+      <w:pPr>
+        <w:tabs>
+          <w:tab w:val="num" w:pos="720"/>
+        </w:tabs>
+        <w:ind w:left="720" w:hanging="360"/>
+      </w:pPr>
+      <w:rPr>
+        <w:rFonts w:ascii="Symbol" w:hAnsi="Symbol" w:hint="default"/>
+        <w:sz w:val="20"/>
+      </w:rPr>
+    </w:lvl>
+    <w:lvl w:ilvl="1" w:tentative="1">
+      <w:start w:val="1"/>
+      <w:numFmt w:val="bullet"/>
+      <w:lvlText w:val="o"/>
+      <w:lvlJc w:val="left"/>
+      <w:pPr>
+        <w:tabs>
+          <w:tab w:val="num" w:pos="1440"/>
+        </w:tabs>
+        <w:ind w:left="1440" w:hanging="360"/>
+      </w:pPr>
+      <w:rPr>
+        <w:rFonts w:ascii="Courier New" w:hAnsi="Courier New" w:hint="default"/>
+        <w:sz w:val="20"/>
+      </w:rPr>
+    </w:lvl>
+    <w:lvl w:ilvl="2" w:tentative="1">
+      <w:start w:val="1"/>
+      <w:numFmt w:val="bullet"/>
+      <w:lvlText w:val=""/>
+      <w:lvlJc w:val="left"/>
+      <w:pPr>
+        <w:tabs>
+          <w:tab w:val="num" w:pos="2160"/>
+        </w:tabs>
+        <w:ind w:left="2160" w:hanging="360"/>
+      </w:pPr>
+      <w:rPr>
+        <w:rFonts w:ascii="Wingdings" w:hAnsi="Wingdings" w:hint="default"/>
+        <w:sz w:val="20"/>
+      </w:rPr>
+    </w:lvl>
+    <w:lvl w:ilvl="3" w:tentative="1">
+      <w:start w:val="1"/>
+      <w:numFmt w:val="bullet"/>
+      <w:lvlText w:val=""/>
+      <w:lvlJc w:val="left"/>
+      <w:pPr>
+        <w:tabs>
+          <w:tab w:val="num" w:pos="2880"/>
+        </w:tabs>
+        <w:ind w:left="2880" w:hanging="360"/>
+      </w:pPr>
+      <w:rPr>
+        <w:rFonts w:ascii="Wingdings" w:hAnsi="Wingdings" w:hint="default"/>
+        <w:sz w:val="20"/>
+      </w:rPr>
+    </w:lvl>
+    <w:lvl w:ilvl="4" w:tentative="1">
+      <w:start w:val="1"/>
+      <w:numFmt w:val="bullet"/>
+      <w:lvlText w:val=""/>
+      <w:lvlJc w:val="left"/>
+      <w:pPr>
+        <w:tabs>
+          <w:tab w:val="num" w:pos="3600"/>
+        </w:tabs>
+        <w:ind w:left="3600" w:hanging="360"/>
+      </w:pPr>
+      <w:rPr>
+        <w:rFonts w:ascii="Wingdings" w:hAnsi="Wingdings" w:hint="default"/>
+        <w:sz w:val="20"/>
+      </w:rPr>
+    </w:lvl>
+    <w:lvl w:ilvl="5" w:tentative="1">
+      <w:start w:val="1"/>
+      <w:numFmt w:val="bullet"/>
+      <w:lvlText w:val=""/>
+      <w:lvlJc w:val="left"/>
+      <w:pPr>
+        <w:tabs>
+          <w:tab w:val="num" w:pos="4320"/>
+        </w:tabs>
+        <w:ind w:left="4320" w:hanging="360"/>
+      </w:pPr>
+      <w:rPr>
+        <w:rFonts w:ascii="Wingdings" w:hAnsi="Wingdings" w:hint="default"/>
+        <w:sz w:val="20"/>
+      </w:rPr>
+    </w:lvl>
+    <w:lvl w:ilvl="6" w:tentative="1">
+      <w:start w:val="1"/>
+      <w:numFmt w:val="bullet"/>
+      <w:lvlText w:val=""/>
+      <w:lvlJc w:val="left"/>
+      <w:pPr>
+        <w:tabs>
+          <w:tab w:val="num" w:pos="5040"/>
+        </w:tabs>
+        <w:ind w:left="5040" w:hanging="360"/>
+      </w:pPr>
+      <w:rPr>
+        <w:rFonts w:ascii="Wingdings" w:hAnsi="Wingdings" w:hint="default"/>
+        <w:sz w:val="20"/>
+      </w:rPr>
+    </w:lvl>
+    <w:lvl w:ilvl="7" w:tentative="1">
+      <w:start w:val="1"/>
+      <w:numFmt w:val="bullet"/>
+      <w:lvlText w:val=""/>
+      <w:lvlJc w:val="left"/>
+      <w:pPr>
+        <w:tabs>
+          <w:tab w:val="num" w:pos="5760"/>
+        </w:tabs>
+        <w:ind w:left="5760" w:hanging="360"/>
+      </w:pPr>
+      <w:rPr>
+        <w:rFonts w:ascii="Wingdings" w:hAnsi="Wingdings" w:hint="default"/>
+        <w:sz w:val="20"/>
+      </w:rPr>
+    </w:lvl>
+    <w:lvl w:ilvl="8" w:tentative="1">
+      <w:start w:val="1"/>
+      <w:numFmt w:val="bullet"/>
+      <w:lvlText w:val=""/>
+      <w:lvlJc w:val="left"/>
+      <w:pPr>
+        <w:tabs>
+          <w:tab w:val="num" w:pos="6480"/>
+        </w:tabs>
+        <w:ind w:left="6480" w:hanging="360"/>
+      </w:pPr>
+      <w:rPr>
+        <w:rFonts w:ascii="Wingdings" w:hAnsi="Wingdings" w:hint="default"/>
+        <w:sz w:val="20"/>
+      </w:rPr>
+    </w:lvl>
+  </w:abstractNum>
+  <w:abstractNum w:abstractNumId="18" w15:restartNumberingAfterBreak="0">
+    <w:nsid w:val="52C35555"/>
+    <w:multiLevelType w:val="multilevel"/>
+    <w:tmpl w:val="C8667CA8"/>
+    <w:lvl w:ilvl="0">
+      <w:start w:val="1"/>
+      <w:numFmt w:val="bullet"/>
+      <w:lvlText w:val=""/>
+      <w:lvlJc w:val="left"/>
+      <w:pPr>
+        <w:tabs>
+          <w:tab w:val="num" w:pos="720"/>
+        </w:tabs>
+        <w:ind w:left="720" w:hanging="360"/>
+      </w:pPr>
+      <w:rPr>
+        <w:rFonts w:ascii="Symbol" w:hAnsi="Symbol" w:hint="default"/>
+        <w:sz w:val="20"/>
+      </w:rPr>
+    </w:lvl>
+    <w:lvl w:ilvl="1" w:tentative="1">
+      <w:start w:val="1"/>
+      <w:numFmt w:val="bullet"/>
+      <w:lvlText w:val="o"/>
+      <w:lvlJc w:val="left"/>
+      <w:pPr>
+        <w:tabs>
+          <w:tab w:val="num" w:pos="1440"/>
+        </w:tabs>
+        <w:ind w:left="1440" w:hanging="360"/>
+      </w:pPr>
+      <w:rPr>
+        <w:rFonts w:ascii="Courier New" w:hAnsi="Courier New" w:hint="default"/>
+        <w:sz w:val="20"/>
+      </w:rPr>
+    </w:lvl>
+    <w:lvl w:ilvl="2" w:tentative="1">
+      <w:start w:val="1"/>
+      <w:numFmt w:val="bullet"/>
+      <w:lvlText w:val=""/>
+      <w:lvlJc w:val="left"/>
+      <w:pPr>
+        <w:tabs>
+          <w:tab w:val="num" w:pos="2160"/>
+        </w:tabs>
+        <w:ind w:left="2160" w:hanging="360"/>
+      </w:pPr>
+      <w:rPr>
+        <w:rFonts w:ascii="Wingdings" w:hAnsi="Wingdings" w:hint="default"/>
+        <w:sz w:val="20"/>
+      </w:rPr>
+    </w:lvl>
+    <w:lvl w:ilvl="3" w:tentative="1">
+      <w:start w:val="1"/>
+      <w:numFmt w:val="bullet"/>
+      <w:lvlText w:val=""/>
+      <w:lvlJc w:val="left"/>
+      <w:pPr>
+        <w:tabs>
+          <w:tab w:val="num" w:pos="2880"/>
+        </w:tabs>
+        <w:ind w:left="2880" w:hanging="360"/>
+      </w:pPr>
+      <w:rPr>
+        <w:rFonts w:ascii="Wingdings" w:hAnsi="Wingdings" w:hint="default"/>
+        <w:sz w:val="20"/>
+      </w:rPr>
+    </w:lvl>
+    <w:lvl w:ilvl="4" w:tentative="1">
+      <w:start w:val="1"/>
+      <w:numFmt w:val="bullet"/>
+      <w:lvlText w:val=""/>
+      <w:lvlJc w:val="left"/>
+      <w:pPr>
+        <w:tabs>
+          <w:tab w:val="num" w:pos="3600"/>
+        </w:tabs>
+        <w:ind w:left="3600" w:hanging="360"/>
+      </w:pPr>
+      <w:rPr>
+        <w:rFonts w:ascii="Wingdings" w:hAnsi="Wingdings" w:hint="default"/>
+        <w:sz w:val="20"/>
+      </w:rPr>
+    </w:lvl>
+    <w:lvl w:ilvl="5" w:tentative="1">
+      <w:start w:val="1"/>
+      <w:numFmt w:val="bullet"/>
+      <w:lvlText w:val=""/>
+      <w:lvlJc w:val="left"/>
+      <w:pPr>
+        <w:tabs>
+          <w:tab w:val="num" w:pos="4320"/>
+        </w:tabs>
+        <w:ind w:left="4320" w:hanging="360"/>
+      </w:pPr>
+      <w:rPr>
+        <w:rFonts w:ascii="Wingdings" w:hAnsi="Wingdings" w:hint="default"/>
+        <w:sz w:val="20"/>
+      </w:rPr>
+    </w:lvl>
+    <w:lvl w:ilvl="6" w:tentative="1">
+      <w:start w:val="1"/>
+      <w:numFmt w:val="bullet"/>
+      <w:lvlText w:val=""/>
+      <w:lvlJc w:val="left"/>
+      <w:pPr>
+        <w:tabs>
+          <w:tab w:val="num" w:pos="5040"/>
+        </w:tabs>
+        <w:ind w:left="5040" w:hanging="360"/>
+      </w:pPr>
+      <w:rPr>
+        <w:rFonts w:ascii="Wingdings" w:hAnsi="Wingdings" w:hint="default"/>
+        <w:sz w:val="20"/>
+      </w:rPr>
+    </w:lvl>
+    <w:lvl w:ilvl="7" w:tentative="1">
+      <w:start w:val="1"/>
+      <w:numFmt w:val="bullet"/>
+      <w:lvlText w:val=""/>
+      <w:lvlJc w:val="left"/>
+      <w:pPr>
+        <w:tabs>
+          <w:tab w:val="num" w:pos="5760"/>
+        </w:tabs>
+        <w:ind w:left="5760" w:hanging="360"/>
+      </w:pPr>
+      <w:rPr>
+        <w:rFonts w:ascii="Wingdings" w:hAnsi="Wingdings" w:hint="default"/>
+        <w:sz w:val="20"/>
+      </w:rPr>
+    </w:lvl>
+    <w:lvl w:ilvl="8" w:tentative="1">
+      <w:start w:val="1"/>
+      <w:numFmt w:val="bullet"/>
+      <w:lvlText w:val=""/>
+      <w:lvlJc w:val="left"/>
+      <w:pPr>
+        <w:tabs>
+          <w:tab w:val="num" w:pos="6480"/>
+        </w:tabs>
+        <w:ind w:left="6480" w:hanging="360"/>
+      </w:pPr>
+      <w:rPr>
+        <w:rFonts w:ascii="Wingdings" w:hAnsi="Wingdings" w:hint="default"/>
+        <w:sz w:val="20"/>
+      </w:rPr>
+    </w:lvl>
+  </w:abstractNum>
+  <w:abstractNum w:abstractNumId="19" w15:restartNumberingAfterBreak="0">
     <w:nsid w:val="5B8F5461"/>
     <w:multiLevelType w:val="multilevel"/>
     <w:tmpl w:val="CE3E9F9A"/>
@@ -3560,7 +7428,305 @@
       </w:rPr>
     </w:lvl>
   </w:abstractNum>
-  <w:abstractNum w:abstractNumId="11" w15:restartNumberingAfterBreak="0">
+  <w:abstractNum w:abstractNumId="20" w15:restartNumberingAfterBreak="0">
+    <w:nsid w:val="5EE117AD"/>
+    <w:multiLevelType w:val="multilevel"/>
+    <w:tmpl w:val="D484423E"/>
+    <w:lvl w:ilvl="0">
+      <w:start w:val="1"/>
+      <w:numFmt w:val="bullet"/>
+      <w:lvlText w:val=""/>
+      <w:lvlJc w:val="left"/>
+      <w:pPr>
+        <w:tabs>
+          <w:tab w:val="num" w:pos="720"/>
+        </w:tabs>
+        <w:ind w:left="720" w:hanging="360"/>
+      </w:pPr>
+      <w:rPr>
+        <w:rFonts w:ascii="Symbol" w:hAnsi="Symbol" w:hint="default"/>
+        <w:sz w:val="20"/>
+      </w:rPr>
+    </w:lvl>
+    <w:lvl w:ilvl="1">
+      <w:start w:val="1"/>
+      <w:numFmt w:val="bullet"/>
+      <w:lvlText w:val="o"/>
+      <w:lvlJc w:val="left"/>
+      <w:pPr>
+        <w:tabs>
+          <w:tab w:val="num" w:pos="1440"/>
+        </w:tabs>
+        <w:ind w:left="1440" w:hanging="360"/>
+      </w:pPr>
+      <w:rPr>
+        <w:rFonts w:ascii="Courier New" w:hAnsi="Courier New" w:hint="default"/>
+        <w:sz w:val="20"/>
+      </w:rPr>
+    </w:lvl>
+    <w:lvl w:ilvl="2" w:tentative="1">
+      <w:start w:val="1"/>
+      <w:numFmt w:val="bullet"/>
+      <w:lvlText w:val=""/>
+      <w:lvlJc w:val="left"/>
+      <w:pPr>
+        <w:tabs>
+          <w:tab w:val="num" w:pos="2160"/>
+        </w:tabs>
+        <w:ind w:left="2160" w:hanging="360"/>
+      </w:pPr>
+      <w:rPr>
+        <w:rFonts w:ascii="Wingdings" w:hAnsi="Wingdings" w:hint="default"/>
+        <w:sz w:val="20"/>
+      </w:rPr>
+    </w:lvl>
+    <w:lvl w:ilvl="3" w:tentative="1">
+      <w:start w:val="1"/>
+      <w:numFmt w:val="bullet"/>
+      <w:lvlText w:val=""/>
+      <w:lvlJc w:val="left"/>
+      <w:pPr>
+        <w:tabs>
+          <w:tab w:val="num" w:pos="2880"/>
+        </w:tabs>
+        <w:ind w:left="2880" w:hanging="360"/>
+      </w:pPr>
+      <w:rPr>
+        <w:rFonts w:ascii="Wingdings" w:hAnsi="Wingdings" w:hint="default"/>
+        <w:sz w:val="20"/>
+      </w:rPr>
+    </w:lvl>
+    <w:lvl w:ilvl="4" w:tentative="1">
+      <w:start w:val="1"/>
+      <w:numFmt w:val="bullet"/>
+      <w:lvlText w:val=""/>
+      <w:lvlJc w:val="left"/>
+      <w:pPr>
+        <w:tabs>
+          <w:tab w:val="num" w:pos="3600"/>
+        </w:tabs>
+        <w:ind w:left="3600" w:hanging="360"/>
+      </w:pPr>
+      <w:rPr>
+        <w:rFonts w:ascii="Wingdings" w:hAnsi="Wingdings" w:hint="default"/>
+        <w:sz w:val="20"/>
+      </w:rPr>
+    </w:lvl>
+    <w:lvl w:ilvl="5" w:tentative="1">
+      <w:start w:val="1"/>
+      <w:numFmt w:val="bullet"/>
+      <w:lvlText w:val=""/>
+      <w:lvlJc w:val="left"/>
+      <w:pPr>
+        <w:tabs>
+          <w:tab w:val="num" w:pos="4320"/>
+        </w:tabs>
+        <w:ind w:left="4320" w:hanging="360"/>
+      </w:pPr>
+      <w:rPr>
+        <w:rFonts w:ascii="Wingdings" w:hAnsi="Wingdings" w:hint="default"/>
+        <w:sz w:val="20"/>
+      </w:rPr>
+    </w:lvl>
+    <w:lvl w:ilvl="6" w:tentative="1">
+      <w:start w:val="1"/>
+      <w:numFmt w:val="bullet"/>
+      <w:lvlText w:val=""/>
+      <w:lvlJc w:val="left"/>
+      <w:pPr>
+        <w:tabs>
+          <w:tab w:val="num" w:pos="5040"/>
+        </w:tabs>
+        <w:ind w:left="5040" w:hanging="360"/>
+      </w:pPr>
+      <w:rPr>
+        <w:rFonts w:ascii="Wingdings" w:hAnsi="Wingdings" w:hint="default"/>
+        <w:sz w:val="20"/>
+      </w:rPr>
+    </w:lvl>
+    <w:lvl w:ilvl="7" w:tentative="1">
+      <w:start w:val="1"/>
+      <w:numFmt w:val="bullet"/>
+      <w:lvlText w:val=""/>
+      <w:lvlJc w:val="left"/>
+      <w:pPr>
+        <w:tabs>
+          <w:tab w:val="num" w:pos="5760"/>
+        </w:tabs>
+        <w:ind w:left="5760" w:hanging="360"/>
+      </w:pPr>
+      <w:rPr>
+        <w:rFonts w:ascii="Wingdings" w:hAnsi="Wingdings" w:hint="default"/>
+        <w:sz w:val="20"/>
+      </w:rPr>
+    </w:lvl>
+    <w:lvl w:ilvl="8" w:tentative="1">
+      <w:start w:val="1"/>
+      <w:numFmt w:val="bullet"/>
+      <w:lvlText w:val=""/>
+      <w:lvlJc w:val="left"/>
+      <w:pPr>
+        <w:tabs>
+          <w:tab w:val="num" w:pos="6480"/>
+        </w:tabs>
+        <w:ind w:left="6480" w:hanging="360"/>
+      </w:pPr>
+      <w:rPr>
+        <w:rFonts w:ascii="Wingdings" w:hAnsi="Wingdings" w:hint="default"/>
+        <w:sz w:val="20"/>
+      </w:rPr>
+    </w:lvl>
+  </w:abstractNum>
+  <w:abstractNum w:abstractNumId="21" w15:restartNumberingAfterBreak="0">
+    <w:nsid w:val="66F17D62"/>
+    <w:multiLevelType w:val="multilevel"/>
+    <w:tmpl w:val="DF6CF29A"/>
+    <w:lvl w:ilvl="0">
+      <w:start w:val="1"/>
+      <w:numFmt w:val="bullet"/>
+      <w:lvlText w:val=""/>
+      <w:lvlJc w:val="left"/>
+      <w:pPr>
+        <w:tabs>
+          <w:tab w:val="num" w:pos="720"/>
+        </w:tabs>
+        <w:ind w:left="720" w:hanging="360"/>
+      </w:pPr>
+      <w:rPr>
+        <w:rFonts w:ascii="Symbol" w:hAnsi="Symbol" w:hint="default"/>
+        <w:sz w:val="20"/>
+      </w:rPr>
+    </w:lvl>
+    <w:lvl w:ilvl="1" w:tentative="1">
+      <w:start w:val="1"/>
+      <w:numFmt w:val="bullet"/>
+      <w:lvlText w:val="o"/>
+      <w:lvlJc w:val="left"/>
+      <w:pPr>
+        <w:tabs>
+          <w:tab w:val="num" w:pos="1440"/>
+        </w:tabs>
+        <w:ind w:left="1440" w:hanging="360"/>
+      </w:pPr>
+      <w:rPr>
+        <w:rFonts w:ascii="Courier New" w:hAnsi="Courier New" w:hint="default"/>
+        <w:sz w:val="20"/>
+      </w:rPr>
+    </w:lvl>
+    <w:lvl w:ilvl="2" w:tentative="1">
+      <w:start w:val="1"/>
+      <w:numFmt w:val="bullet"/>
+      <w:lvlText w:val=""/>
+      <w:lvlJc w:val="left"/>
+      <w:pPr>
+        <w:tabs>
+          <w:tab w:val="num" w:pos="2160"/>
+        </w:tabs>
+        <w:ind w:left="2160" w:hanging="360"/>
+      </w:pPr>
+      <w:rPr>
+        <w:rFonts w:ascii="Wingdings" w:hAnsi="Wingdings" w:hint="default"/>
+        <w:sz w:val="20"/>
+      </w:rPr>
+    </w:lvl>
+    <w:lvl w:ilvl="3" w:tentative="1">
+      <w:start w:val="1"/>
+      <w:numFmt w:val="bullet"/>
+      <w:lvlText w:val=""/>
+      <w:lvlJc w:val="left"/>
+      <w:pPr>
+        <w:tabs>
+          <w:tab w:val="num" w:pos="2880"/>
+        </w:tabs>
+        <w:ind w:left="2880" w:hanging="360"/>
+      </w:pPr>
+      <w:rPr>
+        <w:rFonts w:ascii="Wingdings" w:hAnsi="Wingdings" w:hint="default"/>
+        <w:sz w:val="20"/>
+      </w:rPr>
+    </w:lvl>
+    <w:lvl w:ilvl="4" w:tentative="1">
+      <w:start w:val="1"/>
+      <w:numFmt w:val="bullet"/>
+      <w:lvlText w:val=""/>
+      <w:lvlJc w:val="left"/>
+      <w:pPr>
+        <w:tabs>
+          <w:tab w:val="num" w:pos="3600"/>
+        </w:tabs>
+        <w:ind w:left="3600" w:hanging="360"/>
+      </w:pPr>
+      <w:rPr>
+        <w:rFonts w:ascii="Wingdings" w:hAnsi="Wingdings" w:hint="default"/>
+        <w:sz w:val="20"/>
+      </w:rPr>
+    </w:lvl>
+    <w:lvl w:ilvl="5" w:tentative="1">
+      <w:start w:val="1"/>
+      <w:numFmt w:val="bullet"/>
+      <w:lvlText w:val=""/>
+      <w:lvlJc w:val="left"/>
+      <w:pPr>
+        <w:tabs>
+          <w:tab w:val="num" w:pos="4320"/>
+        </w:tabs>
+        <w:ind w:left="4320" w:hanging="360"/>
+      </w:pPr>
+      <w:rPr>
+        <w:rFonts w:ascii="Wingdings" w:hAnsi="Wingdings" w:hint="default"/>
+        <w:sz w:val="20"/>
+      </w:rPr>
+    </w:lvl>
+    <w:lvl w:ilvl="6" w:tentative="1">
+      <w:start w:val="1"/>
+      <w:numFmt w:val="bullet"/>
+      <w:lvlText w:val=""/>
+      <w:lvlJc w:val="left"/>
+      <w:pPr>
+        <w:tabs>
+          <w:tab w:val="num" w:pos="5040"/>
+        </w:tabs>
+        <w:ind w:left="5040" w:hanging="360"/>
+      </w:pPr>
+      <w:rPr>
+        <w:rFonts w:ascii="Wingdings" w:hAnsi="Wingdings" w:hint="default"/>
+        <w:sz w:val="20"/>
+      </w:rPr>
+    </w:lvl>
+    <w:lvl w:ilvl="7" w:tentative="1">
+      <w:start w:val="1"/>
+      <w:numFmt w:val="bullet"/>
+      <w:lvlText w:val=""/>
+      <w:lvlJc w:val="left"/>
+      <w:pPr>
+        <w:tabs>
+          <w:tab w:val="num" w:pos="5760"/>
+        </w:tabs>
+        <w:ind w:left="5760" w:hanging="360"/>
+      </w:pPr>
+      <w:rPr>
+        <w:rFonts w:ascii="Wingdings" w:hAnsi="Wingdings" w:hint="default"/>
+        <w:sz w:val="20"/>
+      </w:rPr>
+    </w:lvl>
+    <w:lvl w:ilvl="8" w:tentative="1">
+      <w:start w:val="1"/>
+      <w:numFmt w:val="bullet"/>
+      <w:lvlText w:val=""/>
+      <w:lvlJc w:val="left"/>
+      <w:pPr>
+        <w:tabs>
+          <w:tab w:val="num" w:pos="6480"/>
+        </w:tabs>
+        <w:ind w:left="6480" w:hanging="360"/>
+      </w:pPr>
+      <w:rPr>
+        <w:rFonts w:ascii="Wingdings" w:hAnsi="Wingdings" w:hint="default"/>
+        <w:sz w:val="20"/>
+      </w:rPr>
+    </w:lvl>
+  </w:abstractNum>
+  <w:abstractNum w:abstractNumId="22" w15:restartNumberingAfterBreak="0">
     <w:nsid w:val="67240F69"/>
     <w:multiLevelType w:val="multilevel"/>
     <w:tmpl w:val="A3D83C64"/>
@@ -3709,7 +7875,7 @@
       </w:rPr>
     </w:lvl>
   </w:abstractNum>
-  <w:abstractNum w:abstractNumId="12" w15:restartNumberingAfterBreak="0">
+  <w:abstractNum w:abstractNumId="23" w15:restartNumberingAfterBreak="0">
     <w:nsid w:val="67806DC6"/>
     <w:multiLevelType w:val="multilevel"/>
     <w:tmpl w:val="02025B42"/>
@@ -3858,7 +8024,305 @@
       </w:rPr>
     </w:lvl>
   </w:abstractNum>
-  <w:abstractNum w:abstractNumId="13" w15:restartNumberingAfterBreak="0">
+  <w:abstractNum w:abstractNumId="24" w15:restartNumberingAfterBreak="0">
+    <w:nsid w:val="6C8446FF"/>
+    <w:multiLevelType w:val="multilevel"/>
+    <w:tmpl w:val="CF2420EE"/>
+    <w:lvl w:ilvl="0">
+      <w:start w:val="1"/>
+      <w:numFmt w:val="bullet"/>
+      <w:lvlText w:val=""/>
+      <w:lvlJc w:val="left"/>
+      <w:pPr>
+        <w:tabs>
+          <w:tab w:val="num" w:pos="720"/>
+        </w:tabs>
+        <w:ind w:left="720" w:hanging="360"/>
+      </w:pPr>
+      <w:rPr>
+        <w:rFonts w:ascii="Symbol" w:hAnsi="Symbol" w:hint="default"/>
+        <w:sz w:val="20"/>
+      </w:rPr>
+    </w:lvl>
+    <w:lvl w:ilvl="1" w:tentative="1">
+      <w:start w:val="1"/>
+      <w:numFmt w:val="bullet"/>
+      <w:lvlText w:val="o"/>
+      <w:lvlJc w:val="left"/>
+      <w:pPr>
+        <w:tabs>
+          <w:tab w:val="num" w:pos="1440"/>
+        </w:tabs>
+        <w:ind w:left="1440" w:hanging="360"/>
+      </w:pPr>
+      <w:rPr>
+        <w:rFonts w:ascii="Courier New" w:hAnsi="Courier New" w:hint="default"/>
+        <w:sz w:val="20"/>
+      </w:rPr>
+    </w:lvl>
+    <w:lvl w:ilvl="2" w:tentative="1">
+      <w:start w:val="1"/>
+      <w:numFmt w:val="bullet"/>
+      <w:lvlText w:val=""/>
+      <w:lvlJc w:val="left"/>
+      <w:pPr>
+        <w:tabs>
+          <w:tab w:val="num" w:pos="2160"/>
+        </w:tabs>
+        <w:ind w:left="2160" w:hanging="360"/>
+      </w:pPr>
+      <w:rPr>
+        <w:rFonts w:ascii="Wingdings" w:hAnsi="Wingdings" w:hint="default"/>
+        <w:sz w:val="20"/>
+      </w:rPr>
+    </w:lvl>
+    <w:lvl w:ilvl="3" w:tentative="1">
+      <w:start w:val="1"/>
+      <w:numFmt w:val="bullet"/>
+      <w:lvlText w:val=""/>
+      <w:lvlJc w:val="left"/>
+      <w:pPr>
+        <w:tabs>
+          <w:tab w:val="num" w:pos="2880"/>
+        </w:tabs>
+        <w:ind w:left="2880" w:hanging="360"/>
+      </w:pPr>
+      <w:rPr>
+        <w:rFonts w:ascii="Wingdings" w:hAnsi="Wingdings" w:hint="default"/>
+        <w:sz w:val="20"/>
+      </w:rPr>
+    </w:lvl>
+    <w:lvl w:ilvl="4" w:tentative="1">
+      <w:start w:val="1"/>
+      <w:numFmt w:val="bullet"/>
+      <w:lvlText w:val=""/>
+      <w:lvlJc w:val="left"/>
+      <w:pPr>
+        <w:tabs>
+          <w:tab w:val="num" w:pos="3600"/>
+        </w:tabs>
+        <w:ind w:left="3600" w:hanging="360"/>
+      </w:pPr>
+      <w:rPr>
+        <w:rFonts w:ascii="Wingdings" w:hAnsi="Wingdings" w:hint="default"/>
+        <w:sz w:val="20"/>
+      </w:rPr>
+    </w:lvl>
+    <w:lvl w:ilvl="5" w:tentative="1">
+      <w:start w:val="1"/>
+      <w:numFmt w:val="bullet"/>
+      <w:lvlText w:val=""/>
+      <w:lvlJc w:val="left"/>
+      <w:pPr>
+        <w:tabs>
+          <w:tab w:val="num" w:pos="4320"/>
+        </w:tabs>
+        <w:ind w:left="4320" w:hanging="360"/>
+      </w:pPr>
+      <w:rPr>
+        <w:rFonts w:ascii="Wingdings" w:hAnsi="Wingdings" w:hint="default"/>
+        <w:sz w:val="20"/>
+      </w:rPr>
+    </w:lvl>
+    <w:lvl w:ilvl="6" w:tentative="1">
+      <w:start w:val="1"/>
+      <w:numFmt w:val="bullet"/>
+      <w:lvlText w:val=""/>
+      <w:lvlJc w:val="left"/>
+      <w:pPr>
+        <w:tabs>
+          <w:tab w:val="num" w:pos="5040"/>
+        </w:tabs>
+        <w:ind w:left="5040" w:hanging="360"/>
+      </w:pPr>
+      <w:rPr>
+        <w:rFonts w:ascii="Wingdings" w:hAnsi="Wingdings" w:hint="default"/>
+        <w:sz w:val="20"/>
+      </w:rPr>
+    </w:lvl>
+    <w:lvl w:ilvl="7" w:tentative="1">
+      <w:start w:val="1"/>
+      <w:numFmt w:val="bullet"/>
+      <w:lvlText w:val=""/>
+      <w:lvlJc w:val="left"/>
+      <w:pPr>
+        <w:tabs>
+          <w:tab w:val="num" w:pos="5760"/>
+        </w:tabs>
+        <w:ind w:left="5760" w:hanging="360"/>
+      </w:pPr>
+      <w:rPr>
+        <w:rFonts w:ascii="Wingdings" w:hAnsi="Wingdings" w:hint="default"/>
+        <w:sz w:val="20"/>
+      </w:rPr>
+    </w:lvl>
+    <w:lvl w:ilvl="8" w:tentative="1">
+      <w:start w:val="1"/>
+      <w:numFmt w:val="bullet"/>
+      <w:lvlText w:val=""/>
+      <w:lvlJc w:val="left"/>
+      <w:pPr>
+        <w:tabs>
+          <w:tab w:val="num" w:pos="6480"/>
+        </w:tabs>
+        <w:ind w:left="6480" w:hanging="360"/>
+      </w:pPr>
+      <w:rPr>
+        <w:rFonts w:ascii="Wingdings" w:hAnsi="Wingdings" w:hint="default"/>
+        <w:sz w:val="20"/>
+      </w:rPr>
+    </w:lvl>
+  </w:abstractNum>
+  <w:abstractNum w:abstractNumId="25" w15:restartNumberingAfterBreak="0">
+    <w:nsid w:val="6EA45C31"/>
+    <w:multiLevelType w:val="multilevel"/>
+    <w:tmpl w:val="231AE79E"/>
+    <w:lvl w:ilvl="0">
+      <w:start w:val="1"/>
+      <w:numFmt w:val="bullet"/>
+      <w:lvlText w:val=""/>
+      <w:lvlJc w:val="left"/>
+      <w:pPr>
+        <w:tabs>
+          <w:tab w:val="num" w:pos="720"/>
+        </w:tabs>
+        <w:ind w:left="720" w:hanging="360"/>
+      </w:pPr>
+      <w:rPr>
+        <w:rFonts w:ascii="Symbol" w:hAnsi="Symbol" w:hint="default"/>
+        <w:sz w:val="20"/>
+      </w:rPr>
+    </w:lvl>
+    <w:lvl w:ilvl="1" w:tentative="1">
+      <w:start w:val="1"/>
+      <w:numFmt w:val="bullet"/>
+      <w:lvlText w:val="o"/>
+      <w:lvlJc w:val="left"/>
+      <w:pPr>
+        <w:tabs>
+          <w:tab w:val="num" w:pos="1440"/>
+        </w:tabs>
+        <w:ind w:left="1440" w:hanging="360"/>
+      </w:pPr>
+      <w:rPr>
+        <w:rFonts w:ascii="Courier New" w:hAnsi="Courier New" w:hint="default"/>
+        <w:sz w:val="20"/>
+      </w:rPr>
+    </w:lvl>
+    <w:lvl w:ilvl="2" w:tentative="1">
+      <w:start w:val="1"/>
+      <w:numFmt w:val="bullet"/>
+      <w:lvlText w:val=""/>
+      <w:lvlJc w:val="left"/>
+      <w:pPr>
+        <w:tabs>
+          <w:tab w:val="num" w:pos="2160"/>
+        </w:tabs>
+        <w:ind w:left="2160" w:hanging="360"/>
+      </w:pPr>
+      <w:rPr>
+        <w:rFonts w:ascii="Wingdings" w:hAnsi="Wingdings" w:hint="default"/>
+        <w:sz w:val="20"/>
+      </w:rPr>
+    </w:lvl>
+    <w:lvl w:ilvl="3" w:tentative="1">
+      <w:start w:val="1"/>
+      <w:numFmt w:val="bullet"/>
+      <w:lvlText w:val=""/>
+      <w:lvlJc w:val="left"/>
+      <w:pPr>
+        <w:tabs>
+          <w:tab w:val="num" w:pos="2880"/>
+        </w:tabs>
+        <w:ind w:left="2880" w:hanging="360"/>
+      </w:pPr>
+      <w:rPr>
+        <w:rFonts w:ascii="Wingdings" w:hAnsi="Wingdings" w:hint="default"/>
+        <w:sz w:val="20"/>
+      </w:rPr>
+    </w:lvl>
+    <w:lvl w:ilvl="4" w:tentative="1">
+      <w:start w:val="1"/>
+      <w:numFmt w:val="bullet"/>
+      <w:lvlText w:val=""/>
+      <w:lvlJc w:val="left"/>
+      <w:pPr>
+        <w:tabs>
+          <w:tab w:val="num" w:pos="3600"/>
+        </w:tabs>
+        <w:ind w:left="3600" w:hanging="360"/>
+      </w:pPr>
+      <w:rPr>
+        <w:rFonts w:ascii="Wingdings" w:hAnsi="Wingdings" w:hint="default"/>
+        <w:sz w:val="20"/>
+      </w:rPr>
+    </w:lvl>
+    <w:lvl w:ilvl="5" w:tentative="1">
+      <w:start w:val="1"/>
+      <w:numFmt w:val="bullet"/>
+      <w:lvlText w:val=""/>
+      <w:lvlJc w:val="left"/>
+      <w:pPr>
+        <w:tabs>
+          <w:tab w:val="num" w:pos="4320"/>
+        </w:tabs>
+        <w:ind w:left="4320" w:hanging="360"/>
+      </w:pPr>
+      <w:rPr>
+        <w:rFonts w:ascii="Wingdings" w:hAnsi="Wingdings" w:hint="default"/>
+        <w:sz w:val="20"/>
+      </w:rPr>
+    </w:lvl>
+    <w:lvl w:ilvl="6" w:tentative="1">
+      <w:start w:val="1"/>
+      <w:numFmt w:val="bullet"/>
+      <w:lvlText w:val=""/>
+      <w:lvlJc w:val="left"/>
+      <w:pPr>
+        <w:tabs>
+          <w:tab w:val="num" w:pos="5040"/>
+        </w:tabs>
+        <w:ind w:left="5040" w:hanging="360"/>
+      </w:pPr>
+      <w:rPr>
+        <w:rFonts w:ascii="Wingdings" w:hAnsi="Wingdings" w:hint="default"/>
+        <w:sz w:val="20"/>
+      </w:rPr>
+    </w:lvl>
+    <w:lvl w:ilvl="7" w:tentative="1">
+      <w:start w:val="1"/>
+      <w:numFmt w:val="bullet"/>
+      <w:lvlText w:val=""/>
+      <w:lvlJc w:val="left"/>
+      <w:pPr>
+        <w:tabs>
+          <w:tab w:val="num" w:pos="5760"/>
+        </w:tabs>
+        <w:ind w:left="5760" w:hanging="360"/>
+      </w:pPr>
+      <w:rPr>
+        <w:rFonts w:ascii="Wingdings" w:hAnsi="Wingdings" w:hint="default"/>
+        <w:sz w:val="20"/>
+      </w:rPr>
+    </w:lvl>
+    <w:lvl w:ilvl="8" w:tentative="1">
+      <w:start w:val="1"/>
+      <w:numFmt w:val="bullet"/>
+      <w:lvlText w:val=""/>
+      <w:lvlJc w:val="left"/>
+      <w:pPr>
+        <w:tabs>
+          <w:tab w:val="num" w:pos="6480"/>
+        </w:tabs>
+        <w:ind w:left="6480" w:hanging="360"/>
+      </w:pPr>
+      <w:rPr>
+        <w:rFonts w:ascii="Wingdings" w:hAnsi="Wingdings" w:hint="default"/>
+        <w:sz w:val="20"/>
+      </w:rPr>
+    </w:lvl>
+  </w:abstractNum>
+  <w:abstractNum w:abstractNumId="26" w15:restartNumberingAfterBreak="0">
     <w:nsid w:val="724E6DA3"/>
     <w:multiLevelType w:val="multilevel"/>
     <w:tmpl w:val="B374E1A4"/>
@@ -4008,46 +8472,85 @@
     </w:lvl>
   </w:abstractNum>
   <w:num w:numId="1" w16cid:durableId="813789872">
+    <w:abstractNumId w:val="10"/>
+  </w:num>
+  <w:num w:numId="2" w16cid:durableId="218054268">
+    <w:abstractNumId w:val="14"/>
+  </w:num>
+  <w:num w:numId="3" w16cid:durableId="773482401">
+    <w:abstractNumId w:val="7"/>
+  </w:num>
+  <w:num w:numId="4" w16cid:durableId="1227841907">
+    <w:abstractNumId w:val="15"/>
+  </w:num>
+  <w:num w:numId="5" w16cid:durableId="87775347">
+    <w:abstractNumId w:val="13"/>
+  </w:num>
+  <w:num w:numId="6" w16cid:durableId="1280914734">
+    <w:abstractNumId w:val="11"/>
+  </w:num>
+  <w:num w:numId="7" w16cid:durableId="586039891">
+    <w:abstractNumId w:val="22"/>
+  </w:num>
+  <w:num w:numId="8" w16cid:durableId="1771202012">
+    <w:abstractNumId w:val="8"/>
+  </w:num>
+  <w:num w:numId="9" w16cid:durableId="900680235">
+    <w:abstractNumId w:val="23"/>
+  </w:num>
+  <w:num w:numId="10" w16cid:durableId="1596590889">
+    <w:abstractNumId w:val="4"/>
+  </w:num>
+  <w:num w:numId="11" w16cid:durableId="969483552">
+    <w:abstractNumId w:val="19"/>
+  </w:num>
+  <w:num w:numId="12" w16cid:durableId="1125592">
+    <w:abstractNumId w:val="26"/>
+  </w:num>
+  <w:num w:numId="13" w16cid:durableId="1858687678">
     <w:abstractNumId w:val="5"/>
   </w:num>
-  <w:num w:numId="2" w16cid:durableId="218054268">
-    <w:abstractNumId w:val="8"/>
+  <w:num w:numId="14" w16cid:durableId="1161384303">
+    <w:abstractNumId w:val="2"/>
   </w:num>
-  <w:num w:numId="3" w16cid:durableId="773482401">
+  <w:num w:numId="15" w16cid:durableId="108664892">
+    <w:abstractNumId w:val="17"/>
+  </w:num>
+  <w:num w:numId="16" w16cid:durableId="515076152">
+    <w:abstractNumId w:val="25"/>
+  </w:num>
+  <w:num w:numId="17" w16cid:durableId="1618414499">
+    <w:abstractNumId w:val="24"/>
+  </w:num>
+  <w:num w:numId="18" w16cid:durableId="2098480570">
+    <w:abstractNumId w:val="6"/>
+  </w:num>
+  <w:num w:numId="19" w16cid:durableId="1376387655">
+    <w:abstractNumId w:val="16"/>
+  </w:num>
+  <w:num w:numId="20" w16cid:durableId="1998878979">
     <w:abstractNumId w:val="3"/>
   </w:num>
-  <w:num w:numId="4" w16cid:durableId="1227841907">
+  <w:num w:numId="21" w16cid:durableId="1208489891">
+    <w:abstractNumId w:val="21"/>
+  </w:num>
+  <w:num w:numId="22" w16cid:durableId="773522228">
+    <w:abstractNumId w:val="1"/>
+  </w:num>
+  <w:num w:numId="23" w16cid:durableId="1684235455">
+    <w:abstractNumId w:val="20"/>
+  </w:num>
+  <w:num w:numId="24" w16cid:durableId="721369619">
+    <w:abstractNumId w:val="12"/>
+  </w:num>
+  <w:num w:numId="25" w16cid:durableId="290013260">
     <w:abstractNumId w:val="9"/>
   </w:num>
-  <w:num w:numId="5" w16cid:durableId="87775347">
-    <w:abstractNumId w:val="7"/>
+  <w:num w:numId="26" w16cid:durableId="136579144">
+    <w:abstractNumId w:val="0"/>
   </w:num>
-  <w:num w:numId="6" w16cid:durableId="1280914734">
-    <w:abstractNumId w:val="6"/>
-  </w:num>
-  <w:num w:numId="7" w16cid:durableId="586039891">
-    <w:abstractNumId w:val="11"/>
-  </w:num>
-  <w:num w:numId="8" w16cid:durableId="1771202012">
-    <w:abstractNumId w:val="4"/>
-  </w:num>
-  <w:num w:numId="9" w16cid:durableId="900680235">
-    <w:abstractNumId w:val="12"/>
-  </w:num>
-  <w:num w:numId="10" w16cid:durableId="1596590889">
-    <w:abstractNumId w:val="1"/>
-  </w:num>
-  <w:num w:numId="11" w16cid:durableId="969483552">
-    <w:abstractNumId w:val="10"/>
-  </w:num>
-  <w:num w:numId="12" w16cid:durableId="1125592">
-    <w:abstractNumId w:val="13"/>
-  </w:num>
-  <w:num w:numId="13" w16cid:durableId="1858687678">
-    <w:abstractNumId w:val="2"/>
-  </w:num>
-  <w:num w:numId="14" w16cid:durableId="1161384303">
-    <w:abstractNumId w:val="0"/>
+  <w:num w:numId="27" w16cid:durableId="1552839010">
+    <w:abstractNumId w:val="18"/>
   </w:num>
 </w:numbering>
 </file>

</xml_diff>